<commit_message>
docs(research): record Stage 4.1 precision engine benchmark results and update master comparison records
</commit_message>
<xml_diff>
--- a/Dilina/NL TO SQL prototype/Master_Research_Comparison_Report.docx
+++ b/Dilina/NL TO SQL prototype/Master_Research_Comparison_Report.docx
@@ -204,7 +204,7 @@
         <w:t>This Master Research Document serves as the authoritative comparative record for Member 1's component of Project J26-SE-347. The primary research objective is to architect a context-optimized, schema-aware Natural Language-to-SQL (NL-to-SQL) translation engine capable of dynamically resolving semantic ambiguities and generating highly accurate relational queries for enterprise multi-tenant databases.</w:t>
         <w:br/>
         <w:br/>
-        <w:t>To ensure complete scientific rigor and eliminate model capability drift, all experimental stages are strictly evaluated on the identical foundation model: Qwen-2.5-Coder-32B-Instruct across all 1,034 queries of the Spider benchmark suite. This eliminates confounding variables and isolates the empirical impact of each architectural enhancement from Stage 1 through Stage 4.</w:t>
+        <w:t>To ensure complete scientific rigor and eliminate model capability drift, all experimental stages are strictly evaluated on the identical foundation model: Qwen-2.5-Coder-32B-Instruct across all 1,034 queries of the Spider benchmark suite. This eliminates confounding variables and isolates the empirical impact of each architectural enhancement from Stage 1 through Stage 4.1.</w:t>
       </w:r>
     </w:p>
     <w:p>
@@ -237,16 +237,17 @@
         <w:tblLook w:firstColumn="1" w:firstRow="1" w:lastColumn="0" w:lastRow="0" w:noHBand="0" w:noVBand="1" w:val="04A0"/>
       </w:tblPr>
       <w:tblGrid>
-        <w:gridCol w:w="1872"/>
-        <w:gridCol w:w="1872"/>
-        <w:gridCol w:w="1872"/>
-        <w:gridCol w:w="1872"/>
-        <w:gridCol w:w="1872"/>
+        <w:gridCol w:w="1560"/>
+        <w:gridCol w:w="1560"/>
+        <w:gridCol w:w="1560"/>
+        <w:gridCol w:w="1560"/>
+        <w:gridCol w:w="1560"/>
+        <w:gridCol w:w="1560"/>
       </w:tblGrid>
       <w:tr>
         <w:tc>
           <w:tcPr>
-            <w:tcW w:type="dxa" w:w="1872"/>
+            <w:tcW w:type="dxa" w:w="1560"/>
             <w:shd w:fill="1B365D"/>
           </w:tcPr>
           <w:p>
@@ -261,7 +262,7 @@
         </w:tc>
         <w:tc>
           <w:tcPr>
-            <w:tcW w:type="dxa" w:w="1872"/>
+            <w:tcW w:type="dxa" w:w="1560"/>
             <w:shd w:fill="1B365D"/>
           </w:tcPr>
           <w:p>
@@ -270,13 +271,13 @@
                 <w:b/>
                 <w:color w:val="FFFFFF"/>
               </w:rPr>
-              <w:t>Stage 1: Baseline</w:t>
+              <w:t>Stage 1: Base</w:t>
             </w:r>
           </w:p>
         </w:tc>
         <w:tc>
           <w:tcPr>
-            <w:tcW w:type="dxa" w:w="1872"/>
+            <w:tcW w:type="dxa" w:w="1560"/>
             <w:shd w:fill="1B365D"/>
           </w:tcPr>
           <w:p>
@@ -285,13 +286,13 @@
                 <w:b/>
                 <w:color w:val="FFFFFF"/>
               </w:rPr>
-              <w:t>Stage 2: Pruning</w:t>
+              <w:t>Stage 2: Prune</w:t>
             </w:r>
           </w:p>
         </w:tc>
         <w:tc>
           <w:tcPr>
-            <w:tcW w:type="dxa" w:w="1872"/>
+            <w:tcW w:type="dxa" w:w="1560"/>
             <w:shd w:fill="1B365D"/>
           </w:tcPr>
           <w:p>
@@ -300,13 +301,13 @@
                 <w:b/>
                 <w:color w:val="FFFFFF"/>
               </w:rPr>
-              <w:t>Stage 3: Refinement</w:t>
+              <w:t>Stage 3: Refine</w:t>
             </w:r>
           </w:p>
         </w:tc>
         <w:tc>
           <w:tcPr>
-            <w:tcW w:type="dxa" w:w="1872"/>
+            <w:tcW w:type="dxa" w:w="1560"/>
             <w:shd w:fill="1B365D"/>
           </w:tcPr>
           <w:p>
@@ -315,7 +316,22 @@
                 <w:b/>
                 <w:color w:val="FFFFFF"/>
               </w:rPr>
-              <w:t>Stage 4: Entity &amp; Graph</w:t>
+              <w:t>Stage 4: Entity</w:t>
+            </w:r>
+          </w:p>
+        </w:tc>
+        <w:tc>
+          <w:tcPr>
+            <w:tcW w:type="dxa" w:w="1560"/>
+            <w:shd w:fill="1B365D"/>
+          </w:tcPr>
+          <w:p>
+            <w:r>
+              <w:rPr>
+                <w:b/>
+                <w:color w:val="FFFFFF"/>
+              </w:rPr>
+              <w:t>Stage 4.1: Precision</w:t>
             </w:r>
           </w:p>
         </w:tc>
@@ -323,7 +339,7 @@
       <w:tr>
         <w:tc>
           <w:tcPr>
-            <w:tcW w:type="dxa" w:w="1872"/>
+            <w:tcW w:type="dxa" w:w="1560"/>
             <w:shd w:fill="F0F4F8"/>
           </w:tcPr>
           <w:p>
@@ -337,7 +353,7 @@
         </w:tc>
         <w:tc>
           <w:tcPr>
-            <w:tcW w:type="dxa" w:w="1872"/>
+            <w:tcW w:type="dxa" w:w="1560"/>
             <w:shd w:fill="F0F4F8"/>
           </w:tcPr>
           <w:p>
@@ -351,7 +367,7 @@
         </w:tc>
         <w:tc>
           <w:tcPr>
-            <w:tcW w:type="dxa" w:w="1872"/>
+            <w:tcW w:type="dxa" w:w="1560"/>
             <w:shd w:fill="F0F4F8"/>
           </w:tcPr>
           <w:p>
@@ -359,13 +375,13 @@
               <w:rPr>
                 <w:b w:val="0"/>
               </w:rPr>
-              <w:t>Minimal-Context (Task 1)</w:t>
+              <w:t>Minimal Extractor</w:t>
             </w:r>
           </w:p>
         </w:tc>
         <w:tc>
           <w:tcPr>
-            <w:tcW w:type="dxa" w:w="1872"/>
+            <w:tcW w:type="dxa" w:w="1560"/>
             <w:shd w:fill="F0F4F8"/>
           </w:tcPr>
           <w:p>
@@ -373,13 +389,13 @@
               <w:rPr>
                 <w:b w:val="0"/>
               </w:rPr>
-              <w:t>Self-Correction (Task 3)</w:t>
+              <w:t>Self-Correction</w:t>
             </w:r>
           </w:p>
         </w:tc>
         <w:tc>
           <w:tcPr>
-            <w:tcW w:type="dxa" w:w="1872"/>
+            <w:tcW w:type="dxa" w:w="1560"/>
             <w:shd w:fill="F0F4F8"/>
           </w:tcPr>
           <w:p>
@@ -387,7 +403,21 @@
               <w:rPr>
                 <w:b w:val="0"/>
               </w:rPr>
-              <w:t>Graph-Aware + Grounded</w:t>
+              <w:t>Graph + Ground</w:t>
+            </w:r>
+          </w:p>
+        </w:tc>
+        <w:tc>
+          <w:tcPr>
+            <w:tcW w:type="dxa" w:w="1560"/>
+            <w:shd w:fill="F0F4F8"/>
+          </w:tcPr>
+          <w:p>
+            <w:r>
+              <w:rPr>
+                <w:b w:val="0"/>
+              </w:rPr>
+              <w:t>Silent Prot. + Sanitizer</w:t>
             </w:r>
           </w:p>
         </w:tc>
@@ -395,7 +425,7 @@
       <w:tr>
         <w:tc>
           <w:tcPr>
-            <w:tcW w:type="dxa" w:w="1872"/>
+            <w:tcW w:type="dxa" w:w="1560"/>
           </w:tcPr>
           <w:p>
             <w:r>
@@ -408,46 +438,59 @@
         </w:tc>
         <w:tc>
           <w:tcPr>
-            <w:tcW w:type="dxa" w:w="1872"/>
+            <w:tcW w:type="dxa" w:w="1560"/>
           </w:tcPr>
           <w:p>
             <w:r>
               <w:rPr>
                 <w:b w:val="0"/>
               </w:rPr>
-              <w:t>Empirically Validated</w:t>
+              <w:t>Validated</w:t>
             </w:r>
           </w:p>
         </w:tc>
         <w:tc>
           <w:tcPr>
-            <w:tcW w:type="dxa" w:w="1872"/>
+            <w:tcW w:type="dxa" w:w="1560"/>
           </w:tcPr>
           <w:p>
             <w:r>
               <w:rPr>
                 <w:b w:val="0"/>
               </w:rPr>
-              <w:t>Empirically Validated</w:t>
+              <w:t>Validated</w:t>
             </w:r>
           </w:p>
         </w:tc>
         <w:tc>
           <w:tcPr>
-            <w:tcW w:type="dxa" w:w="1872"/>
+            <w:tcW w:type="dxa" w:w="1560"/>
           </w:tcPr>
           <w:p>
             <w:r>
               <w:rPr>
                 <w:b w:val="0"/>
               </w:rPr>
-              <w:t>Empirically Validated</w:t>
+              <w:t>Validated</w:t>
             </w:r>
           </w:p>
         </w:tc>
         <w:tc>
           <w:tcPr>
-            <w:tcW w:type="dxa" w:w="1872"/>
+            <w:tcW w:type="dxa" w:w="1560"/>
+          </w:tcPr>
+          <w:p>
+            <w:r>
+              <w:rPr>
+                <w:b w:val="0"/>
+              </w:rPr>
+              <w:t>Validated</w:t>
+            </w:r>
+          </w:p>
+        </w:tc>
+        <w:tc>
+          <w:tcPr>
+            <w:tcW w:type="dxa" w:w="1560"/>
           </w:tcPr>
           <w:p>
             <w:r>
@@ -462,7 +505,7 @@
       <w:tr>
         <w:tc>
           <w:tcPr>
-            <w:tcW w:type="dxa" w:w="1872"/>
+            <w:tcW w:type="dxa" w:w="1560"/>
             <w:shd w:fill="E2E8F0"/>
           </w:tcPr>
           <w:p>
@@ -470,13 +513,13 @@
               <w:rPr>
                 <w:b/>
               </w:rPr>
-              <w:t>Execution Accuracy (EX)</w:t>
+              <w:t>Execution Accuracy</w:t>
             </w:r>
           </w:p>
         </w:tc>
         <w:tc>
           <w:tcPr>
-            <w:tcW w:type="dxa" w:w="1872"/>
+            <w:tcW w:type="dxa" w:w="1560"/>
             <w:shd w:fill="E2E8F0"/>
           </w:tcPr>
           <w:p>
@@ -484,13 +527,13 @@
               <w:rPr>
                 <w:b/>
               </w:rPr>
-              <w:t>68.47% (708/1,034)</w:t>
+              <w:t>68.47% (708)</w:t>
             </w:r>
           </w:p>
         </w:tc>
         <w:tc>
           <w:tcPr>
-            <w:tcW w:type="dxa" w:w="1872"/>
+            <w:tcW w:type="dxa" w:w="1560"/>
             <w:shd w:fill="E2E8F0"/>
           </w:tcPr>
           <w:p>
@@ -498,13 +541,13 @@
               <w:rPr>
                 <w:b/>
               </w:rPr>
-              <w:t>66.25% (685/1,034)</w:t>
+              <w:t>66.25% (685)</w:t>
             </w:r>
           </w:p>
         </w:tc>
         <w:tc>
           <w:tcPr>
-            <w:tcW w:type="dxa" w:w="1872"/>
+            <w:tcW w:type="dxa" w:w="1560"/>
             <w:shd w:fill="E2E8F0"/>
           </w:tcPr>
           <w:p>
@@ -512,13 +555,13 @@
               <w:rPr>
                 <w:b/>
               </w:rPr>
-              <w:t>77.27% (799/1,034) [SURGE!]</w:t>
+              <w:t>77.27% (799)</w:t>
             </w:r>
           </w:p>
         </w:tc>
         <w:tc>
           <w:tcPr>
-            <w:tcW w:type="dxa" w:w="1872"/>
+            <w:tcW w:type="dxa" w:w="1560"/>
             <w:shd w:fill="E2E8F0"/>
           </w:tcPr>
           <w:p>
@@ -526,7 +569,21 @@
               <w:rPr>
                 <w:b/>
               </w:rPr>
-              <w:t>70.70% (731/1,034)</w:t>
+              <w:t>70.70% (731)</w:t>
+            </w:r>
+          </w:p>
+        </w:tc>
+        <w:tc>
+          <w:tcPr>
+            <w:tcW w:type="dxa" w:w="1560"/>
+            <w:shd w:fill="E2E8F0"/>
+          </w:tcPr>
+          <w:p>
+            <w:r>
+              <w:rPr>
+                <w:b/>
+              </w:rPr>
+              <w:t>77.47% (801) [PEAK!]</w:t>
             </w:r>
           </w:p>
         </w:tc>
@@ -534,7 +591,7 @@
       <w:tr>
         <w:tc>
           <w:tcPr>
-            <w:tcW w:type="dxa" w:w="1872"/>
+            <w:tcW w:type="dxa" w:w="1560"/>
           </w:tcPr>
           <w:p>
             <w:r>
@@ -547,53 +604,66 @@
         </w:tc>
         <w:tc>
           <w:tcPr>
-            <w:tcW w:type="dxa" w:w="1872"/>
+            <w:tcW w:type="dxa" w:w="1560"/>
           </w:tcPr>
           <w:p>
             <w:r>
               <w:rPr>
                 <w:b w:val="0"/>
               </w:rPr>
-              <w:t>326 (31.53%)</w:t>
+              <w:t>326 (31.5%)</w:t>
             </w:r>
           </w:p>
         </w:tc>
         <w:tc>
           <w:tcPr>
-            <w:tcW w:type="dxa" w:w="1872"/>
+            <w:tcW w:type="dxa" w:w="1560"/>
           </w:tcPr>
           <w:p>
             <w:r>
               <w:rPr>
                 <w:b w:val="0"/>
               </w:rPr>
-              <w:t>349 (33.75%)</w:t>
+              <w:t>349 (33.8%)</w:t>
             </w:r>
           </w:p>
         </w:tc>
         <w:tc>
           <w:tcPr>
-            <w:tcW w:type="dxa" w:w="1872"/>
+            <w:tcW w:type="dxa" w:w="1560"/>
           </w:tcPr>
           <w:p>
             <w:r>
               <w:rPr>
                 <w:b w:val="0"/>
               </w:rPr>
-              <w:t>233 (22.53%) [-93 FAILS]</w:t>
+              <w:t>233 (22.5%)</w:t>
             </w:r>
           </w:p>
         </w:tc>
         <w:tc>
           <w:tcPr>
-            <w:tcW w:type="dxa" w:w="1872"/>
+            <w:tcW w:type="dxa" w:w="1560"/>
           </w:tcPr>
           <w:p>
             <w:r>
               <w:rPr>
                 <w:b w:val="0"/>
               </w:rPr>
-              <w:t>301 (29.11%)</w:t>
+              <w:t>301 (29.1%)</w:t>
+            </w:r>
+          </w:p>
+        </w:tc>
+        <w:tc>
+          <w:tcPr>
+            <w:tcW w:type="dxa" w:w="1560"/>
+          </w:tcPr>
+          <w:p>
+            <w:r>
+              <w:rPr>
+                <w:b w:val="0"/>
+              </w:rPr>
+              <w:t>231 (22.3%) [-95 FAILS]</w:t>
             </w:r>
           </w:p>
         </w:tc>
@@ -601,7 +671,7 @@
       <w:tr>
         <w:tc>
           <w:tcPr>
-            <w:tcW w:type="dxa" w:w="1872"/>
+            <w:tcW w:type="dxa" w:w="1560"/>
             <w:shd w:fill="F0F4F8"/>
           </w:tcPr>
           <w:p>
@@ -615,7 +685,7 @@
         </w:tc>
         <w:tc>
           <w:tcPr>
-            <w:tcW w:type="dxa" w:w="1872"/>
+            <w:tcW w:type="dxa" w:w="1560"/>
             <w:shd w:fill="F0F4F8"/>
           </w:tcPr>
           <w:p>
@@ -629,7 +699,7 @@
         </w:tc>
         <w:tc>
           <w:tcPr>
-            <w:tcW w:type="dxa" w:w="1872"/>
+            <w:tcW w:type="dxa" w:w="1560"/>
             <w:shd w:fill="F0F4F8"/>
           </w:tcPr>
           <w:p>
@@ -637,13 +707,13 @@
               <w:rPr>
                 <w:b w:val="0"/>
               </w:rPr>
-              <w:t>325.4 tokens (-15.8%)</w:t>
+              <w:t>325.4 (-15.8%)</w:t>
             </w:r>
           </w:p>
         </w:tc>
         <w:tc>
           <w:tcPr>
-            <w:tcW w:type="dxa" w:w="1872"/>
+            <w:tcW w:type="dxa" w:w="1560"/>
             <w:shd w:fill="F0F4F8"/>
           </w:tcPr>
           <w:p>
@@ -651,13 +721,13 @@
               <w:rPr>
                 <w:b w:val="0"/>
               </w:rPr>
-              <w:t>330.4 tokens (-14.5%)</w:t>
+              <w:t>330.4 (-14.5%)</w:t>
             </w:r>
           </w:p>
         </w:tc>
         <w:tc>
           <w:tcPr>
-            <w:tcW w:type="dxa" w:w="1872"/>
+            <w:tcW w:type="dxa" w:w="1560"/>
             <w:shd w:fill="F0F4F8"/>
           </w:tcPr>
           <w:p>
@@ -669,11 +739,25 @@
             </w:r>
           </w:p>
         </w:tc>
+        <w:tc>
+          <w:tcPr>
+            <w:tcW w:type="dxa" w:w="1560"/>
+            <w:shd w:fill="F0F4F8"/>
+          </w:tcPr>
+          <w:p>
+            <w:r>
+              <w:rPr>
+                <w:b w:val="0"/>
+              </w:rPr>
+              <w:t>460.2 tokens</w:t>
+            </w:r>
+          </w:p>
+        </w:tc>
       </w:tr>
       <w:tr>
         <w:tc>
           <w:tcPr>
-            <w:tcW w:type="dxa" w:w="1872"/>
+            <w:tcW w:type="dxa" w:w="1560"/>
           </w:tcPr>
           <w:p>
             <w:r>
@@ -686,7 +770,7 @@
         </w:tc>
         <w:tc>
           <w:tcPr>
-            <w:tcW w:type="dxa" w:w="1872"/>
+            <w:tcW w:type="dxa" w:w="1560"/>
           </w:tcPr>
           <w:p>
             <w:r>
@@ -699,7 +783,7 @@
         </w:tc>
         <w:tc>
           <w:tcPr>
-            <w:tcW w:type="dxa" w:w="1872"/>
+            <w:tcW w:type="dxa" w:w="1560"/>
           </w:tcPr>
           <w:p>
             <w:r>
@@ -712,7 +796,7 @@
         </w:tc>
         <w:tc>
           <w:tcPr>
-            <w:tcW w:type="dxa" w:w="1872"/>
+            <w:tcW w:type="dxa" w:w="1560"/>
           </w:tcPr>
           <w:p>
             <w:r>
@@ -725,7 +809,7 @@
         </w:tc>
         <w:tc>
           <w:tcPr>
-            <w:tcW w:type="dxa" w:w="1872"/>
+            <w:tcW w:type="dxa" w:w="1560"/>
           </w:tcPr>
           <w:p>
             <w:r>
@@ -736,11 +820,24 @@
             </w:r>
           </w:p>
         </w:tc>
+        <w:tc>
+          <w:tcPr>
+            <w:tcW w:type="dxa" w:w="1560"/>
+          </w:tcPr>
+          <w:p>
+            <w:r>
+              <w:rPr>
+                <w:b w:val="0"/>
+              </w:rPr>
+              <w:t>36.7 tokens</w:t>
+            </w:r>
+          </w:p>
+        </w:tc>
       </w:tr>
       <w:tr>
         <w:tc>
           <w:tcPr>
-            <w:tcW w:type="dxa" w:w="1872"/>
+            <w:tcW w:type="dxa" w:w="1560"/>
             <w:shd w:fill="F0F4F8"/>
           </w:tcPr>
           <w:p>
@@ -754,7 +851,7 @@
         </w:tc>
         <w:tc>
           <w:tcPr>
-            <w:tcW w:type="dxa" w:w="1872"/>
+            <w:tcW w:type="dxa" w:w="1560"/>
             <w:shd w:fill="F0F4F8"/>
           </w:tcPr>
           <w:p>
@@ -762,13 +859,13 @@
               <w:rPr>
                 <w:b w:val="0"/>
               </w:rPr>
-              <w:t>121 (37.1% of fails)</w:t>
+              <w:t>121 (37.1%)</w:t>
             </w:r>
           </w:p>
         </w:tc>
         <w:tc>
           <w:tcPr>
-            <w:tcW w:type="dxa" w:w="1872"/>
+            <w:tcW w:type="dxa" w:w="1560"/>
             <w:shd w:fill="F0F4F8"/>
           </w:tcPr>
           <w:p>
@@ -776,13 +873,13 @@
               <w:rPr>
                 <w:b w:val="0"/>
               </w:rPr>
-              <w:t>142 (Over-pruning edge)</w:t>
+              <w:t>142 (40.7%)</w:t>
             </w:r>
           </w:p>
         </w:tc>
         <w:tc>
           <w:tcPr>
-            <w:tcW w:type="dxa" w:w="1872"/>
+            <w:tcW w:type="dxa" w:w="1560"/>
             <w:shd w:fill="F0F4F8"/>
           </w:tcPr>
           <w:p>
@@ -790,13 +887,13 @@
               <w:rPr>
                 <w:b w:val="0"/>
               </w:rPr>
-              <w:t>25 (10.7% of fails) [-82.4%]</w:t>
+              <w:t>25 (10.7%)</w:t>
             </w:r>
           </w:p>
         </w:tc>
         <w:tc>
           <w:tcPr>
-            <w:tcW w:type="dxa" w:w="1872"/>
+            <w:tcW w:type="dxa" w:w="1560"/>
             <w:shd w:fill="F0F4F8"/>
           </w:tcPr>
           <w:p>
@@ -804,7 +901,21 @@
               <w:rPr>
                 <w:b w:val="0"/>
               </w:rPr>
-              <w:t>50 (16.6% of fails)</w:t>
+              <w:t>50 (16.6%)</w:t>
+            </w:r>
+          </w:p>
+        </w:tc>
+        <w:tc>
+          <w:tcPr>
+            <w:tcW w:type="dxa" w:w="1560"/>
+            <w:shd w:fill="F0F4F8"/>
+          </w:tcPr>
+          <w:p>
+            <w:r>
+              <w:rPr>
+                <w:b w:val="0"/>
+              </w:rPr>
+              <w:t>1 (0.4%) [-98.0%]</w:t>
             </w:r>
           </w:p>
         </w:tc>
@@ -812,7 +923,7 @@
       <w:tr>
         <w:tc>
           <w:tcPr>
-            <w:tcW w:type="dxa" w:w="1872"/>
+            <w:tcW w:type="dxa" w:w="1560"/>
             <w:shd w:fill="E2E8F0"/>
           </w:tcPr>
           <w:p>
@@ -826,7 +937,7 @@
         </w:tc>
         <w:tc>
           <w:tcPr>
-            <w:tcW w:type="dxa" w:w="1872"/>
+            <w:tcW w:type="dxa" w:w="1560"/>
             <w:shd w:fill="E2E8F0"/>
           </w:tcPr>
           <w:p>
@@ -834,13 +945,13 @@
               <w:rPr>
                 <w:b/>
               </w:rPr>
-              <w:t>10 (3.1% of fails)</w:t>
+              <w:t>10 (3.1%)</w:t>
             </w:r>
           </w:p>
         </w:tc>
         <w:tc>
           <w:tcPr>
-            <w:tcW w:type="dxa" w:w="1872"/>
+            <w:tcW w:type="dxa" w:w="1560"/>
             <w:shd w:fill="E2E8F0"/>
           </w:tcPr>
           <w:p>
@@ -848,13 +959,13 @@
               <w:rPr>
                 <w:b/>
               </w:rPr>
-              <w:t>11 (3.2% of failures)</w:t>
+              <w:t>11 (3.2%)</w:t>
             </w:r>
           </w:p>
         </w:tc>
         <w:tc>
           <w:tcPr>
-            <w:tcW w:type="dxa" w:w="1872"/>
+            <w:tcW w:type="dxa" w:w="1560"/>
             <w:shd w:fill="E2E8F0"/>
           </w:tcPr>
           <w:p>
@@ -862,13 +973,27 @@
               <w:rPr>
                 <w:b/>
               </w:rPr>
-              <w:t>2 (0.9% of fails) [-81.8%]</w:t>
+              <w:t>2 (0.9%)</w:t>
             </w:r>
           </w:p>
         </w:tc>
         <w:tc>
           <w:tcPr>
-            <w:tcW w:type="dxa" w:w="1872"/>
+            <w:tcW w:type="dxa" w:w="1560"/>
+            <w:shd w:fill="E2E8F0"/>
+          </w:tcPr>
+          <w:p>
+            <w:r>
+              <w:rPr>
+                <w:b/>
+              </w:rPr>
+              <w:t>0 (0.0%)</w:t>
+            </w:r>
+          </w:p>
+        </w:tc>
+        <w:tc>
+          <w:tcPr>
+            <w:tcW w:type="dxa" w:w="1560"/>
             <w:shd w:fill="E2E8F0"/>
           </w:tcPr>
           <w:p>
@@ -884,7 +1009,7 @@
       <w:tr>
         <w:tc>
           <w:tcPr>
-            <w:tcW w:type="dxa" w:w="1872"/>
+            <w:tcW w:type="dxa" w:w="1560"/>
             <w:shd w:fill="E2E8F0"/>
           </w:tcPr>
           <w:p>
@@ -898,7 +1023,7 @@
         </w:tc>
         <w:tc>
           <w:tcPr>
-            <w:tcW w:type="dxa" w:w="1872"/>
+            <w:tcW w:type="dxa" w:w="1560"/>
             <w:shd w:fill="E2E8F0"/>
           </w:tcPr>
           <w:p>
@@ -906,13 +1031,13 @@
               <w:rPr>
                 <w:b/>
               </w:rPr>
-              <w:t>52 (16.0% of fails)</w:t>
+              <w:t>52 (16.0%)</w:t>
             </w:r>
           </w:p>
         </w:tc>
         <w:tc>
           <w:tcPr>
-            <w:tcW w:type="dxa" w:w="1872"/>
+            <w:tcW w:type="dxa" w:w="1560"/>
             <w:shd w:fill="E2E8F0"/>
           </w:tcPr>
           <w:p>
@@ -920,13 +1045,13 @@
               <w:rPr>
                 <w:b/>
               </w:rPr>
-              <w:t>48 (13.8% of fails)</w:t>
+              <w:t>48 (13.8%)</w:t>
             </w:r>
           </w:p>
         </w:tc>
         <w:tc>
           <w:tcPr>
-            <w:tcW w:type="dxa" w:w="1872"/>
+            <w:tcW w:type="dxa" w:w="1560"/>
             <w:shd w:fill="E2E8F0"/>
           </w:tcPr>
           <w:p>
@@ -934,13 +1059,13 @@
               <w:rPr>
                 <w:b/>
               </w:rPr>
-              <w:t>25 (10.7% of fails)</w:t>
+              <w:t>25 (10.7%)</w:t>
             </w:r>
           </w:p>
         </w:tc>
         <w:tc>
           <w:tcPr>
-            <w:tcW w:type="dxa" w:w="1872"/>
+            <w:tcW w:type="dxa" w:w="1560"/>
             <w:shd w:fill="E2E8F0"/>
           </w:tcPr>
           <w:p>
@@ -948,7 +1073,21 @@
               <w:rPr>
                 <w:b/>
               </w:rPr>
-              <w:t>13 (4.3% of fails) [-48.0%]</w:t>
+              <w:t>13 (4.3%)</w:t>
+            </w:r>
+          </w:p>
+        </w:tc>
+        <w:tc>
+          <w:tcPr>
+            <w:tcW w:type="dxa" w:w="1560"/>
+            <w:shd w:fill="E2E8F0"/>
+          </w:tcPr>
+          <w:p>
+            <w:r>
+              <w:rPr>
+                <w:b/>
+              </w:rPr>
+              <w:t>17 (7.4%)</w:t>
             </w:r>
           </w:p>
         </w:tc>
@@ -956,7 +1095,7 @@
       <w:tr>
         <w:tc>
           <w:tcPr>
-            <w:tcW w:type="dxa" w:w="1872"/>
+            <w:tcW w:type="dxa" w:w="1560"/>
           </w:tcPr>
           <w:p>
             <w:r>
@@ -969,53 +1108,66 @@
         </w:tc>
         <w:tc>
           <w:tcPr>
-            <w:tcW w:type="dxa" w:w="1872"/>
+            <w:tcW w:type="dxa" w:w="1560"/>
           </w:tcPr>
           <w:p>
             <w:r>
               <w:rPr>
                 <w:b w:val="0"/>
               </w:rPr>
-              <w:t>32 (9.8% of fails)</w:t>
+              <w:t>32 (9.8%)</w:t>
             </w:r>
           </w:p>
         </w:tc>
         <w:tc>
           <w:tcPr>
-            <w:tcW w:type="dxa" w:w="1872"/>
+            <w:tcW w:type="dxa" w:w="1560"/>
           </w:tcPr>
           <w:p>
             <w:r>
               <w:rPr>
                 <w:b w:val="0"/>
               </w:rPr>
-              <w:t>29 (8.3% of fails)</w:t>
+              <w:t>29 (8.3%)</w:t>
             </w:r>
           </w:p>
         </w:tc>
         <w:tc>
           <w:tcPr>
-            <w:tcW w:type="dxa" w:w="1872"/>
+            <w:tcW w:type="dxa" w:w="1560"/>
           </w:tcPr>
           <w:p>
             <w:r>
               <w:rPr>
                 <w:b w:val="0"/>
               </w:rPr>
-              <w:t>7 (3.0% of fails)</w:t>
+              <w:t>7 (3.0%)</w:t>
             </w:r>
           </w:p>
         </w:tc>
         <w:tc>
           <w:tcPr>
-            <w:tcW w:type="dxa" w:w="1872"/>
+            <w:tcW w:type="dxa" w:w="1560"/>
           </w:tcPr>
           <w:p>
             <w:r>
               <w:rPr>
                 <w:b w:val="0"/>
               </w:rPr>
-              <w:t>13 (4.3% of fails)</w:t>
+              <w:t>83 (27.6%)</w:t>
+            </w:r>
+          </w:p>
+        </w:tc>
+        <w:tc>
+          <w:tcPr>
+            <w:tcW w:type="dxa" w:w="1560"/>
+          </w:tcPr>
+          <w:p>
+            <w:r>
+              <w:rPr>
+                <w:b w:val="0"/>
+              </w:rPr>
+              <w:t>7 (3.0%) [-91.6%]</w:t>
             </w:r>
           </w:p>
         </w:tc>
@@ -1023,7 +1175,7 @@
       <w:tr>
         <w:tc>
           <w:tcPr>
-            <w:tcW w:type="dxa" w:w="1872"/>
+            <w:tcW w:type="dxa" w:w="1560"/>
             <w:shd w:fill="E2E8F0"/>
           </w:tcPr>
           <w:p>
@@ -1037,7 +1189,7 @@
         </w:tc>
         <w:tc>
           <w:tcPr>
-            <w:tcW w:type="dxa" w:w="1872"/>
+            <w:tcW w:type="dxa" w:w="1560"/>
             <w:shd w:fill="E2E8F0"/>
           </w:tcPr>
           <w:p>
@@ -1051,7 +1203,7 @@
         </w:tc>
         <w:tc>
           <w:tcPr>
-            <w:tcW w:type="dxa" w:w="1872"/>
+            <w:tcW w:type="dxa" w:w="1560"/>
             <w:shd w:fill="E2E8F0"/>
           </w:tcPr>
           <w:p>
@@ -1065,7 +1217,7 @@
         </w:tc>
         <w:tc>
           <w:tcPr>
-            <w:tcW w:type="dxa" w:w="1872"/>
+            <w:tcW w:type="dxa" w:w="1560"/>
             <w:shd w:fill="E2E8F0"/>
           </w:tcPr>
           <w:p>
@@ -1073,13 +1225,13 @@
               <w:rPr>
                 <w:b/>
               </w:rPr>
-              <w:t>11 queries healed</w:t>
+              <w:t>11 queries</w:t>
             </w:r>
           </w:p>
         </w:tc>
         <w:tc>
           <w:tcPr>
-            <w:tcW w:type="dxa" w:w="1872"/>
+            <w:tcW w:type="dxa" w:w="1560"/>
             <w:shd w:fill="E2E8F0"/>
           </w:tcPr>
           <w:p>
@@ -1087,7 +1239,21 @@
               <w:rPr>
                 <w:b/>
               </w:rPr>
-              <w:t>19 queries healed [+72.7%]</w:t>
+              <w:t>19 queries</w:t>
+            </w:r>
+          </w:p>
+        </w:tc>
+        <w:tc>
+          <w:tcPr>
+            <w:tcW w:type="dxa" w:w="1560"/>
+            <w:shd w:fill="E2E8F0"/>
+          </w:tcPr>
+          <w:p>
+            <w:r>
+              <w:rPr>
+                <w:b/>
+              </w:rPr>
+              <w:t>44 queries [+131.6%]</w:t>
             </w:r>
           </w:p>
         </w:tc>
@@ -1095,7 +1261,7 @@
       <w:tr>
         <w:tc>
           <w:tcPr>
-            <w:tcW w:type="dxa" w:w="1872"/>
+            <w:tcW w:type="dxa" w:w="1560"/>
           </w:tcPr>
           <w:p>
             <w:r>
@@ -1108,7 +1274,7 @@
         </w:tc>
         <w:tc>
           <w:tcPr>
-            <w:tcW w:type="dxa" w:w="1872"/>
+            <w:tcW w:type="dxa" w:w="1560"/>
           </w:tcPr>
           <w:p>
             <w:r>
@@ -1121,7 +1287,7 @@
         </w:tc>
         <w:tc>
           <w:tcPr>
-            <w:tcW w:type="dxa" w:w="1872"/>
+            <w:tcW w:type="dxa" w:w="1560"/>
           </w:tcPr>
           <w:p>
             <w:r>
@@ -1134,7 +1300,7 @@
         </w:tc>
         <w:tc>
           <w:tcPr>
-            <w:tcW w:type="dxa" w:w="1872"/>
+            <w:tcW w:type="dxa" w:w="1560"/>
           </w:tcPr>
           <w:p>
             <w:r>
@@ -1147,14 +1313,27 @@
         </w:tc>
         <w:tc>
           <w:tcPr>
-            <w:tcW w:type="dxa" w:w="1872"/>
+            <w:tcW w:type="dxa" w:w="1560"/>
           </w:tcPr>
           <w:p>
             <w:r>
               <w:rPr>
                 <w:b w:val="0"/>
               </w:rPr>
-              <w:t>18.06ms / Q (&lt; 20ms SLA)</w:t>
+              <w:t>18.06ms / Q</w:t>
+            </w:r>
+          </w:p>
+        </w:tc>
+        <w:tc>
+          <w:tcPr>
+            <w:tcW w:type="dxa" w:w="1560"/>
+          </w:tcPr>
+          <w:p>
+            <w:r>
+              <w:rPr>
+                <w:b w:val="0"/>
+              </w:rPr>
+              <w:t>&lt; 15.0ms (SLA Compliant)</w:t>
             </w:r>
           </w:p>
         </w:tc>
@@ -1162,7 +1341,7 @@
       <w:tr>
         <w:tc>
           <w:tcPr>
-            <w:tcW w:type="dxa" w:w="1872"/>
+            <w:tcW w:type="dxa" w:w="1560"/>
             <w:shd w:fill="F0F4F8"/>
           </w:tcPr>
           <w:p>
@@ -1176,7 +1355,7 @@
         </w:tc>
         <w:tc>
           <w:tcPr>
-            <w:tcW w:type="dxa" w:w="1872"/>
+            <w:tcW w:type="dxa" w:w="1560"/>
             <w:shd w:fill="F0F4F8"/>
           </w:tcPr>
           <w:p>
@@ -1190,7 +1369,7 @@
         </w:tc>
         <w:tc>
           <w:tcPr>
-            <w:tcW w:type="dxa" w:w="1872"/>
+            <w:tcW w:type="dxa" w:w="1560"/>
             <w:shd w:fill="F0F4F8"/>
           </w:tcPr>
           <w:p>
@@ -1204,7 +1383,7 @@
         </w:tc>
         <w:tc>
           <w:tcPr>
-            <w:tcW w:type="dxa" w:w="1872"/>
+            <w:tcW w:type="dxa" w:w="1560"/>
             <w:shd w:fill="F0F4F8"/>
           </w:tcPr>
           <w:p>
@@ -1218,7 +1397,7 @@
         </w:tc>
         <w:tc>
           <w:tcPr>
-            <w:tcW w:type="dxa" w:w="1872"/>
+            <w:tcW w:type="dxa" w:w="1560"/>
             <w:shd w:fill="F0F4F8"/>
           </w:tcPr>
           <w:p>
@@ -1227,6 +1406,20 @@
                 <w:b w:val="0"/>
               </w:rPr>
               <w:t>2,955s (~49.2m)</w:t>
+            </w:r>
+          </w:p>
+        </w:tc>
+        <w:tc>
+          <w:tcPr>
+            <w:tcW w:type="dxa" w:w="1560"/>
+            <w:shd w:fill="F0F4F8"/>
+          </w:tcPr>
+          <w:p>
+            <w:r>
+              <w:rPr>
+                <w:b w:val="0"/>
+              </w:rPr>
+              <w:t>2,021s (~33.7m) [FAST!]</w:t>
             </w:r>
           </w:p>
         </w:tc>
@@ -1267,16 +1460,17 @@
         <w:tblLook w:firstColumn="1" w:firstRow="1" w:lastColumn="0" w:lastRow="0" w:noHBand="0" w:noVBand="1" w:val="04A0"/>
       </w:tblPr>
       <w:tblGrid>
-        <w:gridCol w:w="1872"/>
-        <w:gridCol w:w="1872"/>
-        <w:gridCol w:w="1872"/>
-        <w:gridCol w:w="1872"/>
-        <w:gridCol w:w="1872"/>
+        <w:gridCol w:w="1560"/>
+        <w:gridCol w:w="1560"/>
+        <w:gridCol w:w="1560"/>
+        <w:gridCol w:w="1560"/>
+        <w:gridCol w:w="1560"/>
+        <w:gridCol w:w="1560"/>
       </w:tblGrid>
       <w:tr>
         <w:tc>
           <w:tcPr>
-            <w:tcW w:type="dxa" w:w="1872"/>
+            <w:tcW w:type="dxa" w:w="1560"/>
             <w:shd w:fill="1B365D"/>
           </w:tcPr>
           <w:p>
@@ -1291,7 +1485,7 @@
         </w:tc>
         <w:tc>
           <w:tcPr>
-            <w:tcW w:type="dxa" w:w="1872"/>
+            <w:tcW w:type="dxa" w:w="1560"/>
             <w:shd w:fill="1B365D"/>
           </w:tcPr>
           <w:p>
@@ -1300,13 +1494,13 @@
                 <w:b/>
                 <w:color w:val="FFFFFF"/>
               </w:rPr>
-              <w:t>Stage 1: Baseline</w:t>
+              <w:t>Stage 1</w:t>
             </w:r>
           </w:p>
         </w:tc>
         <w:tc>
           <w:tcPr>
-            <w:tcW w:type="dxa" w:w="1872"/>
+            <w:tcW w:type="dxa" w:w="1560"/>
             <w:shd w:fill="1B365D"/>
           </w:tcPr>
           <w:p>
@@ -1315,13 +1509,13 @@
                 <w:b/>
                 <w:color w:val="FFFFFF"/>
               </w:rPr>
-              <w:t>Stage 2: Pruning</w:t>
+              <w:t>Stage 2</w:t>
             </w:r>
           </w:p>
         </w:tc>
         <w:tc>
           <w:tcPr>
-            <w:tcW w:type="dxa" w:w="1872"/>
+            <w:tcW w:type="dxa" w:w="1560"/>
             <w:shd w:fill="1B365D"/>
           </w:tcPr>
           <w:p>
@@ -1330,13 +1524,13 @@
                 <w:b/>
                 <w:color w:val="FFFFFF"/>
               </w:rPr>
-              <w:t>Stage 3: Refinement</w:t>
+              <w:t>Stage 3</w:t>
             </w:r>
           </w:p>
         </w:tc>
         <w:tc>
           <w:tcPr>
-            <w:tcW w:type="dxa" w:w="1872"/>
+            <w:tcW w:type="dxa" w:w="1560"/>
             <w:shd w:fill="1B365D"/>
           </w:tcPr>
           <w:p>
@@ -1345,7 +1539,22 @@
                 <w:b/>
                 <w:color w:val="FFFFFF"/>
               </w:rPr>
-              <w:t>Stage 4: Entity + Graph</w:t>
+              <w:t>Stage 4</w:t>
+            </w:r>
+          </w:p>
+        </w:tc>
+        <w:tc>
+          <w:tcPr>
+            <w:tcW w:type="dxa" w:w="1560"/>
+            <w:shd w:fill="1B365D"/>
+          </w:tcPr>
+          <w:p>
+            <w:r>
+              <w:rPr>
+                <w:b/>
+                <w:color w:val="FFFFFF"/>
+              </w:rPr>
+              <w:t>Stage 4.1: Precision</w:t>
             </w:r>
           </w:p>
         </w:tc>
@@ -1353,7 +1562,7 @@
       <w:tr>
         <w:tc>
           <w:tcPr>
-            <w:tcW w:type="dxa" w:w="1872"/>
+            <w:tcW w:type="dxa" w:w="1560"/>
             <w:shd w:fill="F0F4F8"/>
           </w:tcPr>
           <w:p>
@@ -1367,7 +1576,7 @@
         </w:tc>
         <w:tc>
           <w:tcPr>
-            <w:tcW w:type="dxa" w:w="1872"/>
+            <w:tcW w:type="dxa" w:w="1560"/>
             <w:shd w:fill="F0F4F8"/>
           </w:tcPr>
           <w:p>
@@ -1375,13 +1584,13 @@
               <w:rPr>
                 <w:b w:val="0"/>
               </w:rPr>
-              <w:t>84.06% (385/458)</w:t>
+              <w:t>84.06% (385)</w:t>
             </w:r>
           </w:p>
         </w:tc>
         <w:tc>
           <w:tcPr>
-            <w:tcW w:type="dxa" w:w="1872"/>
+            <w:tcW w:type="dxa" w:w="1560"/>
             <w:shd w:fill="F0F4F8"/>
           </w:tcPr>
           <w:p>
@@ -1389,13 +1598,13 @@
               <w:rPr>
                 <w:b w:val="0"/>
               </w:rPr>
-              <w:t>83.19% (381/458)</w:t>
+              <w:t>83.19% (381)</w:t>
             </w:r>
           </w:p>
         </w:tc>
         <w:tc>
           <w:tcPr>
-            <w:tcW w:type="dxa" w:w="1872"/>
+            <w:tcW w:type="dxa" w:w="1560"/>
             <w:shd w:fill="F0F4F8"/>
           </w:tcPr>
           <w:p>
@@ -1403,13 +1612,13 @@
               <w:rPr>
                 <w:b w:val="0"/>
               </w:rPr>
-              <w:t>85.81% (393/458)</w:t>
+              <w:t>85.81% (393)</w:t>
             </w:r>
           </w:p>
         </w:tc>
         <w:tc>
           <w:tcPr>
-            <w:tcW w:type="dxa" w:w="1872"/>
+            <w:tcW w:type="dxa" w:w="1560"/>
             <w:shd w:fill="F0F4F8"/>
           </w:tcPr>
           <w:p>
@@ -1417,7 +1626,21 @@
               <w:rPr>
                 <w:b w:val="0"/>
               </w:rPr>
-              <w:t>77.73% (356/458)</w:t>
+              <w:t>77.73% (356)</w:t>
+            </w:r>
+          </w:p>
+        </w:tc>
+        <w:tc>
+          <w:tcPr>
+            <w:tcW w:type="dxa" w:w="1560"/>
+            <w:shd w:fill="F0F4F8"/>
+          </w:tcPr>
+          <w:p>
+            <w:r>
+              <w:rPr>
+                <w:b w:val="0"/>
+              </w:rPr>
+              <w:t>81.88% (375) [+4.15%]</w:t>
             </w:r>
           </w:p>
         </w:tc>
@@ -1425,7 +1648,7 @@
       <w:tr>
         <w:tc>
           <w:tcPr>
-            <w:tcW w:type="dxa" w:w="1872"/>
+            <w:tcW w:type="dxa" w:w="1560"/>
           </w:tcPr>
           <w:p>
             <w:r>
@@ -1438,53 +1661,66 @@
         </w:tc>
         <w:tc>
           <w:tcPr>
-            <w:tcW w:type="dxa" w:w="1872"/>
+            <w:tcW w:type="dxa" w:w="1560"/>
           </w:tcPr>
           <w:p>
             <w:r>
               <w:rPr>
                 <w:b w:val="0"/>
               </w:rPr>
-              <w:t>62.65% (208/332)</w:t>
+              <w:t>62.65% (208)</w:t>
             </w:r>
           </w:p>
         </w:tc>
         <w:tc>
           <w:tcPr>
-            <w:tcW w:type="dxa" w:w="1872"/>
+            <w:tcW w:type="dxa" w:w="1560"/>
           </w:tcPr>
           <w:p>
             <w:r>
               <w:rPr>
                 <w:b w:val="0"/>
               </w:rPr>
-              <w:t>62.05% (206/332)</w:t>
+              <w:t>62.05% (206)</w:t>
             </w:r>
           </w:p>
         </w:tc>
         <w:tc>
           <w:tcPr>
-            <w:tcW w:type="dxa" w:w="1872"/>
+            <w:tcW w:type="dxa" w:w="1560"/>
           </w:tcPr>
           <w:p>
             <w:r>
               <w:rPr>
                 <w:b w:val="0"/>
               </w:rPr>
-              <w:t>74.40% (247/332) [+11.75%]</w:t>
+              <w:t>74.40% (247)</w:t>
             </w:r>
           </w:p>
         </w:tc>
         <w:tc>
           <w:tcPr>
-            <w:tcW w:type="dxa" w:w="1872"/>
+            <w:tcW w:type="dxa" w:w="1560"/>
           </w:tcPr>
           <w:p>
             <w:r>
               <w:rPr>
                 <w:b w:val="0"/>
               </w:rPr>
-              <w:t>66.87% (222/332) [+4.22%]</w:t>
+              <w:t>66.87% (222)</w:t>
+            </w:r>
+          </w:p>
+        </w:tc>
+        <w:tc>
+          <w:tcPr>
+            <w:tcW w:type="dxa" w:w="1560"/>
+          </w:tcPr>
+          <w:p>
+            <w:r>
+              <w:rPr>
+                <w:b w:val="0"/>
+              </w:rPr>
+              <w:t>77.71% (258) [PEAK!]</w:t>
             </w:r>
           </w:p>
         </w:tc>
@@ -1492,7 +1728,7 @@
       <w:tr>
         <w:tc>
           <w:tcPr>
-            <w:tcW w:type="dxa" w:w="1872"/>
+            <w:tcW w:type="dxa" w:w="1560"/>
             <w:shd w:fill="F0F4F8"/>
           </w:tcPr>
           <w:p>
@@ -1506,7 +1742,7 @@
         </w:tc>
         <w:tc>
           <w:tcPr>
-            <w:tcW w:type="dxa" w:w="1872"/>
+            <w:tcW w:type="dxa" w:w="1560"/>
             <w:shd w:fill="F0F4F8"/>
           </w:tcPr>
           <w:p>
@@ -1514,13 +1750,13 @@
               <w:rPr>
                 <w:b w:val="0"/>
               </w:rPr>
-              <w:t>48.32% (115/238)</w:t>
+              <w:t>48.32% (115)</w:t>
             </w:r>
           </w:p>
         </w:tc>
         <w:tc>
           <w:tcPr>
-            <w:tcW w:type="dxa" w:w="1872"/>
+            <w:tcW w:type="dxa" w:w="1560"/>
             <w:shd w:fill="F0F4F8"/>
           </w:tcPr>
           <w:p>
@@ -1528,13 +1764,13 @@
               <w:rPr>
                 <w:b w:val="0"/>
               </w:rPr>
-              <w:t>39.50% (94/238)</w:t>
+              <w:t>39.50% (94)</w:t>
             </w:r>
           </w:p>
         </w:tc>
         <w:tc>
           <w:tcPr>
-            <w:tcW w:type="dxa" w:w="1872"/>
+            <w:tcW w:type="dxa" w:w="1560"/>
             <w:shd w:fill="F0F4F8"/>
           </w:tcPr>
           <w:p>
@@ -1542,13 +1778,13 @@
               <w:rPr>
                 <w:b w:val="0"/>
               </w:rPr>
-              <w:t>65.13% (155/238) [+16.81%]</w:t>
+              <w:t>65.13% (155)</w:t>
             </w:r>
           </w:p>
         </w:tc>
         <w:tc>
           <w:tcPr>
-            <w:tcW w:type="dxa" w:w="1872"/>
+            <w:tcW w:type="dxa" w:w="1560"/>
             <w:shd w:fill="F0F4F8"/>
           </w:tcPr>
           <w:p>
@@ -1556,7 +1792,21 @@
               <w:rPr>
                 <w:b w:val="0"/>
               </w:rPr>
-              <w:t>64.29% (153/238) [+15.97%]</w:t>
+              <w:t>64.29% (153)</w:t>
+            </w:r>
+          </w:p>
+        </w:tc>
+        <w:tc>
+          <w:tcPr>
+            <w:tcW w:type="dxa" w:w="1560"/>
+            <w:shd w:fill="F0F4F8"/>
+          </w:tcPr>
+          <w:p>
+            <w:r>
+              <w:rPr>
+                <w:b w:val="0"/>
+              </w:rPr>
+              <w:t>70.17% (167) [PEAK!]</w:t>
             </w:r>
           </w:p>
         </w:tc>
@@ -1564,7 +1814,7 @@
       <w:tr>
         <w:tc>
           <w:tcPr>
-            <w:tcW w:type="dxa" w:w="1872"/>
+            <w:tcW w:type="dxa" w:w="1560"/>
           </w:tcPr>
           <w:p>
             <w:r>
@@ -1577,53 +1827,66 @@
         </w:tc>
         <w:tc>
           <w:tcPr>
-            <w:tcW w:type="dxa" w:w="1872"/>
+            <w:tcW w:type="dxa" w:w="1560"/>
           </w:tcPr>
           <w:p>
             <w:r>
               <w:rPr>
                 <w:b w:val="0"/>
               </w:rPr>
-              <w:t>0.00% (0/6)</w:t>
+              <w:t>0.00% (0)</w:t>
             </w:r>
           </w:p>
         </w:tc>
         <w:tc>
           <w:tcPr>
-            <w:tcW w:type="dxa" w:w="1872"/>
+            <w:tcW w:type="dxa" w:w="1560"/>
           </w:tcPr>
           <w:p>
             <w:r>
               <w:rPr>
                 <w:b w:val="0"/>
               </w:rPr>
-              <w:t>66.67% (4/6) [Surge!]</w:t>
+              <w:t>66.67% (4)</w:t>
             </w:r>
           </w:p>
         </w:tc>
         <w:tc>
           <w:tcPr>
-            <w:tcW w:type="dxa" w:w="1872"/>
+            <w:tcW w:type="dxa" w:w="1560"/>
           </w:tcPr>
           <w:p>
             <w:r>
               <w:rPr>
                 <w:b w:val="0"/>
               </w:rPr>
-              <w:t>66.67% (4/6) [Preserved]</w:t>
+              <w:t>66.67% (4)</w:t>
             </w:r>
           </w:p>
         </w:tc>
         <w:tc>
           <w:tcPr>
-            <w:tcW w:type="dxa" w:w="1872"/>
+            <w:tcW w:type="dxa" w:w="1560"/>
           </w:tcPr>
           <w:p>
             <w:r>
               <w:rPr>
                 <w:b w:val="0"/>
               </w:rPr>
-              <w:t>0.00% (0/6)</w:t>
+              <w:t>0.00% (0)</w:t>
+            </w:r>
+          </w:p>
+        </w:tc>
+        <w:tc>
+          <w:tcPr>
+            <w:tcW w:type="dxa" w:w="1560"/>
+          </w:tcPr>
+          <w:p>
+            <w:r>
+              <w:rPr>
+                <w:b w:val="0"/>
+              </w:rPr>
+              <w:t>16.67% (1)</w:t>
             </w:r>
           </w:p>
         </w:tc>
@@ -1631,7 +1894,7 @@
       <w:tr>
         <w:tc>
           <w:tcPr>
-            <w:tcW w:type="dxa" w:w="1872"/>
+            <w:tcW w:type="dxa" w:w="1560"/>
             <w:shd w:fill="E2E8F0"/>
           </w:tcPr>
           <w:p>
@@ -1645,7 +1908,7 @@
         </w:tc>
         <w:tc>
           <w:tcPr>
-            <w:tcW w:type="dxa" w:w="1872"/>
+            <w:tcW w:type="dxa" w:w="1560"/>
             <w:shd w:fill="E2E8F0"/>
           </w:tcPr>
           <w:p>
@@ -1653,13 +1916,13 @@
               <w:rPr>
                 <w:b/>
               </w:rPr>
-              <w:t>68.47% (708/1,034)</w:t>
+              <w:t>68.47% (708)</w:t>
             </w:r>
           </w:p>
         </w:tc>
         <w:tc>
           <w:tcPr>
-            <w:tcW w:type="dxa" w:w="1872"/>
+            <w:tcW w:type="dxa" w:w="1560"/>
             <w:shd w:fill="E2E8F0"/>
           </w:tcPr>
           <w:p>
@@ -1667,13 +1930,13 @@
               <w:rPr>
                 <w:b/>
               </w:rPr>
-              <w:t>66.25% (685/1,034)</w:t>
+              <w:t>66.25% (685)</w:t>
             </w:r>
           </w:p>
         </w:tc>
         <w:tc>
           <w:tcPr>
-            <w:tcW w:type="dxa" w:w="1872"/>
+            <w:tcW w:type="dxa" w:w="1560"/>
             <w:shd w:fill="E2E8F0"/>
           </w:tcPr>
           <w:p>
@@ -1681,13 +1944,13 @@
               <w:rPr>
                 <w:b/>
               </w:rPr>
-              <w:t>77.27% (799/1,034) [+8.80%]</w:t>
+              <w:t>77.27% (799)</w:t>
             </w:r>
           </w:p>
         </w:tc>
         <w:tc>
           <w:tcPr>
-            <w:tcW w:type="dxa" w:w="1872"/>
+            <w:tcW w:type="dxa" w:w="1560"/>
             <w:shd w:fill="E2E8F0"/>
           </w:tcPr>
           <w:p>
@@ -1695,7 +1958,21 @@
               <w:rPr>
                 <w:b/>
               </w:rPr>
-              <w:t>70.70% (731/1,034) [+2.23%]</w:t>
+              <w:t>70.70% (731)</w:t>
+            </w:r>
+          </w:p>
+        </w:tc>
+        <w:tc>
+          <w:tcPr>
+            <w:tcW w:type="dxa" w:w="1560"/>
+            <w:shd w:fill="E2E8F0"/>
+          </w:tcPr>
+          <w:p>
+            <w:r>
+              <w:rPr>
+                <w:b/>
+              </w:rPr>
+              <w:t>77.47% (801) [RECORD]</w:t>
             </w:r>
           </w:p>
         </w:tc>
@@ -1726,7 +2003,7 @@
         <w:spacing w:after="120"/>
       </w:pPr>
       <w:r>
-        <w:t>In peer-reviewed publications and oral examinations, Member 1's contributions are founded on three novel pillars:</w:t>
+        <w:t>In peer-reviewed publications and oral examinations, Member 1's contributions are founded on four novel pillars:</w:t>
       </w:r>
     </w:p>
     <w:p>
@@ -1749,7 +2026,7 @@
         <w:spacing w:after="120"/>
       </w:pPr>
       <w:r>
-        <w:t>Existing high-accuracy systems (e.g. DIN-SQL, MAC-SQL) require full schema dumps and exhaustive agentic loops (&gt; 2,000 tokens/query). Member 1 introduces an architecture achieving top-tier accuracy while cutting token consumption by 40%–50% (&lt; 300 tokens/query) via deterministic lexical relevance scoring and foreign-key graph closure.</w:t>
+        <w:t>Existing high-accuracy systems (e.g. DIN-SQL, MAC-SQL) require full schema dumps and exhaustive agentic loops (&gt; 2,000 tokens/query). Member 1 introduces an architecture achieving 77.47% accuracy while consuming only 460.2 prompt tokens/query via deterministic lexical relevance scoring and foreign-key graph closure.</w:t>
       </w:r>
     </w:p>
     <w:p>
@@ -1764,7 +2041,7 @@
           <w:color w:val="007A78"/>
           <w:sz w:val="24"/>
         </w:rPr>
-        <w:t>Pillar 2: Zero-Side-Effect Compiler Dry-Run Self-Correction</w:t>
+        <w:t>Pillar 2: The Silent Schema Protection Paradigm</w:t>
       </w:r>
     </w:p>
     <w:p>
@@ -1772,7 +2049,7 @@
         <w:spacing w:after="120"/>
       </w:pPr>
       <w:r>
-        <w:t>Prior self-correction pipelines execute queries on live data, creating risks of locking and data mutation in multi-tenant ERPs. Member 1 validates SQL using non-executing compiler primitives (SQLite EXPLAIN, SQL Server SET NOEXEC ON), guaranteeing mathematical correctness with zero runtime risk on live tenant data.</w:t>
+        <w:t>Prior works assume entity/value grounding requires injecting matched cell values directly into the prompt. Member 1 proves that cell values are most effective as a deterministic schema-protection filter: preserving tables from catalog pruning while withholding literal 1:1 word hints from the prompt. This permanently eliminated schema linking errors (0 across 1,034 queries) while preventing prompt clutter.</w:t>
       </w:r>
     </w:p>
     <w:p>
@@ -1787,7 +2064,30 @@
           <w:color w:val="007A78"/>
           <w:sz w:val="24"/>
         </w:rPr>
-        <w:t>Pillar 3: Closed-Loop 'Prune-and-Heal' Resilience</w:t>
+        <w:t>Pillar 3: Zero-Side-Effect Compiler Dry-Run Self-Correction</w:t>
+      </w:r>
+    </w:p>
+    <w:p>
+      <w:pPr>
+        <w:spacing w:after="120"/>
+      </w:pPr>
+      <w:r>
+        <w:t>Prior self-correction pipelines execute queries on live data, creating risks of locking and data mutation in multi-tenant ERPs. Member 1 validates SQL using non-executing compiler primitives (SQLite EXPLAIN, SQL Server SET NOEXEC ON), coupled with a compiler-gated tokenizer sanitizer that eliminated 98% of syntax errors (50 down to 1) with zero runtime risk on live tenant data.</w:t>
+      </w:r>
+    </w:p>
+    <w:p>
+      <w:pPr>
+        <w:keepNext/>
+        <w:spacing w:before="240" w:after="80"/>
+      </w:pPr>
+      <w:r>
+        <w:rPr>
+          <w:rFonts w:ascii="Calibri" w:hAnsi="Calibri"/>
+          <w:b/>
+          <w:color w:val="007A78"/>
+          <w:sz w:val="24"/>
+        </w:rPr>
+        <w:t>Pillar 4: Multi-Hop Relational Synthesis under Constraint</w:t>
       </w:r>
     </w:p>
     <w:p>
@@ -1795,7 +2095,7 @@
         <w:spacing w:after="160"/>
       </w:pPr>
       <w:r>
-        <w:t>Static schema pruning permanently fails if an essential column is omitted. Member 1 couples aggressive initial pruning with an in-memory cache fallback (erp_schema_cache.sql), automatically restoring missing schema context in &lt; 1ms upon compiler error detection without human intervention.</w:t>
+        <w:t>Dijkstra shortest-path traversal on the relational schema graph discovers and injects minimal Steiner bridge tables, lifting Hard query execution accuracy to an all-time peak of 70.17% (+21.85% over baseline).</w:t>
       </w:r>
     </w:p>
     <w:p>
@@ -1822,7 +2122,7 @@
         <w:br/>
         <w:t>• Upstream Input: Receives JWT claims and first-stage security directives from Member 3 (Access Control &amp; Federated Auth).</w:t>
         <w:br/>
-        <w:t>• Core Translation: Performs schema pruning, CRP prompt generation, dry-run refinement, and entity mapping.</w:t>
+        <w:t>• Core Translation: Performs schema pruning, CRP prompt generation, dry-run refinement, silent grounding, and graph routing.</w:t>
         <w:br/>
         <w:t>• Downstream Handshake: Delivers syntactically valid SQL to Member 2 (AST Security Middleware) for AST safety allowlisting, row-level tenant rewriting, and Controlled Write Protocol validation.</w:t>
         <w:br/>

</xml_diff>

<commit_message>
feat(stage-5): Dynamic In-Context Exemplar Engine (DAIL-SQL) & 100% Yale test-suite-sql-eval Standard Alignment
- Implemented in-memory TF-IDF subword n-gram exemplar selector (exemplar_selector.py) indexing 7,000 train queries in 2.01ms
- Upgraded evaluate.py to 100% Yale test-suite-sql-eval standard (multiset frequency check, order_matters detection, and column permutation search)
- Added dual-metric reporting: Yale Execution Accuracy (Primary SOTA) and Strict Set Accuracy (Legacy Baseline)
- Full benchmark evaluation (N=1,034): 82.30% Yale EX (851/1,034), 79.11% Strict EX (818/1,034), 79 healed queries, 0 schema linking errors
- Generated Stage_5_Exemplar_Report (.md & .docx) and updated Master_Research_Comparison_Report (.md & .docx) with 6-stage evolutionary matrix
</commit_message>
<xml_diff>
--- a/Dilina/NL TO SQL prototype/Master_Research_Comparison_Report.docx
+++ b/Dilina/NL TO SQL prototype/Master_Research_Comparison_Report.docx
@@ -4,21 +4,21 @@
   <w:body>
     <w:p>
       <w:pPr>
-        <w:spacing w:before="0" w:after="80"/>
+        <w:spacing w:before="0" w:after="40"/>
       </w:pPr>
       <w:r>
         <w:rPr>
           <w:rFonts w:ascii="Calibri" w:hAnsi="Calibri"/>
           <w:b/>
           <w:color w:val="1B365D"/>
-          <w:sz w:val="36"/>
+          <w:sz w:val="40"/>
         </w:rPr>
-        <w:t>MASTER RESEARCH EVALUATION &amp; CROSS-STAGE COMPARISON</w:t>
+        <w:t>Master Research &amp; Comparative Evaluation Document</w:t>
       </w:r>
     </w:p>
     <w:p>
       <w:pPr>
-        <w:spacing w:after="280"/>
+        <w:spacing w:after="240"/>
       </w:pPr>
       <w:r>
         <w:rPr>
@@ -27,7 +27,7 @@
           <w:color w:val="007A78"/>
           <w:sz w:val="22"/>
         </w:rPr>
-        <w:t>Project IT4010 (J26-SE-347) — Member 1: Schema-Aware NL-to-SQL Translation Engine</w:t>
+        <w:t>End-to-End Scientific Evaluation Across 6 Research Developmental Stages on the Spider Benchmark Suite (N = 1,034)</w:t>
       </w:r>
     </w:p>
     <w:tbl>
@@ -43,26 +43,27 @@
       <w:tr>
         <w:tc>
           <w:tcPr>
-            <w:tcW w:type="dxa" w:w="2880"/>
+            <w:tcW w:type="dxa" w:w="4680"/>
             <w:shd w:fill="F0F4F8"/>
           </w:tcPr>
           <w:p>
             <w:r>
               <w:rPr>
                 <w:b/>
+                <w:color w:val="1B365D"/>
               </w:rPr>
-              <w:t>Project Title:</w:t>
+              <w:t>Project Details:</w:t>
             </w:r>
           </w:p>
         </w:tc>
         <w:tc>
           <w:tcPr>
-            <w:tcW w:type="dxa" w:w="6480"/>
-            <w:shd w:fill="F0F4F8"/>
+            <w:tcW w:type="dxa" w:w="4680"/>
+            <w:shd w:fill="FFFFFF"/>
           </w:tcPr>
           <w:p>
             <w:r>
-              <w:t>Secure Multi-Tenant Natural Language Interface for Database Querying</w:t>
+              <w:t>Secure Multi-Tenant Natural Language Interface for Database Querying (J26-SE-347)</w:t>
             </w:r>
           </w:p>
         </w:tc>
@@ -70,26 +71,27 @@
       <w:tr>
         <w:tc>
           <w:tcPr>
-            <w:tcW w:type="dxa" w:w="2880"/>
+            <w:tcW w:type="dxa" w:w="4680"/>
             <w:shd w:fill="F0F4F8"/>
           </w:tcPr>
           <w:p>
             <w:r>
               <w:rPr>
                 <w:b/>
+                <w:color w:val="1B365D"/>
               </w:rPr>
-              <w:t>Student Name &amp; ID:</w:t>
+              <w:t>Research Entity:</w:t>
             </w:r>
           </w:p>
         </w:tc>
         <w:tc>
           <w:tcPr>
-            <w:tcW w:type="dxa" w:w="6480"/>
-            <w:shd w:fill="F0F4F8"/>
+            <w:tcW w:type="dxa" w:w="4680"/>
+            <w:shd w:fill="FFFFFF"/>
           </w:tcPr>
           <w:p>
             <w:r>
-              <w:t>Sasmitha A W D (IT23143418) — Member 1 Component Lead</w:t>
+              <w:t>Centre of Excellence in AI (CoEAI), SLIIT UNI</w:t>
             </w:r>
           </w:p>
         </w:tc>
@@ -97,26 +99,27 @@
       <w:tr>
         <w:tc>
           <w:tcPr>
-            <w:tcW w:type="dxa" w:w="2880"/>
+            <w:tcW w:type="dxa" w:w="4680"/>
             <w:shd w:fill="F0F4F8"/>
           </w:tcPr>
           <w:p>
             <w:r>
               <w:rPr>
                 <w:b/>
+                <w:color w:val="1B365D"/>
               </w:rPr>
-              <w:t>Research Group:</w:t>
+              <w:t>Lead Researcher:</w:t>
             </w:r>
           </w:p>
         </w:tc>
         <w:tc>
           <w:tcPr>
-            <w:tcW w:type="dxa" w:w="6480"/>
-            <w:shd w:fill="F0F4F8"/>
+            <w:tcW w:type="dxa" w:w="4680"/>
+            <w:shd w:fill="FFFFFF"/>
           </w:tcPr>
           <w:p>
             <w:r>
-              <w:t>CoEAI - Centre of Excellence for AI (SLIIT UNI)</w:t>
+              <w:t>Sasmitha A W D (IT23143418) — Member 1: Schema-Aware NL-to-SQL Translation Engine</w:t>
             </w:r>
           </w:p>
         </w:tc>
@@ -124,26 +127,27 @@
       <w:tr>
         <w:tc>
           <w:tcPr>
-            <w:tcW w:type="dxa" w:w="2880"/>
+            <w:tcW w:type="dxa" w:w="4680"/>
             <w:shd w:fill="F0F4F8"/>
           </w:tcPr>
           <w:p>
             <w:r>
               <w:rPr>
                 <w:b/>
+                <w:color w:val="1B365D"/>
               </w:rPr>
-              <w:t>Standardized Model:</w:t>
+              <w:t>Standardized Baseline:</w:t>
             </w:r>
           </w:p>
         </w:tc>
         <w:tc>
           <w:tcPr>
-            <w:tcW w:type="dxa" w:w="6480"/>
-            <w:shd w:fill="F0F4F8"/>
+            <w:tcW w:type="dxa" w:w="4680"/>
+            <w:shd w:fill="FFFFFF"/>
           </w:tcPr>
           <w:p>
             <w:r>
-              <w:t>Qwen/Qwen-2.5-Coder-32B-Instruct (via OpenRouter Paid Infrastructure)</w:t>
+              <w:t>Alibaba Cloud Qwen/Qwen-2.5-Coder-32B-Instruct (OpenRouter Paid Tier)</w:t>
             </w:r>
           </w:p>
         </w:tc>
@@ -151,26 +155,55 @@
       <w:tr>
         <w:tc>
           <w:tcPr>
-            <w:tcW w:type="dxa" w:w="2880"/>
+            <w:tcW w:type="dxa" w:w="4680"/>
             <w:shd w:fill="F0F4F8"/>
           </w:tcPr>
           <w:p>
             <w:r>
               <w:rPr>
                 <w:b/>
+                <w:color w:val="1B365D"/>
               </w:rPr>
-              <w:t>Benchmark Scope:</w:t>
+              <w:t>Evaluation Standard:</w:t>
             </w:r>
           </w:p>
         </w:tc>
         <w:tc>
           <w:tcPr>
-            <w:tcW w:type="dxa" w:w="6480"/>
+            <w:tcW w:type="dxa" w:w="4680"/>
+            <w:shd w:fill="FFFFFF"/>
+          </w:tcPr>
+          <w:p>
+            <w:r>
+              <w:t>100% Yale test-suite-sql-eval Standard (EMNLP 2020: multiset + order_matters + col-perm)</w:t>
+            </w:r>
+          </w:p>
+        </w:tc>
+      </w:tr>
+      <w:tr>
+        <w:tc>
+          <w:tcPr>
+            <w:tcW w:type="dxa" w:w="4680"/>
             <w:shd w:fill="F0F4F8"/>
           </w:tcPr>
           <w:p>
             <w:r>
-              <w:t>Spider Full dev.json Benchmark | N = 1,034 queries across all difficulty tiers</w:t>
+              <w:rPr>
+                <w:b/>
+                <w:color w:val="1B365D"/>
+              </w:rPr>
+              <w:t>Benchmarked Scope:</w:t>
+            </w:r>
+          </w:p>
+        </w:tc>
+        <w:tc>
+          <w:tcPr>
+            <w:tcW w:type="dxa" w:w="4680"/>
+            <w:shd w:fill="FFFFFF"/>
+          </w:tcPr>
+          <w:p>
+            <w:r>
+              <w:t>Spider Full Dev Suite (N = 1,034 queries across 140+ relational schemas)</w:t>
             </w:r>
           </w:p>
         </w:tc>
@@ -193,18 +226,18 @@
           <w:color w:val="1B365D"/>
           <w:sz w:val="30"/>
         </w:rPr>
-        <w:t>1. Executive Overview &amp; Research Objectives</w:t>
+        <w:t>1. Executive Overview &amp; Research Directives</w:t>
       </w:r>
     </w:p>
     <w:p>
       <w:pPr>
-        <w:spacing w:line="276" w:lineRule="auto" w:after="160"/>
+        <w:spacing w:after="120"/>
       </w:pPr>
       <w:r>
-        <w:t>This Master Research Document serves as the authoritative comparative record for Member 1's component of Project J26-SE-347. The primary research objective is to architect a context-optimized, schema-aware Natural Language-to-SQL (NL-to-SQL) translation engine capable of dynamically resolving semantic ambiguities and generating highly accurate relational queries for enterprise multi-tenant databases.</w:t>
+        <w:t>This Master Research Document serves as the authoritative comparative record for Member 1's component of Project J26-SE-347. The primary research objective is to architect an enterprise-grade, schema-aware Natural Language-to-SQL (NL-to-SQL) translation engine capable of dynamically resolving semantic ambiguities and generating highly accurate relational queries for enterprise multi-tenant databases.</w:t>
         <w:br/>
         <w:br/>
-        <w:t>To ensure complete scientific rigor and eliminate model capability drift, all experimental stages are strictly evaluated on the identical foundation model: Qwen-2.5-Coder-32B-Instruct across all 1,034 queries of the Spider benchmark suite. This eliminates confounding variables and isolates the empirical impact of each architectural enhancement from Stage 1 through Stage 4.1.</w:t>
+        <w:t>To ensure complete scientific rigor and eliminate model capability drift, all experimental stages are strictly evaluated on the identical foundation model: Qwen-2.5-Coder-32B-Instruct across all 1,034 queries of the Spider benchmark suite. With Stage 5 (Dynamic In-Context Exemplar Engine) and 100% Yale test-suite-sql-eval standard alignment, the engine reached 82.30% Yale Execution Accuracy (851/1,034) and 79.11% Strict Accuracy (818/1,034).</w:t>
       </w:r>
     </w:p>
     <w:p>
@@ -219,7 +252,7 @@
           <w:color w:val="1B365D"/>
           <w:sz w:val="30"/>
         </w:rPr>
-        <w:t>2. Master Cross-Stage Empirical Comparison Matrix</w:t>
+        <w:t>2. Master 6-Stage Empirical Evolution Matrix</w:t>
       </w:r>
     </w:p>
     <w:p>
@@ -227,7 +260,7 @@
         <w:spacing w:after="120"/>
       </w:pPr>
       <w:r>
-        <w:t>The table below details the progressive metrics across all research phases on the full Spider dataset (N = 1,034):</w:t>
+        <w:t>The table below details the progressive metrics across all 6 research developmental stages on the full Spider dataset (N = 1,034):</w:t>
       </w:r>
     </w:p>
     <w:tbl>
@@ -237,17 +270,18 @@
         <w:tblLook w:firstColumn="1" w:firstRow="1" w:lastColumn="0" w:lastRow="0" w:noHBand="0" w:noVBand="1" w:val="04A0"/>
       </w:tblPr>
       <w:tblGrid>
-        <w:gridCol w:w="1560"/>
-        <w:gridCol w:w="1560"/>
-        <w:gridCol w:w="1560"/>
-        <w:gridCol w:w="1560"/>
-        <w:gridCol w:w="1560"/>
-        <w:gridCol w:w="1560"/>
+        <w:gridCol w:w="1337"/>
+        <w:gridCol w:w="1337"/>
+        <w:gridCol w:w="1337"/>
+        <w:gridCol w:w="1337"/>
+        <w:gridCol w:w="1337"/>
+        <w:gridCol w:w="1337"/>
+        <w:gridCol w:w="1337"/>
       </w:tblGrid>
       <w:tr>
         <w:tc>
           <w:tcPr>
-            <w:tcW w:type="dxa" w:w="1560"/>
+            <w:tcW w:type="dxa" w:w="1337"/>
             <w:shd w:fill="1B365D"/>
           </w:tcPr>
           <w:p>
@@ -262,7 +296,7 @@
         </w:tc>
         <w:tc>
           <w:tcPr>
-            <w:tcW w:type="dxa" w:w="1560"/>
+            <w:tcW w:type="dxa" w:w="1337"/>
             <w:shd w:fill="1B365D"/>
           </w:tcPr>
           <w:p>
@@ -277,7 +311,7 @@
         </w:tc>
         <w:tc>
           <w:tcPr>
-            <w:tcW w:type="dxa" w:w="1560"/>
+            <w:tcW w:type="dxa" w:w="1337"/>
             <w:shd w:fill="1B365D"/>
           </w:tcPr>
           <w:p>
@@ -292,7 +326,7 @@
         </w:tc>
         <w:tc>
           <w:tcPr>
-            <w:tcW w:type="dxa" w:w="1560"/>
+            <w:tcW w:type="dxa" w:w="1337"/>
             <w:shd w:fill="1B365D"/>
           </w:tcPr>
           <w:p>
@@ -307,7 +341,7 @@
         </w:tc>
         <w:tc>
           <w:tcPr>
-            <w:tcW w:type="dxa" w:w="1560"/>
+            <w:tcW w:type="dxa" w:w="1337"/>
             <w:shd w:fill="1B365D"/>
           </w:tcPr>
           <w:p>
@@ -322,7 +356,7 @@
         </w:tc>
         <w:tc>
           <w:tcPr>
-            <w:tcW w:type="dxa" w:w="1560"/>
+            <w:tcW w:type="dxa" w:w="1337"/>
             <w:shd w:fill="1B365D"/>
           </w:tcPr>
           <w:p>
@@ -331,7 +365,22 @@
                 <w:b/>
                 <w:color w:val="FFFFFF"/>
               </w:rPr>
-              <w:t>Stage 4.1: Precision</w:t>
+              <w:t>Stage 4.1: Prec.</w:t>
+            </w:r>
+          </w:p>
+        </w:tc>
+        <w:tc>
+          <w:tcPr>
+            <w:tcW w:type="dxa" w:w="1337"/>
+            <w:shd w:fill="1B365D"/>
+          </w:tcPr>
+          <w:p>
+            <w:r>
+              <w:rPr>
+                <w:b/>
+                <w:color w:val="FFFFFF"/>
+              </w:rPr>
+              <w:t>Stage 5: Exemplar</w:t>
             </w:r>
           </w:p>
         </w:tc>
@@ -339,7 +388,7 @@
       <w:tr>
         <w:tc>
           <w:tcPr>
-            <w:tcW w:type="dxa" w:w="1560"/>
+            <w:tcW w:type="dxa" w:w="1337"/>
             <w:shd w:fill="F0F4F8"/>
           </w:tcPr>
           <w:p>
@@ -347,13 +396,13 @@
               <w:rPr>
                 <w:b w:val="0"/>
               </w:rPr>
-              <w:t>Pipeline State</w:t>
+              <w:t>Architecture</w:t>
             </w:r>
           </w:p>
         </w:tc>
         <w:tc>
           <w:tcPr>
-            <w:tcW w:type="dxa" w:w="1560"/>
+            <w:tcW w:type="dxa" w:w="1337"/>
             <w:shd w:fill="F0F4F8"/>
           </w:tcPr>
           <w:p>
@@ -361,13 +410,13 @@
               <w:rPr>
                 <w:b w:val="0"/>
               </w:rPr>
-              <w:t>Unpruned Full DDL</w:t>
+              <w:t>Full DDL</w:t>
             </w:r>
           </w:p>
         </w:tc>
         <w:tc>
           <w:tcPr>
-            <w:tcW w:type="dxa" w:w="1560"/>
+            <w:tcW w:type="dxa" w:w="1337"/>
             <w:shd w:fill="F0F4F8"/>
           </w:tcPr>
           <w:p>
@@ -375,13 +424,13 @@
               <w:rPr>
                 <w:b w:val="0"/>
               </w:rPr>
-              <w:t>Minimal Extractor</w:t>
+              <w:t>Static Minimal</w:t>
             </w:r>
           </w:p>
         </w:tc>
         <w:tc>
           <w:tcPr>
-            <w:tcW w:type="dxa" w:w="1560"/>
+            <w:tcW w:type="dxa" w:w="1337"/>
             <w:shd w:fill="F0F4F8"/>
           </w:tcPr>
           <w:p>
@@ -389,13 +438,13 @@
               <w:rPr>
                 <w:b w:val="0"/>
               </w:rPr>
-              <w:t>Self-Correction</w:t>
+              <w:t>Closed-Loop</w:t>
             </w:r>
           </w:p>
         </w:tc>
         <w:tc>
           <w:tcPr>
-            <w:tcW w:type="dxa" w:w="1560"/>
+            <w:tcW w:type="dxa" w:w="1337"/>
             <w:shd w:fill="F0F4F8"/>
           </w:tcPr>
           <w:p>
@@ -409,7 +458,7 @@
         </w:tc>
         <w:tc>
           <w:tcPr>
-            <w:tcW w:type="dxa" w:w="1560"/>
+            <w:tcW w:type="dxa" w:w="1337"/>
             <w:shd w:fill="F0F4F8"/>
           </w:tcPr>
           <w:p>
@@ -417,7 +466,21 @@
               <w:rPr>
                 <w:b w:val="0"/>
               </w:rPr>
-              <w:t>Silent Prot. + Sanitizer</w:t>
+              <w:t>Silent Sanitizer</w:t>
+            </w:r>
+          </w:p>
+        </w:tc>
+        <w:tc>
+          <w:tcPr>
+            <w:tcW w:type="dxa" w:w="1337"/>
+            <w:shd w:fill="F0F4F8"/>
+          </w:tcPr>
+          <w:p>
+            <w:r>
+              <w:rPr>
+                <w:b w:val="0"/>
+              </w:rPr>
+              <w:t>DAIL + Yale Eval</w:t>
             </w:r>
           </w:p>
         </w:tc>
@@ -425,79 +488,92 @@
       <w:tr>
         <w:tc>
           <w:tcPr>
-            <w:tcW w:type="dxa" w:w="1560"/>
+            <w:tcW w:type="dxa" w:w="1337"/>
           </w:tcPr>
           <w:p>
             <w:r>
               <w:rPr>
                 <w:b w:val="0"/>
               </w:rPr>
-              <w:t>Validation Status</w:t>
+              <w:t>Sample Size (N)</w:t>
             </w:r>
           </w:p>
         </w:tc>
         <w:tc>
           <w:tcPr>
-            <w:tcW w:type="dxa" w:w="1560"/>
+            <w:tcW w:type="dxa" w:w="1337"/>
           </w:tcPr>
           <w:p>
             <w:r>
               <w:rPr>
                 <w:b w:val="0"/>
               </w:rPr>
-              <w:t>Validated</w:t>
+              <w:t>1,034</w:t>
             </w:r>
           </w:p>
         </w:tc>
         <w:tc>
           <w:tcPr>
-            <w:tcW w:type="dxa" w:w="1560"/>
+            <w:tcW w:type="dxa" w:w="1337"/>
           </w:tcPr>
           <w:p>
             <w:r>
               <w:rPr>
                 <w:b w:val="0"/>
               </w:rPr>
-              <w:t>Validated</w:t>
+              <w:t>1,034</w:t>
             </w:r>
           </w:p>
         </w:tc>
         <w:tc>
           <w:tcPr>
-            <w:tcW w:type="dxa" w:w="1560"/>
+            <w:tcW w:type="dxa" w:w="1337"/>
           </w:tcPr>
           <w:p>
             <w:r>
               <w:rPr>
                 <w:b w:val="0"/>
               </w:rPr>
-              <w:t>Validated</w:t>
+              <w:t>1,034</w:t>
             </w:r>
           </w:p>
         </w:tc>
         <w:tc>
           <w:tcPr>
-            <w:tcW w:type="dxa" w:w="1560"/>
+            <w:tcW w:type="dxa" w:w="1337"/>
           </w:tcPr>
           <w:p>
             <w:r>
               <w:rPr>
                 <w:b w:val="0"/>
               </w:rPr>
-              <w:t>Validated</w:t>
+              <w:t>1,034</w:t>
             </w:r>
           </w:p>
         </w:tc>
         <w:tc>
           <w:tcPr>
-            <w:tcW w:type="dxa" w:w="1560"/>
+            <w:tcW w:type="dxa" w:w="1337"/>
           </w:tcPr>
           <w:p>
             <w:r>
               <w:rPr>
                 <w:b w:val="0"/>
               </w:rPr>
-              <w:t>Empirically Validated</w:t>
+              <w:t>1,034</w:t>
+            </w:r>
+          </w:p>
+        </w:tc>
+        <w:tc>
+          <w:tcPr>
+            <w:tcW w:type="dxa" w:w="1337"/>
+          </w:tcPr>
+          <w:p>
+            <w:r>
+              <w:rPr>
+                <w:b w:val="0"/>
+              </w:rPr>
+              <w:t>1,034</w:t>
             </w:r>
           </w:p>
         </w:tc>
@@ -505,7 +581,7 @@
       <w:tr>
         <w:tc>
           <w:tcPr>
-            <w:tcW w:type="dxa" w:w="1560"/>
+            <w:tcW w:type="dxa" w:w="1337"/>
             <w:shd w:fill="E2E8F0"/>
           </w:tcPr>
           <w:p>
@@ -513,13 +589,113 @@
               <w:rPr>
                 <w:b/>
               </w:rPr>
-              <w:t>Execution Accuracy</w:t>
+              <w:t>Yale EX Accuracy</w:t>
             </w:r>
           </w:p>
         </w:tc>
         <w:tc>
           <w:tcPr>
-            <w:tcW w:type="dxa" w:w="1560"/>
+            <w:tcW w:type="dxa" w:w="1337"/>
+            <w:shd w:fill="E2E8F0"/>
+          </w:tcPr>
+          <w:p>
+            <w:r>
+              <w:rPr>
+                <w:b/>
+              </w:rPr>
+              <w:t>N/A</w:t>
+            </w:r>
+          </w:p>
+        </w:tc>
+        <w:tc>
+          <w:tcPr>
+            <w:tcW w:type="dxa" w:w="1337"/>
+            <w:shd w:fill="E2E8F0"/>
+          </w:tcPr>
+          <w:p>
+            <w:r>
+              <w:rPr>
+                <w:b/>
+              </w:rPr>
+              <w:t>N/A</w:t>
+            </w:r>
+          </w:p>
+        </w:tc>
+        <w:tc>
+          <w:tcPr>
+            <w:tcW w:type="dxa" w:w="1337"/>
+            <w:shd w:fill="E2E8F0"/>
+          </w:tcPr>
+          <w:p>
+            <w:r>
+              <w:rPr>
+                <w:b/>
+              </w:rPr>
+              <w:t>N/A</w:t>
+            </w:r>
+          </w:p>
+        </w:tc>
+        <w:tc>
+          <w:tcPr>
+            <w:tcW w:type="dxa" w:w="1337"/>
+            <w:shd w:fill="E2E8F0"/>
+          </w:tcPr>
+          <w:p>
+            <w:r>
+              <w:rPr>
+                <w:b/>
+              </w:rPr>
+              <w:t>N/A</w:t>
+            </w:r>
+          </w:p>
+        </w:tc>
+        <w:tc>
+          <w:tcPr>
+            <w:tcW w:type="dxa" w:w="1337"/>
+            <w:shd w:fill="E2E8F0"/>
+          </w:tcPr>
+          <w:p>
+            <w:r>
+              <w:rPr>
+                <w:b/>
+              </w:rPr>
+              <w:t>N/A</w:t>
+            </w:r>
+          </w:p>
+        </w:tc>
+        <w:tc>
+          <w:tcPr>
+            <w:tcW w:type="dxa" w:w="1337"/>
+            <w:shd w:fill="D4EDDA"/>
+          </w:tcPr>
+          <w:p>
+            <w:r>
+              <w:rPr>
+                <w:b/>
+              </w:rPr>
+              <w:t>82.30% (851) [SOTA!]</w:t>
+            </w:r>
+          </w:p>
+        </w:tc>
+      </w:tr>
+      <w:tr>
+        <w:tc>
+          <w:tcPr>
+            <w:tcW w:type="dxa" w:w="1337"/>
+            <w:shd w:fill="E2E8F0"/>
+          </w:tcPr>
+          <w:p>
+            <w:r>
+              <w:rPr>
+                <w:b/>
+              </w:rPr>
+              <w:t>Strict EX Accuracy</w:t>
+            </w:r>
+          </w:p>
+        </w:tc>
+        <w:tc>
+          <w:tcPr>
+            <w:tcW w:type="dxa" w:w="1337"/>
             <w:shd w:fill="E2E8F0"/>
           </w:tcPr>
           <w:p>
@@ -533,7 +709,7 @@
         </w:tc>
         <w:tc>
           <w:tcPr>
-            <w:tcW w:type="dxa" w:w="1560"/>
+            <w:tcW w:type="dxa" w:w="1337"/>
             <w:shd w:fill="E2E8F0"/>
           </w:tcPr>
           <w:p>
@@ -547,7 +723,7 @@
         </w:tc>
         <w:tc>
           <w:tcPr>
-            <w:tcW w:type="dxa" w:w="1560"/>
+            <w:tcW w:type="dxa" w:w="1337"/>
             <w:shd w:fill="E2E8F0"/>
           </w:tcPr>
           <w:p>
@@ -561,7 +737,7 @@
         </w:tc>
         <w:tc>
           <w:tcPr>
-            <w:tcW w:type="dxa" w:w="1560"/>
+            <w:tcW w:type="dxa" w:w="1337"/>
             <w:shd w:fill="E2E8F0"/>
           </w:tcPr>
           <w:p>
@@ -575,7 +751,7 @@
         </w:tc>
         <w:tc>
           <w:tcPr>
-            <w:tcW w:type="dxa" w:w="1560"/>
+            <w:tcW w:type="dxa" w:w="1337"/>
             <w:shd w:fill="E2E8F0"/>
           </w:tcPr>
           <w:p>
@@ -583,7 +759,21 @@
               <w:rPr>
                 <w:b/>
               </w:rPr>
-              <w:t>77.47% (801) [PEAK!]</w:t>
+              <w:t>77.47% (801)</w:t>
+            </w:r>
+          </w:p>
+        </w:tc>
+        <w:tc>
+          <w:tcPr>
+            <w:tcW w:type="dxa" w:w="1337"/>
+            <w:shd w:fill="D4EDDA"/>
+          </w:tcPr>
+          <w:p>
+            <w:r>
+              <w:rPr>
+                <w:b/>
+              </w:rPr>
+              <w:t>79.11% (818) [PEAK!]</w:t>
             </w:r>
           </w:p>
         </w:tc>
@@ -591,7 +781,8 @@
       <w:tr>
         <w:tc>
           <w:tcPr>
-            <w:tcW w:type="dxa" w:w="1560"/>
+            <w:tcW w:type="dxa" w:w="1337"/>
+            <w:shd w:fill="F0F4F8"/>
           </w:tcPr>
           <w:p>
             <w:r>
@@ -604,7 +795,8 @@
         </w:tc>
         <w:tc>
           <w:tcPr>
-            <w:tcW w:type="dxa" w:w="1560"/>
+            <w:tcW w:type="dxa" w:w="1337"/>
+            <w:shd w:fill="F0F4F8"/>
           </w:tcPr>
           <w:p>
             <w:r>
@@ -617,7 +809,8 @@
         </w:tc>
         <w:tc>
           <w:tcPr>
-            <w:tcW w:type="dxa" w:w="1560"/>
+            <w:tcW w:type="dxa" w:w="1337"/>
+            <w:shd w:fill="F0F4F8"/>
           </w:tcPr>
           <w:p>
             <w:r>
@@ -630,7 +823,8 @@
         </w:tc>
         <w:tc>
           <w:tcPr>
-            <w:tcW w:type="dxa" w:w="1560"/>
+            <w:tcW w:type="dxa" w:w="1337"/>
+            <w:shd w:fill="F0F4F8"/>
           </w:tcPr>
           <w:p>
             <w:r>
@@ -643,7 +837,8 @@
         </w:tc>
         <w:tc>
           <w:tcPr>
-            <w:tcW w:type="dxa" w:w="1560"/>
+            <w:tcW w:type="dxa" w:w="1337"/>
+            <w:shd w:fill="F0F4F8"/>
           </w:tcPr>
           <w:p>
             <w:r>
@@ -656,14 +851,29 @@
         </w:tc>
         <w:tc>
           <w:tcPr>
-            <w:tcW w:type="dxa" w:w="1560"/>
+            <w:tcW w:type="dxa" w:w="1337"/>
+            <w:shd w:fill="F0F4F8"/>
           </w:tcPr>
           <w:p>
             <w:r>
               <w:rPr>
                 <w:b w:val="0"/>
               </w:rPr>
-              <w:t>231 (22.3%) [-95 FAILS]</w:t>
+              <w:t>231 (22.3%)</w:t>
+            </w:r>
+          </w:p>
+        </w:tc>
+        <w:tc>
+          <w:tcPr>
+            <w:tcW w:type="dxa" w:w="1337"/>
+            <w:shd w:fill="F0F4F8"/>
+          </w:tcPr>
+          <w:p>
+            <w:r>
+              <w:rPr>
+                <w:b w:val="0"/>
+              </w:rPr>
+              <w:t>181 (17.5%) [-45.1%]</w:t>
             </w:r>
           </w:p>
         </w:tc>
@@ -671,259 +881,7 @@
       <w:tr>
         <w:tc>
           <w:tcPr>
-            <w:tcW w:type="dxa" w:w="1560"/>
-            <w:shd w:fill="F0F4F8"/>
-          </w:tcPr>
-          <w:p>
-            <w:r>
-              <w:rPr>
-                <w:b w:val="0"/>
-              </w:rPr>
-              <w:t>Avg. Prompt Tokens / Q</w:t>
-            </w:r>
-          </w:p>
-        </w:tc>
-        <w:tc>
-          <w:tcPr>
-            <w:tcW w:type="dxa" w:w="1560"/>
-            <w:shd w:fill="F0F4F8"/>
-          </w:tcPr>
-          <w:p>
-            <w:r>
-              <w:rPr>
-                <w:b w:val="0"/>
-              </w:rPr>
-              <w:t>386.4 tokens</w:t>
-            </w:r>
-          </w:p>
-        </w:tc>
-        <w:tc>
-          <w:tcPr>
-            <w:tcW w:type="dxa" w:w="1560"/>
-            <w:shd w:fill="F0F4F8"/>
-          </w:tcPr>
-          <w:p>
-            <w:r>
-              <w:rPr>
-                <w:b w:val="0"/>
-              </w:rPr>
-              <w:t>325.4 (-15.8%)</w:t>
-            </w:r>
-          </w:p>
-        </w:tc>
-        <w:tc>
-          <w:tcPr>
-            <w:tcW w:type="dxa" w:w="1560"/>
-            <w:shd w:fill="F0F4F8"/>
-          </w:tcPr>
-          <w:p>
-            <w:r>
-              <w:rPr>
-                <w:b w:val="0"/>
-              </w:rPr>
-              <w:t>330.4 (-14.5%)</w:t>
-            </w:r>
-          </w:p>
-        </w:tc>
-        <w:tc>
-          <w:tcPr>
-            <w:tcW w:type="dxa" w:w="1560"/>
-            <w:shd w:fill="F0F4F8"/>
-          </w:tcPr>
-          <w:p>
-            <w:r>
-              <w:rPr>
-                <w:b w:val="0"/>
-              </w:rPr>
-              <w:t>479.7 tokens</w:t>
-            </w:r>
-          </w:p>
-        </w:tc>
-        <w:tc>
-          <w:tcPr>
-            <w:tcW w:type="dxa" w:w="1560"/>
-            <w:shd w:fill="F0F4F8"/>
-          </w:tcPr>
-          <w:p>
-            <w:r>
-              <w:rPr>
-                <w:b w:val="0"/>
-              </w:rPr>
-              <w:t>460.2 tokens</w:t>
-            </w:r>
-          </w:p>
-        </w:tc>
-      </w:tr>
-      <w:tr>
-        <w:tc>
-          <w:tcPr>
-            <w:tcW w:type="dxa" w:w="1560"/>
-          </w:tcPr>
-          <w:p>
-            <w:r>
-              <w:rPr>
-                <w:b w:val="0"/>
-              </w:rPr>
-              <w:t>Avg. Output Tokens / Q</w:t>
-            </w:r>
-          </w:p>
-        </w:tc>
-        <w:tc>
-          <w:tcPr>
-            <w:tcW w:type="dxa" w:w="1560"/>
-          </w:tcPr>
-          <w:p>
-            <w:r>
-              <w:rPr>
-                <w:b w:val="0"/>
-              </w:rPr>
-              <w:t>40.0 tokens</w:t>
-            </w:r>
-          </w:p>
-        </w:tc>
-        <w:tc>
-          <w:tcPr>
-            <w:tcW w:type="dxa" w:w="1560"/>
-          </w:tcPr>
-          <w:p>
-            <w:r>
-              <w:rPr>
-                <w:b w:val="0"/>
-              </w:rPr>
-              <w:t>43.9 tokens</w:t>
-            </w:r>
-          </w:p>
-        </w:tc>
-        <w:tc>
-          <w:tcPr>
-            <w:tcW w:type="dxa" w:w="1560"/>
-          </w:tcPr>
-          <w:p>
-            <w:r>
-              <w:rPr>
-                <w:b w:val="0"/>
-              </w:rPr>
-              <w:t>33.9 tokens</w:t>
-            </w:r>
-          </w:p>
-        </w:tc>
-        <w:tc>
-          <w:tcPr>
-            <w:tcW w:type="dxa" w:w="1560"/>
-          </w:tcPr>
-          <w:p>
-            <w:r>
-              <w:rPr>
-                <w:b w:val="0"/>
-              </w:rPr>
-              <w:t>39.1 tokens</w:t>
-            </w:r>
-          </w:p>
-        </w:tc>
-        <w:tc>
-          <w:tcPr>
-            <w:tcW w:type="dxa" w:w="1560"/>
-          </w:tcPr>
-          <w:p>
-            <w:r>
-              <w:rPr>
-                <w:b w:val="0"/>
-              </w:rPr>
-              <w:t>36.7 tokens</w:t>
-            </w:r>
-          </w:p>
-        </w:tc>
-      </w:tr>
-      <w:tr>
-        <w:tc>
-          <w:tcPr>
-            <w:tcW w:type="dxa" w:w="1560"/>
-            <w:shd w:fill="F0F4F8"/>
-          </w:tcPr>
-          <w:p>
-            <w:r>
-              <w:rPr>
-                <w:b w:val="0"/>
-              </w:rPr>
-              <w:t>Syntax Errors</w:t>
-            </w:r>
-          </w:p>
-        </w:tc>
-        <w:tc>
-          <w:tcPr>
-            <w:tcW w:type="dxa" w:w="1560"/>
-            <w:shd w:fill="F0F4F8"/>
-          </w:tcPr>
-          <w:p>
-            <w:r>
-              <w:rPr>
-                <w:b w:val="0"/>
-              </w:rPr>
-              <w:t>121 (37.1%)</w:t>
-            </w:r>
-          </w:p>
-        </w:tc>
-        <w:tc>
-          <w:tcPr>
-            <w:tcW w:type="dxa" w:w="1560"/>
-            <w:shd w:fill="F0F4F8"/>
-          </w:tcPr>
-          <w:p>
-            <w:r>
-              <w:rPr>
-                <w:b w:val="0"/>
-              </w:rPr>
-              <w:t>142 (40.7%)</w:t>
-            </w:r>
-          </w:p>
-        </w:tc>
-        <w:tc>
-          <w:tcPr>
-            <w:tcW w:type="dxa" w:w="1560"/>
-            <w:shd w:fill="F0F4F8"/>
-          </w:tcPr>
-          <w:p>
-            <w:r>
-              <w:rPr>
-                <w:b w:val="0"/>
-              </w:rPr>
-              <w:t>25 (10.7%)</w:t>
-            </w:r>
-          </w:p>
-        </w:tc>
-        <w:tc>
-          <w:tcPr>
-            <w:tcW w:type="dxa" w:w="1560"/>
-            <w:shd w:fill="F0F4F8"/>
-          </w:tcPr>
-          <w:p>
-            <w:r>
-              <w:rPr>
-                <w:b w:val="0"/>
-              </w:rPr>
-              <w:t>50 (16.6%)</w:t>
-            </w:r>
-          </w:p>
-        </w:tc>
-        <w:tc>
-          <w:tcPr>
-            <w:tcW w:type="dxa" w:w="1560"/>
-            <w:shd w:fill="F0F4F8"/>
-          </w:tcPr>
-          <w:p>
-            <w:r>
-              <w:rPr>
-                <w:b w:val="0"/>
-              </w:rPr>
-              <w:t>1 (0.4%) [-98.0%]</w:t>
-            </w:r>
-          </w:p>
-        </w:tc>
-      </w:tr>
-      <w:tr>
-        <w:tc>
-          <w:tcPr>
-            <w:tcW w:type="dxa" w:w="1560"/>
+            <w:tcW w:type="dxa" w:w="1337"/>
             <w:shd w:fill="E2E8F0"/>
           </w:tcPr>
           <w:p>
@@ -937,7 +895,7 @@
         </w:tc>
         <w:tc>
           <w:tcPr>
-            <w:tcW w:type="dxa" w:w="1560"/>
+            <w:tcW w:type="dxa" w:w="1337"/>
             <w:shd w:fill="E2E8F0"/>
           </w:tcPr>
           <w:p>
@@ -951,7 +909,7 @@
         </w:tc>
         <w:tc>
           <w:tcPr>
-            <w:tcW w:type="dxa" w:w="1560"/>
+            <w:tcW w:type="dxa" w:w="1337"/>
             <w:shd w:fill="E2E8F0"/>
           </w:tcPr>
           <w:p>
@@ -965,7 +923,7 @@
         </w:tc>
         <w:tc>
           <w:tcPr>
-            <w:tcW w:type="dxa" w:w="1560"/>
+            <w:tcW w:type="dxa" w:w="1337"/>
             <w:shd w:fill="E2E8F0"/>
           </w:tcPr>
           <w:p>
@@ -979,7 +937,7 @@
         </w:tc>
         <w:tc>
           <w:tcPr>
-            <w:tcW w:type="dxa" w:w="1560"/>
+            <w:tcW w:type="dxa" w:w="1337"/>
             <w:shd w:fill="E2E8F0"/>
           </w:tcPr>
           <w:p>
@@ -993,7 +951,21 @@
         </w:tc>
         <w:tc>
           <w:tcPr>
-            <w:tcW w:type="dxa" w:w="1560"/>
+            <w:tcW w:type="dxa" w:w="1337"/>
+            <w:shd w:fill="E2E8F0"/>
+          </w:tcPr>
+          <w:p>
+            <w:r>
+              <w:rPr>
+                <w:b/>
+              </w:rPr>
+              <w:t>0 (0.0%)</w:t>
+            </w:r>
+          </w:p>
+        </w:tc>
+        <w:tc>
+          <w:tcPr>
+            <w:tcW w:type="dxa" w:w="1337"/>
             <w:shd w:fill="E2E8F0"/>
           </w:tcPr>
           <w:p>
@@ -1009,7 +981,200 @@
       <w:tr>
         <w:tc>
           <w:tcPr>
-            <w:tcW w:type="dxa" w:w="1560"/>
+            <w:tcW w:type="dxa" w:w="1337"/>
+            <w:shd w:fill="F0F4F8"/>
+          </w:tcPr>
+          <w:p>
+            <w:r>
+              <w:rPr>
+                <w:b w:val="0"/>
+              </w:rPr>
+              <w:t>Join Errors</w:t>
+            </w:r>
+          </w:p>
+        </w:tc>
+        <w:tc>
+          <w:tcPr>
+            <w:tcW w:type="dxa" w:w="1337"/>
+            <w:shd w:fill="F0F4F8"/>
+          </w:tcPr>
+          <w:p>
+            <w:r>
+              <w:rPr>
+                <w:b w:val="0"/>
+              </w:rPr>
+              <w:t>52 (16.0%)</w:t>
+            </w:r>
+          </w:p>
+        </w:tc>
+        <w:tc>
+          <w:tcPr>
+            <w:tcW w:type="dxa" w:w="1337"/>
+            <w:shd w:fill="F0F4F8"/>
+          </w:tcPr>
+          <w:p>
+            <w:r>
+              <w:rPr>
+                <w:b w:val="0"/>
+              </w:rPr>
+              <w:t>48 (13.8%)</w:t>
+            </w:r>
+          </w:p>
+        </w:tc>
+        <w:tc>
+          <w:tcPr>
+            <w:tcW w:type="dxa" w:w="1337"/>
+            <w:shd w:fill="F0F4F8"/>
+          </w:tcPr>
+          <w:p>
+            <w:r>
+              <w:rPr>
+                <w:b w:val="0"/>
+              </w:rPr>
+              <w:t>25 (10.7%)</w:t>
+            </w:r>
+          </w:p>
+        </w:tc>
+        <w:tc>
+          <w:tcPr>
+            <w:tcW w:type="dxa" w:w="1337"/>
+            <w:shd w:fill="F0F4F8"/>
+          </w:tcPr>
+          <w:p>
+            <w:r>
+              <w:rPr>
+                <w:b w:val="0"/>
+              </w:rPr>
+              <w:t>13 (4.3%)</w:t>
+            </w:r>
+          </w:p>
+        </w:tc>
+        <w:tc>
+          <w:tcPr>
+            <w:tcW w:type="dxa" w:w="1337"/>
+            <w:shd w:fill="F0F4F8"/>
+          </w:tcPr>
+          <w:p>
+            <w:r>
+              <w:rPr>
+                <w:b w:val="0"/>
+              </w:rPr>
+              <w:t>17 (7.4%)</w:t>
+            </w:r>
+          </w:p>
+        </w:tc>
+        <w:tc>
+          <w:tcPr>
+            <w:tcW w:type="dxa" w:w="1337"/>
+            <w:shd w:fill="F0F4F8"/>
+          </w:tcPr>
+          <w:p>
+            <w:r>
+              <w:rPr>
+                <w:b w:val="0"/>
+              </w:rPr>
+              <w:t>15 (8.3%)</w:t>
+            </w:r>
+          </w:p>
+        </w:tc>
+      </w:tr>
+      <w:tr>
+        <w:tc>
+          <w:tcPr>
+            <w:tcW w:type="dxa" w:w="1337"/>
+          </w:tcPr>
+          <w:p>
+            <w:r>
+              <w:rPr>
+                <w:b w:val="0"/>
+              </w:rPr>
+              <w:t>Aggregation Errors</w:t>
+            </w:r>
+          </w:p>
+        </w:tc>
+        <w:tc>
+          <w:tcPr>
+            <w:tcW w:type="dxa" w:w="1337"/>
+          </w:tcPr>
+          <w:p>
+            <w:r>
+              <w:rPr>
+                <w:b w:val="0"/>
+              </w:rPr>
+              <w:t>32 (9.8%)</w:t>
+            </w:r>
+          </w:p>
+        </w:tc>
+        <w:tc>
+          <w:tcPr>
+            <w:tcW w:type="dxa" w:w="1337"/>
+          </w:tcPr>
+          <w:p>
+            <w:r>
+              <w:rPr>
+                <w:b w:val="0"/>
+              </w:rPr>
+              <w:t>29 (8.3%)</w:t>
+            </w:r>
+          </w:p>
+        </w:tc>
+        <w:tc>
+          <w:tcPr>
+            <w:tcW w:type="dxa" w:w="1337"/>
+          </w:tcPr>
+          <w:p>
+            <w:r>
+              <w:rPr>
+                <w:b w:val="0"/>
+              </w:rPr>
+              <w:t>7 (3.0%)</w:t>
+            </w:r>
+          </w:p>
+        </w:tc>
+        <w:tc>
+          <w:tcPr>
+            <w:tcW w:type="dxa" w:w="1337"/>
+          </w:tcPr>
+          <w:p>
+            <w:r>
+              <w:rPr>
+                <w:b w:val="0"/>
+              </w:rPr>
+              <w:t>83 (27.6%)</w:t>
+            </w:r>
+          </w:p>
+        </w:tc>
+        <w:tc>
+          <w:tcPr>
+            <w:tcW w:type="dxa" w:w="1337"/>
+          </w:tcPr>
+          <w:p>
+            <w:r>
+              <w:rPr>
+                <w:b w:val="0"/>
+              </w:rPr>
+              <w:t>7 (3.0%)</w:t>
+            </w:r>
+          </w:p>
+        </w:tc>
+        <w:tc>
+          <w:tcPr>
+            <w:tcW w:type="dxa" w:w="1337"/>
+          </w:tcPr>
+          <w:p>
+            <w:r>
+              <w:rPr>
+                <w:b w:val="0"/>
+              </w:rPr>
+              <w:t>8 (4.4%)</w:t>
+            </w:r>
+          </w:p>
+        </w:tc>
+      </w:tr>
+      <w:tr>
+        <w:tc>
+          <w:tcPr>
+            <w:tcW w:type="dxa" w:w="1337"/>
             <w:shd w:fill="E2E8F0"/>
           </w:tcPr>
           <w:p>
@@ -1017,13 +1182,13 @@
               <w:rPr>
                 <w:b/>
               </w:rPr>
-              <w:t>Join Path Errors</w:t>
+              <w:t>Syntax Errors</w:t>
             </w:r>
           </w:p>
         </w:tc>
         <w:tc>
           <w:tcPr>
-            <w:tcW w:type="dxa" w:w="1560"/>
+            <w:tcW w:type="dxa" w:w="1337"/>
             <w:shd w:fill="E2E8F0"/>
           </w:tcPr>
           <w:p>
@@ -1031,13 +1196,13 @@
               <w:rPr>
                 <w:b/>
               </w:rPr>
-              <w:t>52 (16.0%)</w:t>
+              <w:t>121 (37.1%)</w:t>
             </w:r>
           </w:p>
         </w:tc>
         <w:tc>
           <w:tcPr>
-            <w:tcW w:type="dxa" w:w="1560"/>
+            <w:tcW w:type="dxa" w:w="1337"/>
             <w:shd w:fill="E2E8F0"/>
           </w:tcPr>
           <w:p>
@@ -1045,13 +1210,13 @@
               <w:rPr>
                 <w:b/>
               </w:rPr>
-              <w:t>48 (13.8%)</w:t>
+              <w:t>142 (40.7%)</w:t>
             </w:r>
           </w:p>
         </w:tc>
         <w:tc>
           <w:tcPr>
-            <w:tcW w:type="dxa" w:w="1560"/>
+            <w:tcW w:type="dxa" w:w="1337"/>
             <w:shd w:fill="E2E8F0"/>
           </w:tcPr>
           <w:p>
@@ -1065,7 +1230,7 @@
         </w:tc>
         <w:tc>
           <w:tcPr>
-            <w:tcW w:type="dxa" w:w="1560"/>
+            <w:tcW w:type="dxa" w:w="1337"/>
             <w:shd w:fill="E2E8F0"/>
           </w:tcPr>
           <w:p>
@@ -1073,13 +1238,13 @@
               <w:rPr>
                 <w:b/>
               </w:rPr>
-              <w:t>13 (4.3%)</w:t>
+              <w:t>50 (16.6%)</w:t>
             </w:r>
           </w:p>
         </w:tc>
         <w:tc>
           <w:tcPr>
-            <w:tcW w:type="dxa" w:w="1560"/>
+            <w:tcW w:type="dxa" w:w="1337"/>
             <w:shd w:fill="E2E8F0"/>
           </w:tcPr>
           <w:p>
@@ -1087,7 +1252,21 @@
               <w:rPr>
                 <w:b/>
               </w:rPr>
-              <w:t>17 (7.4%)</w:t>
+              <w:t>1 (0.4%)</w:t>
+            </w:r>
+          </w:p>
+        </w:tc>
+        <w:tc>
+          <w:tcPr>
+            <w:tcW w:type="dxa" w:w="1337"/>
+            <w:shd w:fill="E2E8F0"/>
+          </w:tcPr>
+          <w:p>
+            <w:r>
+              <w:rPr>
+                <w:b/>
+              </w:rPr>
+              <w:t>4 (2.2%)</w:t>
             </w:r>
           </w:p>
         </w:tc>
@@ -1095,79 +1274,92 @@
       <w:tr>
         <w:tc>
           <w:tcPr>
-            <w:tcW w:type="dxa" w:w="1560"/>
+            <w:tcW w:type="dxa" w:w="1337"/>
           </w:tcPr>
           <w:p>
             <w:r>
               <w:rPr>
                 <w:b w:val="0"/>
               </w:rPr>
-              <w:t>Aggregation Errors</w:t>
+              <w:t>Result Mismatches</w:t>
             </w:r>
           </w:p>
         </w:tc>
         <w:tc>
           <w:tcPr>
-            <w:tcW w:type="dxa" w:w="1560"/>
+            <w:tcW w:type="dxa" w:w="1337"/>
           </w:tcPr>
           <w:p>
             <w:r>
               <w:rPr>
                 <w:b w:val="0"/>
               </w:rPr>
-              <w:t>32 (9.8%)</w:t>
+              <w:t>111 (34.0%)</w:t>
             </w:r>
           </w:p>
         </w:tc>
         <w:tc>
           <w:tcPr>
-            <w:tcW w:type="dxa" w:w="1560"/>
+            <w:tcW w:type="dxa" w:w="1337"/>
           </w:tcPr>
           <w:p>
             <w:r>
               <w:rPr>
                 <w:b w:val="0"/>
               </w:rPr>
-              <w:t>29 (8.3%)</w:t>
+              <w:t>119 (34.1%)</w:t>
             </w:r>
           </w:p>
         </w:tc>
         <w:tc>
           <w:tcPr>
-            <w:tcW w:type="dxa" w:w="1560"/>
+            <w:tcW w:type="dxa" w:w="1337"/>
           </w:tcPr>
           <w:p>
             <w:r>
               <w:rPr>
                 <w:b w:val="0"/>
               </w:rPr>
-              <w:t>7 (3.0%)</w:t>
+              <w:t>174 (74.7%)</w:t>
             </w:r>
           </w:p>
         </w:tc>
         <w:tc>
           <w:tcPr>
-            <w:tcW w:type="dxa" w:w="1560"/>
+            <w:tcW w:type="dxa" w:w="1337"/>
           </w:tcPr>
           <w:p>
             <w:r>
               <w:rPr>
                 <w:b w:val="0"/>
               </w:rPr>
-              <w:t>83 (27.6%)</w:t>
+              <w:t>157 (52.2%)</w:t>
             </w:r>
           </w:p>
         </w:tc>
         <w:tc>
           <w:tcPr>
-            <w:tcW w:type="dxa" w:w="1560"/>
+            <w:tcW w:type="dxa" w:w="1337"/>
           </w:tcPr>
           <w:p>
             <w:r>
               <w:rPr>
                 <w:b w:val="0"/>
               </w:rPr>
-              <w:t>7 (3.0%) [-91.6%]</w:t>
+              <w:t>206 (89.2%)</w:t>
+            </w:r>
+          </w:p>
+        </w:tc>
+        <w:tc>
+          <w:tcPr>
+            <w:tcW w:type="dxa" w:w="1337"/>
+          </w:tcPr>
+          <w:p>
+            <w:r>
+              <w:rPr>
+                <w:b w:val="0"/>
+              </w:rPr>
+              <w:t>154 (85.1%) [-52]</w:t>
             </w:r>
           </w:p>
         </w:tc>
@@ -1175,7 +1367,7 @@
       <w:tr>
         <w:tc>
           <w:tcPr>
-            <w:tcW w:type="dxa" w:w="1560"/>
+            <w:tcW w:type="dxa" w:w="1337"/>
             <w:shd w:fill="E2E8F0"/>
           </w:tcPr>
           <w:p>
@@ -1189,7 +1381,7 @@
         </w:tc>
         <w:tc>
           <w:tcPr>
-            <w:tcW w:type="dxa" w:w="1560"/>
+            <w:tcW w:type="dxa" w:w="1337"/>
             <w:shd w:fill="E2E8F0"/>
           </w:tcPr>
           <w:p>
@@ -1203,7 +1395,7 @@
         </w:tc>
         <w:tc>
           <w:tcPr>
-            <w:tcW w:type="dxa" w:w="1560"/>
+            <w:tcW w:type="dxa" w:w="1337"/>
             <w:shd w:fill="E2E8F0"/>
           </w:tcPr>
           <w:p>
@@ -1217,7 +1409,7 @@
         </w:tc>
         <w:tc>
           <w:tcPr>
-            <w:tcW w:type="dxa" w:w="1560"/>
+            <w:tcW w:type="dxa" w:w="1337"/>
             <w:shd w:fill="E2E8F0"/>
           </w:tcPr>
           <w:p>
@@ -1231,7 +1423,7 @@
         </w:tc>
         <w:tc>
           <w:tcPr>
-            <w:tcW w:type="dxa" w:w="1560"/>
+            <w:tcW w:type="dxa" w:w="1337"/>
             <w:shd w:fill="E2E8F0"/>
           </w:tcPr>
           <w:p>
@@ -1245,7 +1437,7 @@
         </w:tc>
         <w:tc>
           <w:tcPr>
-            <w:tcW w:type="dxa" w:w="1560"/>
+            <w:tcW w:type="dxa" w:w="1337"/>
             <w:shd w:fill="E2E8F0"/>
           </w:tcPr>
           <w:p>
@@ -1253,7 +1445,21 @@
               <w:rPr>
                 <w:b/>
               </w:rPr>
-              <w:t>44 queries [+131.6%]</w:t>
+              <w:t>44 queries</w:t>
+            </w:r>
+          </w:p>
+        </w:tc>
+        <w:tc>
+          <w:tcPr>
+            <w:tcW w:type="dxa" w:w="1337"/>
+            <w:shd w:fill="E2E8F0"/>
+          </w:tcPr>
+          <w:p>
+            <w:r>
+              <w:rPr>
+                <w:b/>
+              </w:rPr>
+              <w:t>79 queries [+79.5%]</w:t>
             </w:r>
           </w:p>
         </w:tc>
@@ -1261,20 +1467,115 @@
       <w:tr>
         <w:tc>
           <w:tcPr>
-            <w:tcW w:type="dxa" w:w="1560"/>
+            <w:tcW w:type="dxa" w:w="1337"/>
           </w:tcPr>
           <w:p>
             <w:r>
               <w:rPr>
                 <w:b w:val="0"/>
               </w:rPr>
-              <w:t>Engine Local Latency</w:t>
+              <w:t>Avg. Prompt Tokens / Q</w:t>
             </w:r>
           </w:p>
         </w:tc>
         <w:tc>
           <w:tcPr>
-            <w:tcW w:type="dxa" w:w="1560"/>
+            <w:tcW w:type="dxa" w:w="1337"/>
+          </w:tcPr>
+          <w:p>
+            <w:r>
+              <w:rPr>
+                <w:b w:val="0"/>
+              </w:rPr>
+              <w:t>386.4</w:t>
+            </w:r>
+          </w:p>
+        </w:tc>
+        <w:tc>
+          <w:tcPr>
+            <w:tcW w:type="dxa" w:w="1337"/>
+          </w:tcPr>
+          <w:p>
+            <w:r>
+              <w:rPr>
+                <w:b w:val="0"/>
+              </w:rPr>
+              <w:t>325.4 (-15.8%)</w:t>
+            </w:r>
+          </w:p>
+        </w:tc>
+        <w:tc>
+          <w:tcPr>
+            <w:tcW w:type="dxa" w:w="1337"/>
+          </w:tcPr>
+          <w:p>
+            <w:r>
+              <w:rPr>
+                <w:b w:val="0"/>
+              </w:rPr>
+              <w:t>330.4 (-14.5%)</w:t>
+            </w:r>
+          </w:p>
+        </w:tc>
+        <w:tc>
+          <w:tcPr>
+            <w:tcW w:type="dxa" w:w="1337"/>
+          </w:tcPr>
+          <w:p>
+            <w:r>
+              <w:rPr>
+                <w:b w:val="0"/>
+              </w:rPr>
+              <w:t>479.7</w:t>
+            </w:r>
+          </w:p>
+        </w:tc>
+        <w:tc>
+          <w:tcPr>
+            <w:tcW w:type="dxa" w:w="1337"/>
+          </w:tcPr>
+          <w:p>
+            <w:r>
+              <w:rPr>
+                <w:b w:val="0"/>
+              </w:rPr>
+              <w:t>460.2</w:t>
+            </w:r>
+          </w:p>
+        </w:tc>
+        <w:tc>
+          <w:tcPr>
+            <w:tcW w:type="dxa" w:w="1337"/>
+          </w:tcPr>
+          <w:p>
+            <w:r>
+              <w:rPr>
+                <w:b w:val="0"/>
+              </w:rPr>
+              <w:t>588.6 tokens</w:t>
+            </w:r>
+          </w:p>
+        </w:tc>
+      </w:tr>
+      <w:tr>
+        <w:tc>
+          <w:tcPr>
+            <w:tcW w:type="dxa" w:w="1337"/>
+            <w:shd w:fill="F0F4F8"/>
+          </w:tcPr>
+          <w:p>
+            <w:r>
+              <w:rPr>
+                <w:b w:val="0"/>
+              </w:rPr>
+              <w:t>Avg Local Latency / Q</w:t>
+            </w:r>
+          </w:p>
+        </w:tc>
+        <w:tc>
+          <w:tcPr>
+            <w:tcW w:type="dxa" w:w="1337"/>
+            <w:shd w:fill="F0F4F8"/>
           </w:tcPr>
           <w:p>
             <w:r>
@@ -1287,53 +1588,71 @@
         </w:tc>
         <w:tc>
           <w:tcPr>
-            <w:tcW w:type="dxa" w:w="1560"/>
+            <w:tcW w:type="dxa" w:w="1337"/>
+            <w:shd w:fill="F0F4F8"/>
           </w:tcPr>
           <w:p>
             <w:r>
               <w:rPr>
                 <w:b w:val="0"/>
               </w:rPr>
-              <w:t>4.5ms / Q</w:t>
+              <w:t>4.5ms</w:t>
             </w:r>
           </w:p>
         </w:tc>
         <w:tc>
           <w:tcPr>
-            <w:tcW w:type="dxa" w:w="1560"/>
+            <w:tcW w:type="dxa" w:w="1337"/>
+            <w:shd w:fill="F0F4F8"/>
           </w:tcPr>
           <w:p>
             <w:r>
               <w:rPr>
                 <w:b w:val="0"/>
               </w:rPr>
-              <w:t>4.8ms / Q</w:t>
+              <w:t>4.8ms</w:t>
             </w:r>
           </w:p>
         </w:tc>
         <w:tc>
           <w:tcPr>
-            <w:tcW w:type="dxa" w:w="1560"/>
+            <w:tcW w:type="dxa" w:w="1337"/>
+            <w:shd w:fill="F0F4F8"/>
           </w:tcPr>
           <w:p>
             <w:r>
               <w:rPr>
                 <w:b w:val="0"/>
               </w:rPr>
-              <w:t>18.06ms / Q</w:t>
+              <w:t>18.06ms</w:t>
             </w:r>
           </w:p>
         </w:tc>
         <w:tc>
           <w:tcPr>
-            <w:tcW w:type="dxa" w:w="1560"/>
+            <w:tcW w:type="dxa" w:w="1337"/>
+            <w:shd w:fill="F0F4F8"/>
           </w:tcPr>
           <w:p>
             <w:r>
               <w:rPr>
                 <w:b w:val="0"/>
               </w:rPr>
-              <w:t>&lt; 15.0ms (SLA Compliant)</w:t>
+              <w:t>&lt; 15.0ms</w:t>
+            </w:r>
+          </w:p>
+        </w:tc>
+        <w:tc>
+          <w:tcPr>
+            <w:tcW w:type="dxa" w:w="1337"/>
+            <w:shd w:fill="F0F4F8"/>
+          </w:tcPr>
+          <w:p>
+            <w:r>
+              <w:rPr>
+                <w:b w:val="0"/>
+              </w:rPr>
+              <w:t>&lt; 28.0ms (SLA Compliant)</w:t>
             </w:r>
           </w:p>
         </w:tc>
@@ -1341,85 +1660,92 @@
       <w:tr>
         <w:tc>
           <w:tcPr>
-            <w:tcW w:type="dxa" w:w="1560"/>
-            <w:shd w:fill="F0F4F8"/>
+            <w:tcW w:type="dxa" w:w="1337"/>
           </w:tcPr>
           <w:p>
             <w:r>
               <w:rPr>
                 <w:b w:val="0"/>
               </w:rPr>
-              <w:t>Total Pipeline Runtime</w:t>
+              <w:t>Total Evaluation Time</w:t>
             </w:r>
           </w:p>
         </w:tc>
         <w:tc>
           <w:tcPr>
-            <w:tcW w:type="dxa" w:w="1560"/>
-            <w:shd w:fill="F0F4F8"/>
+            <w:tcW w:type="dxa" w:w="1337"/>
           </w:tcPr>
           <w:p>
             <w:r>
               <w:rPr>
                 <w:b w:val="0"/>
               </w:rPr>
-              <w:t>2,520s (~42.0m)</w:t>
+              <w:t>2,520s (~42m)</w:t>
             </w:r>
           </w:p>
         </w:tc>
         <w:tc>
           <w:tcPr>
-            <w:tcW w:type="dxa" w:w="1560"/>
-            <w:shd w:fill="F0F4F8"/>
+            <w:tcW w:type="dxa" w:w="1337"/>
           </w:tcPr>
           <w:p>
             <w:r>
               <w:rPr>
                 <w:b w:val="0"/>
               </w:rPr>
-              <w:t>2,650s (~44.1m)</w:t>
+              <w:t>2,650s (~44m)</w:t>
             </w:r>
           </w:p>
         </w:tc>
         <w:tc>
           <w:tcPr>
-            <w:tcW w:type="dxa" w:w="1560"/>
-            <w:shd w:fill="F0F4F8"/>
+            <w:tcW w:type="dxa" w:w="1337"/>
           </w:tcPr>
           <w:p>
             <w:r>
               <w:rPr>
                 <w:b w:val="0"/>
               </w:rPr>
-              <w:t>2,544s (~42.4m)</w:t>
+              <w:t>2,544s (~42m)</w:t>
             </w:r>
           </w:p>
         </w:tc>
         <w:tc>
           <w:tcPr>
-            <w:tcW w:type="dxa" w:w="1560"/>
-            <w:shd w:fill="F0F4F8"/>
+            <w:tcW w:type="dxa" w:w="1337"/>
           </w:tcPr>
           <w:p>
             <w:r>
               <w:rPr>
                 <w:b w:val="0"/>
               </w:rPr>
-              <w:t>2,955s (~49.2m)</w:t>
+              <w:t>2,955s (~49m)</w:t>
             </w:r>
           </w:p>
         </w:tc>
         <w:tc>
           <w:tcPr>
-            <w:tcW w:type="dxa" w:w="1560"/>
-            <w:shd w:fill="F0F4F8"/>
+            <w:tcW w:type="dxa" w:w="1337"/>
           </w:tcPr>
           <w:p>
             <w:r>
               <w:rPr>
                 <w:b w:val="0"/>
               </w:rPr>
-              <w:t>2,021s (~33.7m) [FAST!]</w:t>
+              <w:t>2,021s (~33.7m)</w:t>
+            </w:r>
+          </w:p>
+        </w:tc>
+        <w:tc>
+          <w:tcPr>
+            <w:tcW w:type="dxa" w:w="1337"/>
+          </w:tcPr>
+          <w:p>
+            <w:r>
+              <w:rPr>
+                <w:b w:val="0"/>
+              </w:rPr>
+              <w:t>1,884s (~31.4m) [FAST!]</w:t>
             </w:r>
           </w:p>
         </w:tc>
@@ -1442,7 +1768,7 @@
           <w:color w:val="1B365D"/>
           <w:sz w:val="30"/>
         </w:rPr>
-        <w:t>3. Performance Trajectory by Query Complexity Tier</w:t>
+        <w:t>3. Performance Progression Across Complexity Tiers</w:t>
       </w:r>
     </w:p>
     <w:p>
@@ -1450,7 +1776,7 @@
         <w:spacing w:after="120"/>
       </w:pPr>
       <w:r>
-        <w:t>Analyzing execution accuracy across Spider's standardized complexity levels illustrates where each algorithmic layer delivers its primary performance gain:</w:t>
+        <w:t>Tracking accuracy across standardized difficulty levels illustrates how in-context learning and exact Yale evaluation resolve hard relational challenges:</w:t>
       </w:r>
     </w:p>
     <w:tbl>
@@ -1460,17 +1786,19 @@
         <w:tblLook w:firstColumn="1" w:firstRow="1" w:lastColumn="0" w:lastRow="0" w:noHBand="0" w:noVBand="1" w:val="04A0"/>
       </w:tblPr>
       <w:tblGrid>
-        <w:gridCol w:w="1560"/>
-        <w:gridCol w:w="1560"/>
-        <w:gridCol w:w="1560"/>
-        <w:gridCol w:w="1560"/>
-        <w:gridCol w:w="1560"/>
-        <w:gridCol w:w="1560"/>
+        <w:gridCol w:w="1170"/>
+        <w:gridCol w:w="1170"/>
+        <w:gridCol w:w="1170"/>
+        <w:gridCol w:w="1170"/>
+        <w:gridCol w:w="1170"/>
+        <w:gridCol w:w="1170"/>
+        <w:gridCol w:w="1170"/>
+        <w:gridCol w:w="1170"/>
       </w:tblGrid>
       <w:tr>
         <w:tc>
           <w:tcPr>
-            <w:tcW w:type="dxa" w:w="1560"/>
+            <w:tcW w:type="dxa" w:w="1170"/>
             <w:shd w:fill="1B365D"/>
           </w:tcPr>
           <w:p>
@@ -1479,13 +1807,13 @@
                 <w:b/>
                 <w:color w:val="FFFFFF"/>
               </w:rPr>
-              <w:t>Complexity Level</w:t>
+              <w:t>Difficulty Tier</w:t>
             </w:r>
           </w:p>
         </w:tc>
         <w:tc>
           <w:tcPr>
-            <w:tcW w:type="dxa" w:w="1560"/>
+            <w:tcW w:type="dxa" w:w="1170"/>
             <w:shd w:fill="1B365D"/>
           </w:tcPr>
           <w:p>
@@ -1500,7 +1828,7 @@
         </w:tc>
         <w:tc>
           <w:tcPr>
-            <w:tcW w:type="dxa" w:w="1560"/>
+            <w:tcW w:type="dxa" w:w="1170"/>
             <w:shd w:fill="1B365D"/>
           </w:tcPr>
           <w:p>
@@ -1515,7 +1843,7 @@
         </w:tc>
         <w:tc>
           <w:tcPr>
-            <w:tcW w:type="dxa" w:w="1560"/>
+            <w:tcW w:type="dxa" w:w="1170"/>
             <w:shd w:fill="1B365D"/>
           </w:tcPr>
           <w:p>
@@ -1530,7 +1858,7 @@
         </w:tc>
         <w:tc>
           <w:tcPr>
-            <w:tcW w:type="dxa" w:w="1560"/>
+            <w:tcW w:type="dxa" w:w="1170"/>
             <w:shd w:fill="1B365D"/>
           </w:tcPr>
           <w:p>
@@ -1545,7 +1873,7 @@
         </w:tc>
         <w:tc>
           <w:tcPr>
-            <w:tcW w:type="dxa" w:w="1560"/>
+            <w:tcW w:type="dxa" w:w="1170"/>
             <w:shd w:fill="1B365D"/>
           </w:tcPr>
           <w:p>
@@ -1554,7 +1882,37 @@
                 <w:b/>
                 <w:color w:val="FFFFFF"/>
               </w:rPr>
-              <w:t>Stage 4.1: Precision</w:t>
+              <w:t>Stage 4.1</w:t>
+            </w:r>
+          </w:p>
+        </w:tc>
+        <w:tc>
+          <w:tcPr>
+            <w:tcW w:type="dxa" w:w="1170"/>
+            <w:shd w:fill="1B365D"/>
+          </w:tcPr>
+          <w:p>
+            <w:r>
+              <w:rPr>
+                <w:b/>
+                <w:color w:val="FFFFFF"/>
+              </w:rPr>
+              <w:t>Stage 5 (Strict)</w:t>
+            </w:r>
+          </w:p>
+        </w:tc>
+        <w:tc>
+          <w:tcPr>
+            <w:tcW w:type="dxa" w:w="1170"/>
+            <w:shd w:fill="1B365D"/>
+          </w:tcPr>
+          <w:p>
+            <w:r>
+              <w:rPr>
+                <w:b/>
+                <w:color w:val="FFFFFF"/>
+              </w:rPr>
+              <w:t>Stage 5 (Yale)</w:t>
             </w:r>
           </w:p>
         </w:tc>
@@ -1562,7 +1920,7 @@
       <w:tr>
         <w:tc>
           <w:tcPr>
-            <w:tcW w:type="dxa" w:w="1560"/>
+            <w:tcW w:type="dxa" w:w="1170"/>
             <w:shd w:fill="F0F4F8"/>
           </w:tcPr>
           <w:p>
@@ -1570,13 +1928,13 @@
               <w:rPr>
                 <w:b w:val="0"/>
               </w:rPr>
-              <w:t>Easy (N = 458)</w:t>
+              <w:t>Easy (N=458)</w:t>
             </w:r>
           </w:p>
         </w:tc>
         <w:tc>
           <w:tcPr>
-            <w:tcW w:type="dxa" w:w="1560"/>
+            <w:tcW w:type="dxa" w:w="1170"/>
             <w:shd w:fill="F0F4F8"/>
           </w:tcPr>
           <w:p>
@@ -1590,7 +1948,7 @@
         </w:tc>
         <w:tc>
           <w:tcPr>
-            <w:tcW w:type="dxa" w:w="1560"/>
+            <w:tcW w:type="dxa" w:w="1170"/>
             <w:shd w:fill="F0F4F8"/>
           </w:tcPr>
           <w:p>
@@ -1604,7 +1962,7 @@
         </w:tc>
         <w:tc>
           <w:tcPr>
-            <w:tcW w:type="dxa" w:w="1560"/>
+            <w:tcW w:type="dxa" w:w="1170"/>
             <w:shd w:fill="F0F4F8"/>
           </w:tcPr>
           <w:p>
@@ -1618,7 +1976,7 @@
         </w:tc>
         <w:tc>
           <w:tcPr>
-            <w:tcW w:type="dxa" w:w="1560"/>
+            <w:tcW w:type="dxa" w:w="1170"/>
             <w:shd w:fill="F0F4F8"/>
           </w:tcPr>
           <w:p>
@@ -1632,7 +1990,7 @@
         </w:tc>
         <w:tc>
           <w:tcPr>
-            <w:tcW w:type="dxa" w:w="1560"/>
+            <w:tcW w:type="dxa" w:w="1170"/>
             <w:shd w:fill="F0F4F8"/>
           </w:tcPr>
           <w:p>
@@ -1640,7 +1998,35 @@
               <w:rPr>
                 <w:b w:val="0"/>
               </w:rPr>
-              <w:t>81.88% (375) [+4.15%]</w:t>
+              <w:t>81.88% (375)</w:t>
+            </w:r>
+          </w:p>
+        </w:tc>
+        <w:tc>
+          <w:tcPr>
+            <w:tcW w:type="dxa" w:w="1170"/>
+            <w:shd w:fill="F0F4F8"/>
+          </w:tcPr>
+          <w:p>
+            <w:r>
+              <w:rPr>
+                <w:b w:val="0"/>
+              </w:rPr>
+              <w:t>84.72% (388)</w:t>
+            </w:r>
+          </w:p>
+        </w:tc>
+        <w:tc>
+          <w:tcPr>
+            <w:tcW w:type="dxa" w:w="1170"/>
+            <w:shd w:fill="F0F4F8"/>
+          </w:tcPr>
+          <w:p>
+            <w:r>
+              <w:rPr>
+                <w:b w:val="0"/>
+              </w:rPr>
+              <w:t>88.65% (406)</w:t>
             </w:r>
           </w:p>
         </w:tc>
@@ -1648,20 +2034,20 @@
       <w:tr>
         <w:tc>
           <w:tcPr>
-            <w:tcW w:type="dxa" w:w="1560"/>
+            <w:tcW w:type="dxa" w:w="1170"/>
           </w:tcPr>
           <w:p>
             <w:r>
               <w:rPr>
                 <w:b w:val="0"/>
               </w:rPr>
-              <w:t>Medium (N = 332)</w:t>
+              <w:t>Medium (N=332)</w:t>
             </w:r>
           </w:p>
         </w:tc>
         <w:tc>
           <w:tcPr>
-            <w:tcW w:type="dxa" w:w="1560"/>
+            <w:tcW w:type="dxa" w:w="1170"/>
           </w:tcPr>
           <w:p>
             <w:r>
@@ -1674,7 +2060,7 @@
         </w:tc>
         <w:tc>
           <w:tcPr>
-            <w:tcW w:type="dxa" w:w="1560"/>
+            <w:tcW w:type="dxa" w:w="1170"/>
           </w:tcPr>
           <w:p>
             <w:r>
@@ -1687,7 +2073,7 @@
         </w:tc>
         <w:tc>
           <w:tcPr>
-            <w:tcW w:type="dxa" w:w="1560"/>
+            <w:tcW w:type="dxa" w:w="1170"/>
           </w:tcPr>
           <w:p>
             <w:r>
@@ -1700,7 +2086,7 @@
         </w:tc>
         <w:tc>
           <w:tcPr>
-            <w:tcW w:type="dxa" w:w="1560"/>
+            <w:tcW w:type="dxa" w:w="1170"/>
           </w:tcPr>
           <w:p>
             <w:r>
@@ -1713,14 +2099,40 @@
         </w:tc>
         <w:tc>
           <w:tcPr>
-            <w:tcW w:type="dxa" w:w="1560"/>
+            <w:tcW w:type="dxa" w:w="1170"/>
           </w:tcPr>
           <w:p>
             <w:r>
               <w:rPr>
                 <w:b w:val="0"/>
               </w:rPr>
-              <w:t>77.71% (258) [PEAK!]</w:t>
+              <w:t>77.71% (258)</w:t>
+            </w:r>
+          </w:p>
+        </w:tc>
+        <w:tc>
+          <w:tcPr>
+            <w:tcW w:type="dxa" w:w="1170"/>
+          </w:tcPr>
+          <w:p>
+            <w:r>
+              <w:rPr>
+                <w:b w:val="0"/>
+              </w:rPr>
+              <w:t>77.41% (257)</w:t>
+            </w:r>
+          </w:p>
+        </w:tc>
+        <w:tc>
+          <w:tcPr>
+            <w:tcW w:type="dxa" w:w="1170"/>
+          </w:tcPr>
+          <w:p>
+            <w:r>
+              <w:rPr>
+                <w:b w:val="0"/>
+              </w:rPr>
+              <w:t>82.53% (274)</w:t>
             </w:r>
           </w:p>
         </w:tc>
@@ -1728,7 +2140,7 @@
       <w:tr>
         <w:tc>
           <w:tcPr>
-            <w:tcW w:type="dxa" w:w="1560"/>
+            <w:tcW w:type="dxa" w:w="1170"/>
             <w:shd w:fill="F0F4F8"/>
           </w:tcPr>
           <w:p>
@@ -1736,13 +2148,13 @@
               <w:rPr>
                 <w:b w:val="0"/>
               </w:rPr>
-              <w:t>Hard (N = 238)</w:t>
+              <w:t>Hard (N=238)</w:t>
             </w:r>
           </w:p>
         </w:tc>
         <w:tc>
           <w:tcPr>
-            <w:tcW w:type="dxa" w:w="1560"/>
+            <w:tcW w:type="dxa" w:w="1170"/>
             <w:shd w:fill="F0F4F8"/>
           </w:tcPr>
           <w:p>
@@ -1756,7 +2168,7 @@
         </w:tc>
         <w:tc>
           <w:tcPr>
-            <w:tcW w:type="dxa" w:w="1560"/>
+            <w:tcW w:type="dxa" w:w="1170"/>
             <w:shd w:fill="F0F4F8"/>
           </w:tcPr>
           <w:p>
@@ -1770,7 +2182,7 @@
         </w:tc>
         <w:tc>
           <w:tcPr>
-            <w:tcW w:type="dxa" w:w="1560"/>
+            <w:tcW w:type="dxa" w:w="1170"/>
             <w:shd w:fill="F0F4F8"/>
           </w:tcPr>
           <w:p>
@@ -1784,7 +2196,7 @@
         </w:tc>
         <w:tc>
           <w:tcPr>
-            <w:tcW w:type="dxa" w:w="1560"/>
+            <w:tcW w:type="dxa" w:w="1170"/>
             <w:shd w:fill="F0F4F8"/>
           </w:tcPr>
           <w:p>
@@ -1798,7 +2210,7 @@
         </w:tc>
         <w:tc>
           <w:tcPr>
-            <w:tcW w:type="dxa" w:w="1560"/>
+            <w:tcW w:type="dxa" w:w="1170"/>
             <w:shd w:fill="F0F4F8"/>
           </w:tcPr>
           <w:p>
@@ -1806,7 +2218,35 @@
               <w:rPr>
                 <w:b w:val="0"/>
               </w:rPr>
-              <w:t>70.17% (167) [PEAK!]</w:t>
+              <w:t>70.17% (167)</w:t>
+            </w:r>
+          </w:p>
+        </w:tc>
+        <w:tc>
+          <w:tcPr>
+            <w:tcW w:type="dxa" w:w="1170"/>
+            <w:shd w:fill="F0F4F8"/>
+          </w:tcPr>
+          <w:p>
+            <w:r>
+              <w:rPr>
+                <w:b w:val="0"/>
+              </w:rPr>
+              <w:t>71.85% (171)</w:t>
+            </w:r>
+          </w:p>
+        </w:tc>
+        <w:tc>
+          <w:tcPr>
+            <w:tcW w:type="dxa" w:w="1170"/>
+            <w:shd w:fill="F0F4F8"/>
+          </w:tcPr>
+          <w:p>
+            <w:r>
+              <w:rPr>
+                <w:b w:val="0"/>
+              </w:rPr>
+              <w:t>71.01% (169)</w:t>
             </w:r>
           </w:p>
         </w:tc>
@@ -1814,20 +2254,20 @@
       <w:tr>
         <w:tc>
           <w:tcPr>
-            <w:tcW w:type="dxa" w:w="1560"/>
+            <w:tcW w:type="dxa" w:w="1170"/>
           </w:tcPr>
           <w:p>
             <w:r>
               <w:rPr>
                 <w:b w:val="0"/>
               </w:rPr>
-              <w:t>Extra Hard (N = 6)</w:t>
+              <w:t>Extra Hard (N=6)</w:t>
             </w:r>
           </w:p>
         </w:tc>
         <w:tc>
           <w:tcPr>
-            <w:tcW w:type="dxa" w:w="1560"/>
+            <w:tcW w:type="dxa" w:w="1170"/>
           </w:tcPr>
           <w:p>
             <w:r>
@@ -1840,7 +2280,7 @@
         </w:tc>
         <w:tc>
           <w:tcPr>
-            <w:tcW w:type="dxa" w:w="1560"/>
+            <w:tcW w:type="dxa" w:w="1170"/>
           </w:tcPr>
           <w:p>
             <w:r>
@@ -1853,7 +2293,7 @@
         </w:tc>
         <w:tc>
           <w:tcPr>
-            <w:tcW w:type="dxa" w:w="1560"/>
+            <w:tcW w:type="dxa" w:w="1170"/>
           </w:tcPr>
           <w:p>
             <w:r>
@@ -1866,7 +2306,7 @@
         </w:tc>
         <w:tc>
           <w:tcPr>
-            <w:tcW w:type="dxa" w:w="1560"/>
+            <w:tcW w:type="dxa" w:w="1170"/>
           </w:tcPr>
           <w:p>
             <w:r>
@@ -1879,7 +2319,7 @@
         </w:tc>
         <w:tc>
           <w:tcPr>
-            <w:tcW w:type="dxa" w:w="1560"/>
+            <w:tcW w:type="dxa" w:w="1170"/>
           </w:tcPr>
           <w:p>
             <w:r>
@@ -1890,11 +2330,37 @@
             </w:r>
           </w:p>
         </w:tc>
+        <w:tc>
+          <w:tcPr>
+            <w:tcW w:type="dxa" w:w="1170"/>
+          </w:tcPr>
+          <w:p>
+            <w:r>
+              <w:rPr>
+                <w:b w:val="0"/>
+              </w:rPr>
+              <w:t>33.33% (2)</w:t>
+            </w:r>
+          </w:p>
+        </w:tc>
+        <w:tc>
+          <w:tcPr>
+            <w:tcW w:type="dxa" w:w="1170"/>
+          </w:tcPr>
+          <w:p>
+            <w:r>
+              <w:rPr>
+                <w:b w:val="0"/>
+              </w:rPr>
+              <w:t>33.33% (2)</w:t>
+            </w:r>
+          </w:p>
+        </w:tc>
       </w:tr>
       <w:tr>
         <w:tc>
           <w:tcPr>
-            <w:tcW w:type="dxa" w:w="1560"/>
+            <w:tcW w:type="dxa" w:w="1170"/>
             <w:shd w:fill="E2E8F0"/>
           </w:tcPr>
           <w:p>
@@ -1902,13 +2368,13 @@
               <w:rPr>
                 <w:b/>
               </w:rPr>
-              <w:t>Overall (N = 1,034)</w:t>
+              <w:t>Total (N=1,034)</w:t>
             </w:r>
           </w:p>
         </w:tc>
         <w:tc>
           <w:tcPr>
-            <w:tcW w:type="dxa" w:w="1560"/>
+            <w:tcW w:type="dxa" w:w="1170"/>
             <w:shd w:fill="E2E8F0"/>
           </w:tcPr>
           <w:p>
@@ -1922,7 +2388,7 @@
         </w:tc>
         <w:tc>
           <w:tcPr>
-            <w:tcW w:type="dxa" w:w="1560"/>
+            <w:tcW w:type="dxa" w:w="1170"/>
             <w:shd w:fill="E2E8F0"/>
           </w:tcPr>
           <w:p>
@@ -1936,7 +2402,7 @@
         </w:tc>
         <w:tc>
           <w:tcPr>
-            <w:tcW w:type="dxa" w:w="1560"/>
+            <w:tcW w:type="dxa" w:w="1170"/>
             <w:shd w:fill="E2E8F0"/>
           </w:tcPr>
           <w:p>
@@ -1950,7 +2416,7 @@
         </w:tc>
         <w:tc>
           <w:tcPr>
-            <w:tcW w:type="dxa" w:w="1560"/>
+            <w:tcW w:type="dxa" w:w="1170"/>
             <w:shd w:fill="E2E8F0"/>
           </w:tcPr>
           <w:p>
@@ -1964,7 +2430,7 @@
         </w:tc>
         <w:tc>
           <w:tcPr>
-            <w:tcW w:type="dxa" w:w="1560"/>
+            <w:tcW w:type="dxa" w:w="1170"/>
             <w:shd w:fill="E2E8F0"/>
           </w:tcPr>
           <w:p>
@@ -1972,7 +2438,35 @@
               <w:rPr>
                 <w:b/>
               </w:rPr>
-              <w:t>77.47% (801) [RECORD]</w:t>
+              <w:t>77.47% (801)</w:t>
+            </w:r>
+          </w:p>
+        </w:tc>
+        <w:tc>
+          <w:tcPr>
+            <w:tcW w:type="dxa" w:w="1170"/>
+            <w:shd w:fill="D4EDDA"/>
+          </w:tcPr>
+          <w:p>
+            <w:r>
+              <w:rPr>
+                <w:b/>
+              </w:rPr>
+              <w:t>79.11% (818)</w:t>
+            </w:r>
+          </w:p>
+        </w:tc>
+        <w:tc>
+          <w:tcPr>
+            <w:tcW w:type="dxa" w:w="1170"/>
+            <w:shd w:fill="D4EDDA"/>
+          </w:tcPr>
+          <w:p>
+            <w:r>
+              <w:rPr>
+                <w:b/>
+              </w:rPr>
+              <w:t>82.30% (851)</w:t>
             </w:r>
           </w:p>
         </w:tc>
@@ -1995,138 +2489,21 @@
           <w:color w:val="1B365D"/>
           <w:sz w:val="30"/>
         </w:rPr>
-        <w:t>4. Scientific Novelty &amp; Dissertation Defense Pillars</w:t>
+        <w:t>4. Enterprise System Viability &amp; Multi-Tenant Deployment</w:t>
       </w:r>
     </w:p>
     <w:p>
-      <w:pPr>
-        <w:spacing w:after="120"/>
-      </w:pPr>
       <w:r>
-        <w:t>In peer-reviewed publications and oral examinations, Member 1's contributions are founded on four novel pillars:</w:t>
-      </w:r>
-    </w:p>
-    <w:p>
-      <w:pPr>
-        <w:keepNext/>
-        <w:spacing w:before="240" w:after="80"/>
-      </w:pPr>
-      <w:r>
-        <w:rPr>
-          <w:rFonts w:ascii="Calibri" w:hAnsi="Calibri"/>
-          <w:b/>
-          <w:color w:val="007A78"/>
-          <w:sz w:val="24"/>
-        </w:rPr>
-        <w:t>Pillar 1: The Pareto-Optimal Token-to-Accuracy Frontier</w:t>
-      </w:r>
-    </w:p>
-    <w:p>
-      <w:pPr>
-        <w:spacing w:after="120"/>
-      </w:pPr>
-      <w:r>
-        <w:t>Existing high-accuracy systems (e.g. DIN-SQL, MAC-SQL) require full schema dumps and exhaustive agentic loops (&gt; 2,000 tokens/query). Member 1 introduces an architecture achieving 77.47% accuracy while consuming only 460.2 prompt tokens/query via deterministic lexical relevance scoring and foreign-key graph closure.</w:t>
-      </w:r>
-    </w:p>
-    <w:p>
-      <w:pPr>
-        <w:keepNext/>
-        <w:spacing w:before="240" w:after="80"/>
-      </w:pPr>
-      <w:r>
-        <w:rPr>
-          <w:rFonts w:ascii="Calibri" w:hAnsi="Calibri"/>
-          <w:b/>
-          <w:color w:val="007A78"/>
-          <w:sz w:val="24"/>
-        </w:rPr>
-        <w:t>Pillar 2: The Silent Schema Protection Paradigm</w:t>
-      </w:r>
-    </w:p>
-    <w:p>
-      <w:pPr>
-        <w:spacing w:after="120"/>
-      </w:pPr>
-      <w:r>
-        <w:t>Prior works assume entity/value grounding requires injecting matched cell values directly into the prompt. Member 1 proves that cell values are most effective as a deterministic schema-protection filter: preserving tables from catalog pruning while withholding literal 1:1 word hints from the prompt. This permanently eliminated schema linking errors (0 across 1,034 queries) while preventing prompt clutter.</w:t>
-      </w:r>
-    </w:p>
-    <w:p>
-      <w:pPr>
-        <w:keepNext/>
-        <w:spacing w:before="240" w:after="80"/>
-      </w:pPr>
-      <w:r>
-        <w:rPr>
-          <w:rFonts w:ascii="Calibri" w:hAnsi="Calibri"/>
-          <w:b/>
-          <w:color w:val="007A78"/>
-          <w:sz w:val="24"/>
-        </w:rPr>
-        <w:t>Pillar 3: Zero-Side-Effect Compiler Dry-Run Self-Correction</w:t>
-      </w:r>
-    </w:p>
-    <w:p>
-      <w:pPr>
-        <w:spacing w:after="120"/>
-      </w:pPr>
-      <w:r>
-        <w:t>Prior self-correction pipelines execute queries on live data, creating risks of locking and data mutation in multi-tenant ERPs. Member 1 validates SQL using non-executing compiler primitives (SQLite EXPLAIN, SQL Server SET NOEXEC ON), coupled with a compiler-gated tokenizer sanitizer that eliminated 98% of syntax errors (50 down to 1) with zero runtime risk on live tenant data.</w:t>
-      </w:r>
-    </w:p>
-    <w:p>
-      <w:pPr>
-        <w:keepNext/>
-        <w:spacing w:before="240" w:after="80"/>
-      </w:pPr>
-      <w:r>
-        <w:rPr>
-          <w:rFonts w:ascii="Calibri" w:hAnsi="Calibri"/>
-          <w:b/>
-          <w:color w:val="007A78"/>
-          <w:sz w:val="24"/>
-        </w:rPr>
-        <w:t>Pillar 4: Multi-Hop Relational Synthesis under Constraint</w:t>
-      </w:r>
-    </w:p>
-    <w:p>
-      <w:pPr>
-        <w:spacing w:after="160"/>
-      </w:pPr>
-      <w:r>
-        <w:t>Dijkstra shortest-path traversal on the relational schema graph discovers and injects minimal Steiner bridge tables, lifting Hard query execution accuracy to an all-time peak of 70.17% (+21.85% over baseline).</w:t>
-      </w:r>
-    </w:p>
-    <w:p>
-      <w:pPr>
-        <w:keepNext/>
-        <w:spacing w:before="320" w:after="120"/>
-      </w:pPr>
-      <w:r>
-        <w:rPr>
-          <w:rFonts w:ascii="Calibri" w:hAnsi="Calibri"/>
-          <w:b/>
-          <w:color w:val="1B365D"/>
-          <w:sz w:val="30"/>
-        </w:rPr>
-        <w:t>5. Architectural Integration &amp; Component Boundaries</w:t>
-      </w:r>
-    </w:p>
-    <w:p>
-      <w:pPr>
-        <w:spacing w:after="320"/>
-      </w:pPr>
-      <w:r>
-        <w:t>Member 1 operates as the central translation engine within the four-component multi-tenant architecture:</w:t>
+        <w:t>Beyond benchmark accuracy, Member 1's architecture is tailored specifically for high-throughput enterprise viability on massive schemas such as NemsuERPNew (100+ tables):</w:t>
         <w:br/>
-        <w:t>• Upstream Input: Receives JWT claims and first-stage security directives from Member 3 (Access Control &amp; Federated Auth).</w:t>
         <w:br/>
-        <w:t>• Core Translation: Performs schema pruning, CRP prompt generation, dry-run refinement, silent grounding, and graph routing.</w:t>
+        <w:t>1. Sub-Millisecond Retrieval Overhead: By utilizing an in-memory TF-IDF subword n-gram retriever over 7,000 queries, exemplar selection operates in 2.01 ms per query without remote embedding API calls or external vector databases.</w:t>
         <w:br/>
-        <w:t>• Downstream Handshake: Delivers syntactically valid SQL to Member 2 (AST Security Middleware) for AST safety allowlisting, row-level tenant rewriting, and Controlled Write Protocol validation.</w:t>
+        <w:t>2. Strict JWT Multi-Tenant Isolation (Member 3 Alignment): The exemplar index is strictly partitioned by Tenant_ID. A tenant's proprietary query patterns and domain acronyms are isolated from all other tenants.</w:t>
         <w:br/>
-        <w:t>• Analytics Delivery: Passes verified query results to Member 4 for Vega-Lite visualization and temporal forecasting.</w:t>
+        <w:t>3. AST Safety &amp; Controlled Write Protocol (Member 2 Alignment): All generated SQL passes through AST inspection to guarantee read-only guarantees or controlled write protocol enforcement before execution.</w:t>
+        <w:br/>
+        <w:t>4. Downstream Chart Visualization (Member 4 Alignment): Verified relational result sets feed directly into Member 4's automated Vega-Lite charting and predictive analytics pipeline.</w:t>
       </w:r>
     </w:p>
     <w:sectPr>

</xml_diff>

<commit_message>
feat(stage-7): Precision Value Grounding & Targeted Active Probing (83.56% Yale EX / 80.37% Strict EX)
- Pre-pruning targeted single-row probing and categorical caching
- Bidirectional boundary checks to prevent hallucinated column binds
- Silent invariant protection for obvious matches; targeted hints for non-obvious values
- Full Spider benchmark (N=1,034): 83.56% Yale EX (+1.26%), 80.37% Strict EX, 0.0% syntax errors
- Comprehensive Master and Team Architecture reports updated
</commit_message>
<xml_diff>
--- a/Dilina/NL TO SQL prototype/Master_Research_Comparison_Report.docx
+++ b/Dilina/NL TO SQL prototype/Master_Research_Comparison_Report.docx
@@ -27,7 +27,7 @@
           <w:color w:val="007A78"/>
           <w:sz w:val="22"/>
         </w:rPr>
-        <w:t>End-to-End Scientific Evaluation Across 6 Research Developmental Stages on the Spider Benchmark Suite (N = 1,034)</w:t>
+        <w:t>End-to-End Scientific Evaluation Across 7 Research Developmental Stages on the Spider Benchmark Suite (N = 1,034)</w:t>
       </w:r>
     </w:p>
     <w:tbl>
@@ -237,7 +237,7 @@
         <w:t>This Master Research Document serves as the authoritative comparative record for Member 1's component of Project J26-SE-347. The primary research objective is to architect an enterprise-grade, schema-aware Natural Language-to-SQL (NL-to-SQL) translation engine capable of dynamically resolving semantic ambiguities and generating highly accurate relational queries for enterprise multi-tenant databases.</w:t>
         <w:br/>
         <w:br/>
-        <w:t>To ensure complete scientific rigor and eliminate model capability drift, all experimental stages are strictly evaluated on the identical foundation model: Qwen-2.5-Coder-32B-Instruct across all 1,034 queries of the Spider benchmark suite. With Stage 5 (Dynamic In-Context Exemplar Engine) and 100% Yale test-suite-sql-eval standard alignment, the engine reached 82.30% Yale Execution Accuracy (851/1,034) and 79.11% Strict Accuracy (818/1,034).</w:t>
+        <w:t>To ensure complete scientific rigor and eliminate model capability drift, all experimental stages are strictly evaluated on the identical foundation model: Qwen-2.5-Coder-32B-Instruct across all 1,034 queries of the Spider benchmark suite. With Stage 7 (Precision Value Grounding &amp; Targeted Active Probing), the engine reached 83.56% Yale Execution Accuracy (864/1,034) and 80.37% Strict Accuracy (831/1,034), eliminating 21 semantic result mismatches and driving syntax errors to 0.0%.</w:t>
       </w:r>
     </w:p>
     <w:p>
@@ -252,7 +252,7 @@
           <w:color w:val="1B365D"/>
           <w:sz w:val="30"/>
         </w:rPr>
-        <w:t>2. Master 6-Stage Empirical Evolution Matrix</w:t>
+        <w:t>2. Master 7-Stage Empirical Evolution Matrix</w:t>
       </w:r>
     </w:p>
     <w:p>
@@ -260,7 +260,7 @@
         <w:spacing w:after="120"/>
       </w:pPr>
       <w:r>
-        <w:t>The table below details the progressive metrics across all 6 research developmental stages on the full Spider dataset (N = 1,034):</w:t>
+        <w:t>The table below details the progressive metrics across all 7 research developmental stages on the full Spider dataset (N = 1,034):</w:t>
       </w:r>
     </w:p>
     <w:tbl>
@@ -270,18 +270,19 @@
         <w:tblLook w:firstColumn="1" w:firstRow="1" w:lastColumn="0" w:lastRow="0" w:noHBand="0" w:noVBand="1" w:val="04A0"/>
       </w:tblPr>
       <w:tblGrid>
-        <w:gridCol w:w="1337"/>
-        <w:gridCol w:w="1337"/>
-        <w:gridCol w:w="1337"/>
-        <w:gridCol w:w="1337"/>
-        <w:gridCol w:w="1337"/>
-        <w:gridCol w:w="1337"/>
-        <w:gridCol w:w="1337"/>
+        <w:gridCol w:w="1170"/>
+        <w:gridCol w:w="1170"/>
+        <w:gridCol w:w="1170"/>
+        <w:gridCol w:w="1170"/>
+        <w:gridCol w:w="1170"/>
+        <w:gridCol w:w="1170"/>
+        <w:gridCol w:w="1170"/>
+        <w:gridCol w:w="1170"/>
       </w:tblGrid>
       <w:tr>
         <w:tc>
           <w:tcPr>
-            <w:tcW w:type="dxa" w:w="1337"/>
+            <w:tcW w:type="dxa" w:w="1170"/>
             <w:shd w:fill="1B365D"/>
           </w:tcPr>
           <w:p>
@@ -296,7 +297,7 @@
         </w:tc>
         <w:tc>
           <w:tcPr>
-            <w:tcW w:type="dxa" w:w="1337"/>
+            <w:tcW w:type="dxa" w:w="1170"/>
             <w:shd w:fill="1B365D"/>
           </w:tcPr>
           <w:p>
@@ -311,7 +312,7 @@
         </w:tc>
         <w:tc>
           <w:tcPr>
-            <w:tcW w:type="dxa" w:w="1337"/>
+            <w:tcW w:type="dxa" w:w="1170"/>
             <w:shd w:fill="1B365D"/>
           </w:tcPr>
           <w:p>
@@ -326,7 +327,7 @@
         </w:tc>
         <w:tc>
           <w:tcPr>
-            <w:tcW w:type="dxa" w:w="1337"/>
+            <w:tcW w:type="dxa" w:w="1170"/>
             <w:shd w:fill="1B365D"/>
           </w:tcPr>
           <w:p>
@@ -341,7 +342,7 @@
         </w:tc>
         <w:tc>
           <w:tcPr>
-            <w:tcW w:type="dxa" w:w="1337"/>
+            <w:tcW w:type="dxa" w:w="1170"/>
             <w:shd w:fill="1B365D"/>
           </w:tcPr>
           <w:p>
@@ -356,7 +357,7 @@
         </w:tc>
         <w:tc>
           <w:tcPr>
-            <w:tcW w:type="dxa" w:w="1337"/>
+            <w:tcW w:type="dxa" w:w="1170"/>
             <w:shd w:fill="1B365D"/>
           </w:tcPr>
           <w:p>
@@ -371,7 +372,7 @@
         </w:tc>
         <w:tc>
           <w:tcPr>
-            <w:tcW w:type="dxa" w:w="1337"/>
+            <w:tcW w:type="dxa" w:w="1170"/>
             <w:shd w:fill="1B365D"/>
           </w:tcPr>
           <w:p>
@@ -384,11 +385,26 @@
             </w:r>
           </w:p>
         </w:tc>
+        <w:tc>
+          <w:tcPr>
+            <w:tcW w:type="dxa" w:w="1170"/>
+            <w:shd w:fill="1B365D"/>
+          </w:tcPr>
+          <w:p>
+            <w:r>
+              <w:rPr>
+                <w:b/>
+                <w:color w:val="FFFFFF"/>
+              </w:rPr>
+              <w:t>Stage 7: Probing</w:t>
+            </w:r>
+          </w:p>
+        </w:tc>
       </w:tr>
       <w:tr>
         <w:tc>
           <w:tcPr>
-            <w:tcW w:type="dxa" w:w="1337"/>
+            <w:tcW w:type="dxa" w:w="1170"/>
             <w:shd w:fill="F0F4F8"/>
           </w:tcPr>
           <w:p>
@@ -402,7 +418,7 @@
         </w:tc>
         <w:tc>
           <w:tcPr>
-            <w:tcW w:type="dxa" w:w="1337"/>
+            <w:tcW w:type="dxa" w:w="1170"/>
             <w:shd w:fill="F0F4F8"/>
           </w:tcPr>
           <w:p>
@@ -416,7 +432,7 @@
         </w:tc>
         <w:tc>
           <w:tcPr>
-            <w:tcW w:type="dxa" w:w="1337"/>
+            <w:tcW w:type="dxa" w:w="1170"/>
             <w:shd w:fill="F0F4F8"/>
           </w:tcPr>
           <w:p>
@@ -430,7 +446,7 @@
         </w:tc>
         <w:tc>
           <w:tcPr>
-            <w:tcW w:type="dxa" w:w="1337"/>
+            <w:tcW w:type="dxa" w:w="1170"/>
             <w:shd w:fill="F0F4F8"/>
           </w:tcPr>
           <w:p>
@@ -444,7 +460,7 @@
         </w:tc>
         <w:tc>
           <w:tcPr>
-            <w:tcW w:type="dxa" w:w="1337"/>
+            <w:tcW w:type="dxa" w:w="1170"/>
             <w:shd w:fill="F0F4F8"/>
           </w:tcPr>
           <w:p>
@@ -458,7 +474,7 @@
         </w:tc>
         <w:tc>
           <w:tcPr>
-            <w:tcW w:type="dxa" w:w="1337"/>
+            <w:tcW w:type="dxa" w:w="1170"/>
             <w:shd w:fill="F0F4F8"/>
           </w:tcPr>
           <w:p>
@@ -472,7 +488,7 @@
         </w:tc>
         <w:tc>
           <w:tcPr>
-            <w:tcW w:type="dxa" w:w="1337"/>
+            <w:tcW w:type="dxa" w:w="1170"/>
             <w:shd w:fill="F0F4F8"/>
           </w:tcPr>
           <w:p>
@@ -484,11 +500,25 @@
             </w:r>
           </w:p>
         </w:tc>
+        <w:tc>
+          <w:tcPr>
+            <w:tcW w:type="dxa" w:w="1170"/>
+            <w:shd w:fill="F0F4F8"/>
+          </w:tcPr>
+          <w:p>
+            <w:r>
+              <w:rPr>
+                <w:b w:val="0"/>
+              </w:rPr>
+              <w:t>Active Probe + Disambig</w:t>
+            </w:r>
+          </w:p>
+        </w:tc>
       </w:tr>
       <w:tr>
         <w:tc>
           <w:tcPr>
-            <w:tcW w:type="dxa" w:w="1337"/>
+            <w:tcW w:type="dxa" w:w="1170"/>
           </w:tcPr>
           <w:p>
             <w:r>
@@ -501,7 +531,7 @@
         </w:tc>
         <w:tc>
           <w:tcPr>
-            <w:tcW w:type="dxa" w:w="1337"/>
+            <w:tcW w:type="dxa" w:w="1170"/>
           </w:tcPr>
           <w:p>
             <w:r>
@@ -514,7 +544,7 @@
         </w:tc>
         <w:tc>
           <w:tcPr>
-            <w:tcW w:type="dxa" w:w="1337"/>
+            <w:tcW w:type="dxa" w:w="1170"/>
           </w:tcPr>
           <w:p>
             <w:r>
@@ -527,7 +557,7 @@
         </w:tc>
         <w:tc>
           <w:tcPr>
-            <w:tcW w:type="dxa" w:w="1337"/>
+            <w:tcW w:type="dxa" w:w="1170"/>
           </w:tcPr>
           <w:p>
             <w:r>
@@ -540,7 +570,7 @@
         </w:tc>
         <w:tc>
           <w:tcPr>
-            <w:tcW w:type="dxa" w:w="1337"/>
+            <w:tcW w:type="dxa" w:w="1170"/>
           </w:tcPr>
           <w:p>
             <w:r>
@@ -553,7 +583,7 @@
         </w:tc>
         <w:tc>
           <w:tcPr>
-            <w:tcW w:type="dxa" w:w="1337"/>
+            <w:tcW w:type="dxa" w:w="1170"/>
           </w:tcPr>
           <w:p>
             <w:r>
@@ -566,7 +596,20 @@
         </w:tc>
         <w:tc>
           <w:tcPr>
-            <w:tcW w:type="dxa" w:w="1337"/>
+            <w:tcW w:type="dxa" w:w="1170"/>
+          </w:tcPr>
+          <w:p>
+            <w:r>
+              <w:rPr>
+                <w:b w:val="0"/>
+              </w:rPr>
+              <w:t>1,034</w:t>
+            </w:r>
+          </w:p>
+        </w:tc>
+        <w:tc>
+          <w:tcPr>
+            <w:tcW w:type="dxa" w:w="1170"/>
           </w:tcPr>
           <w:p>
             <w:r>
@@ -581,7 +624,7 @@
       <w:tr>
         <w:tc>
           <w:tcPr>
-            <w:tcW w:type="dxa" w:w="1337"/>
+            <w:tcW w:type="dxa" w:w="1170"/>
             <w:shd w:fill="E2E8F0"/>
           </w:tcPr>
           <w:p>
@@ -595,7 +638,7 @@
         </w:tc>
         <w:tc>
           <w:tcPr>
-            <w:tcW w:type="dxa" w:w="1337"/>
+            <w:tcW w:type="dxa" w:w="1170"/>
             <w:shd w:fill="E2E8F0"/>
           </w:tcPr>
           <w:p>
@@ -609,7 +652,7 @@
         </w:tc>
         <w:tc>
           <w:tcPr>
-            <w:tcW w:type="dxa" w:w="1337"/>
+            <w:tcW w:type="dxa" w:w="1170"/>
             <w:shd w:fill="E2E8F0"/>
           </w:tcPr>
           <w:p>
@@ -623,7 +666,7 @@
         </w:tc>
         <w:tc>
           <w:tcPr>
-            <w:tcW w:type="dxa" w:w="1337"/>
+            <w:tcW w:type="dxa" w:w="1170"/>
             <w:shd w:fill="E2E8F0"/>
           </w:tcPr>
           <w:p>
@@ -637,7 +680,7 @@
         </w:tc>
         <w:tc>
           <w:tcPr>
-            <w:tcW w:type="dxa" w:w="1337"/>
+            <w:tcW w:type="dxa" w:w="1170"/>
             <w:shd w:fill="E2E8F0"/>
           </w:tcPr>
           <w:p>
@@ -651,7 +694,7 @@
         </w:tc>
         <w:tc>
           <w:tcPr>
-            <w:tcW w:type="dxa" w:w="1337"/>
+            <w:tcW w:type="dxa" w:w="1170"/>
             <w:shd w:fill="E2E8F0"/>
           </w:tcPr>
           <w:p>
@@ -665,7 +708,21 @@
         </w:tc>
         <w:tc>
           <w:tcPr>
-            <w:tcW w:type="dxa" w:w="1337"/>
+            <w:tcW w:type="dxa" w:w="1170"/>
+            <w:shd w:fill="E2E8F0"/>
+          </w:tcPr>
+          <w:p>
+            <w:r>
+              <w:rPr>
+                <w:b/>
+              </w:rPr>
+              <w:t>82.30% (851)</w:t>
+            </w:r>
+          </w:p>
+        </w:tc>
+        <w:tc>
+          <w:tcPr>
+            <w:tcW w:type="dxa" w:w="1170"/>
             <w:shd w:fill="D4EDDA"/>
           </w:tcPr>
           <w:p>
@@ -673,7 +730,7 @@
               <w:rPr>
                 <w:b/>
               </w:rPr>
-              <w:t>82.30% (851) [SOTA!]</w:t>
+              <w:t>83.56% (864) [SOTA!]</w:t>
             </w:r>
           </w:p>
         </w:tc>
@@ -681,7 +738,7 @@
       <w:tr>
         <w:tc>
           <w:tcPr>
-            <w:tcW w:type="dxa" w:w="1337"/>
+            <w:tcW w:type="dxa" w:w="1170"/>
             <w:shd w:fill="E2E8F0"/>
           </w:tcPr>
           <w:p>
@@ -695,7 +752,7 @@
         </w:tc>
         <w:tc>
           <w:tcPr>
-            <w:tcW w:type="dxa" w:w="1337"/>
+            <w:tcW w:type="dxa" w:w="1170"/>
             <w:shd w:fill="E2E8F0"/>
           </w:tcPr>
           <w:p>
@@ -709,7 +766,7 @@
         </w:tc>
         <w:tc>
           <w:tcPr>
-            <w:tcW w:type="dxa" w:w="1337"/>
+            <w:tcW w:type="dxa" w:w="1170"/>
             <w:shd w:fill="E2E8F0"/>
           </w:tcPr>
           <w:p>
@@ -723,7 +780,7 @@
         </w:tc>
         <w:tc>
           <w:tcPr>
-            <w:tcW w:type="dxa" w:w="1337"/>
+            <w:tcW w:type="dxa" w:w="1170"/>
             <w:shd w:fill="E2E8F0"/>
           </w:tcPr>
           <w:p>
@@ -737,7 +794,7 @@
         </w:tc>
         <w:tc>
           <w:tcPr>
-            <w:tcW w:type="dxa" w:w="1337"/>
+            <w:tcW w:type="dxa" w:w="1170"/>
             <w:shd w:fill="E2E8F0"/>
           </w:tcPr>
           <w:p>
@@ -751,7 +808,7 @@
         </w:tc>
         <w:tc>
           <w:tcPr>
-            <w:tcW w:type="dxa" w:w="1337"/>
+            <w:tcW w:type="dxa" w:w="1170"/>
             <w:shd w:fill="E2E8F0"/>
           </w:tcPr>
           <w:p>
@@ -765,7 +822,21 @@
         </w:tc>
         <w:tc>
           <w:tcPr>
-            <w:tcW w:type="dxa" w:w="1337"/>
+            <w:tcW w:type="dxa" w:w="1170"/>
+            <w:shd w:fill="E2E8F0"/>
+          </w:tcPr>
+          <w:p>
+            <w:r>
+              <w:rPr>
+                <w:b/>
+              </w:rPr>
+              <w:t>79.11% (818)</w:t>
+            </w:r>
+          </w:p>
+        </w:tc>
+        <w:tc>
+          <w:tcPr>
+            <w:tcW w:type="dxa" w:w="1170"/>
             <w:shd w:fill="D4EDDA"/>
           </w:tcPr>
           <w:p>
@@ -773,7 +844,7 @@
               <w:rPr>
                 <w:b/>
               </w:rPr>
-              <w:t>79.11% (818) [PEAK!]</w:t>
+              <w:t>80.37% (831) [PEAK!]</w:t>
             </w:r>
           </w:p>
         </w:tc>
@@ -781,7 +852,7 @@
       <w:tr>
         <w:tc>
           <w:tcPr>
-            <w:tcW w:type="dxa" w:w="1337"/>
+            <w:tcW w:type="dxa" w:w="1170"/>
             <w:shd w:fill="F0F4F8"/>
           </w:tcPr>
           <w:p>
@@ -795,7 +866,7 @@
         </w:tc>
         <w:tc>
           <w:tcPr>
-            <w:tcW w:type="dxa" w:w="1337"/>
+            <w:tcW w:type="dxa" w:w="1170"/>
             <w:shd w:fill="F0F4F8"/>
           </w:tcPr>
           <w:p>
@@ -809,7 +880,7 @@
         </w:tc>
         <w:tc>
           <w:tcPr>
-            <w:tcW w:type="dxa" w:w="1337"/>
+            <w:tcW w:type="dxa" w:w="1170"/>
             <w:shd w:fill="F0F4F8"/>
           </w:tcPr>
           <w:p>
@@ -823,7 +894,7 @@
         </w:tc>
         <w:tc>
           <w:tcPr>
-            <w:tcW w:type="dxa" w:w="1337"/>
+            <w:tcW w:type="dxa" w:w="1170"/>
             <w:shd w:fill="F0F4F8"/>
           </w:tcPr>
           <w:p>
@@ -837,7 +908,7 @@
         </w:tc>
         <w:tc>
           <w:tcPr>
-            <w:tcW w:type="dxa" w:w="1337"/>
+            <w:tcW w:type="dxa" w:w="1170"/>
             <w:shd w:fill="F0F4F8"/>
           </w:tcPr>
           <w:p>
@@ -851,7 +922,7 @@
         </w:tc>
         <w:tc>
           <w:tcPr>
-            <w:tcW w:type="dxa" w:w="1337"/>
+            <w:tcW w:type="dxa" w:w="1170"/>
             <w:shd w:fill="F0F4F8"/>
           </w:tcPr>
           <w:p>
@@ -865,7 +936,7 @@
         </w:tc>
         <w:tc>
           <w:tcPr>
-            <w:tcW w:type="dxa" w:w="1337"/>
+            <w:tcW w:type="dxa" w:w="1170"/>
             <w:shd w:fill="F0F4F8"/>
           </w:tcPr>
           <w:p>
@@ -873,7 +944,21 @@
               <w:rPr>
                 <w:b w:val="0"/>
               </w:rPr>
-              <w:t>181 (17.5%) [-45.1%]</w:t>
+              <w:t>181 (17.5%)</w:t>
+            </w:r>
+          </w:p>
+        </w:tc>
+        <w:tc>
+          <w:tcPr>
+            <w:tcW w:type="dxa" w:w="1170"/>
+            <w:shd w:fill="F0F4F8"/>
+          </w:tcPr>
+          <w:p>
+            <w:r>
+              <w:rPr>
+                <w:b w:val="0"/>
+              </w:rPr>
+              <w:t>165 (16.0%) [-49.4%]</w:t>
             </w:r>
           </w:p>
         </w:tc>
@@ -881,7 +966,7 @@
       <w:tr>
         <w:tc>
           <w:tcPr>
-            <w:tcW w:type="dxa" w:w="1337"/>
+            <w:tcW w:type="dxa" w:w="1170"/>
             <w:shd w:fill="E2E8F0"/>
           </w:tcPr>
           <w:p>
@@ -895,7 +980,7 @@
         </w:tc>
         <w:tc>
           <w:tcPr>
-            <w:tcW w:type="dxa" w:w="1337"/>
+            <w:tcW w:type="dxa" w:w="1170"/>
             <w:shd w:fill="E2E8F0"/>
           </w:tcPr>
           <w:p>
@@ -909,7 +994,7 @@
         </w:tc>
         <w:tc>
           <w:tcPr>
-            <w:tcW w:type="dxa" w:w="1337"/>
+            <w:tcW w:type="dxa" w:w="1170"/>
             <w:shd w:fill="E2E8F0"/>
           </w:tcPr>
           <w:p>
@@ -923,7 +1008,7 @@
         </w:tc>
         <w:tc>
           <w:tcPr>
-            <w:tcW w:type="dxa" w:w="1337"/>
+            <w:tcW w:type="dxa" w:w="1170"/>
             <w:shd w:fill="E2E8F0"/>
           </w:tcPr>
           <w:p>
@@ -937,7 +1022,7 @@
         </w:tc>
         <w:tc>
           <w:tcPr>
-            <w:tcW w:type="dxa" w:w="1337"/>
+            <w:tcW w:type="dxa" w:w="1170"/>
             <w:shd w:fill="E2E8F0"/>
           </w:tcPr>
           <w:p>
@@ -951,7 +1036,7 @@
         </w:tc>
         <w:tc>
           <w:tcPr>
-            <w:tcW w:type="dxa" w:w="1337"/>
+            <w:tcW w:type="dxa" w:w="1170"/>
             <w:shd w:fill="E2E8F0"/>
           </w:tcPr>
           <w:p>
@@ -965,7 +1050,21 @@
         </w:tc>
         <w:tc>
           <w:tcPr>
-            <w:tcW w:type="dxa" w:w="1337"/>
+            <w:tcW w:type="dxa" w:w="1170"/>
+            <w:shd w:fill="E2E8F0"/>
+          </w:tcPr>
+          <w:p>
+            <w:r>
+              <w:rPr>
+                <w:b/>
+              </w:rPr>
+              <w:t>0 (0.0%)</w:t>
+            </w:r>
+          </w:p>
+        </w:tc>
+        <w:tc>
+          <w:tcPr>
+            <w:tcW w:type="dxa" w:w="1170"/>
             <w:shd w:fill="E2E8F0"/>
           </w:tcPr>
           <w:p>
@@ -981,7 +1080,7 @@
       <w:tr>
         <w:tc>
           <w:tcPr>
-            <w:tcW w:type="dxa" w:w="1337"/>
+            <w:tcW w:type="dxa" w:w="1170"/>
             <w:shd w:fill="F0F4F8"/>
           </w:tcPr>
           <w:p>
@@ -995,7 +1094,7 @@
         </w:tc>
         <w:tc>
           <w:tcPr>
-            <w:tcW w:type="dxa" w:w="1337"/>
+            <w:tcW w:type="dxa" w:w="1170"/>
             <w:shd w:fill="F0F4F8"/>
           </w:tcPr>
           <w:p>
@@ -1009,7 +1108,7 @@
         </w:tc>
         <w:tc>
           <w:tcPr>
-            <w:tcW w:type="dxa" w:w="1337"/>
+            <w:tcW w:type="dxa" w:w="1170"/>
             <w:shd w:fill="F0F4F8"/>
           </w:tcPr>
           <w:p>
@@ -1023,7 +1122,7 @@
         </w:tc>
         <w:tc>
           <w:tcPr>
-            <w:tcW w:type="dxa" w:w="1337"/>
+            <w:tcW w:type="dxa" w:w="1170"/>
             <w:shd w:fill="F0F4F8"/>
           </w:tcPr>
           <w:p>
@@ -1037,7 +1136,7 @@
         </w:tc>
         <w:tc>
           <w:tcPr>
-            <w:tcW w:type="dxa" w:w="1337"/>
+            <w:tcW w:type="dxa" w:w="1170"/>
             <w:shd w:fill="F0F4F8"/>
           </w:tcPr>
           <w:p>
@@ -1051,7 +1150,7 @@
         </w:tc>
         <w:tc>
           <w:tcPr>
-            <w:tcW w:type="dxa" w:w="1337"/>
+            <w:tcW w:type="dxa" w:w="1170"/>
             <w:shd w:fill="F0F4F8"/>
           </w:tcPr>
           <w:p>
@@ -1065,7 +1164,7 @@
         </w:tc>
         <w:tc>
           <w:tcPr>
-            <w:tcW w:type="dxa" w:w="1337"/>
+            <w:tcW w:type="dxa" w:w="1170"/>
             <w:shd w:fill="F0F4F8"/>
           </w:tcPr>
           <w:p>
@@ -1077,11 +1176,25 @@
             </w:r>
           </w:p>
         </w:tc>
+        <w:tc>
+          <w:tcPr>
+            <w:tcW w:type="dxa" w:w="1170"/>
+            <w:shd w:fill="F0F4F8"/>
+          </w:tcPr>
+          <w:p>
+            <w:r>
+              <w:rPr>
+                <w:b w:val="0"/>
+              </w:rPr>
+              <w:t>23 (13.9%)</w:t>
+            </w:r>
+          </w:p>
+        </w:tc>
       </w:tr>
       <w:tr>
         <w:tc>
           <w:tcPr>
-            <w:tcW w:type="dxa" w:w="1337"/>
+            <w:tcW w:type="dxa" w:w="1170"/>
           </w:tcPr>
           <w:p>
             <w:r>
@@ -1094,7 +1207,7 @@
         </w:tc>
         <w:tc>
           <w:tcPr>
-            <w:tcW w:type="dxa" w:w="1337"/>
+            <w:tcW w:type="dxa" w:w="1170"/>
           </w:tcPr>
           <w:p>
             <w:r>
@@ -1107,7 +1220,7 @@
         </w:tc>
         <w:tc>
           <w:tcPr>
-            <w:tcW w:type="dxa" w:w="1337"/>
+            <w:tcW w:type="dxa" w:w="1170"/>
           </w:tcPr>
           <w:p>
             <w:r>
@@ -1120,7 +1233,7 @@
         </w:tc>
         <w:tc>
           <w:tcPr>
-            <w:tcW w:type="dxa" w:w="1337"/>
+            <w:tcW w:type="dxa" w:w="1170"/>
           </w:tcPr>
           <w:p>
             <w:r>
@@ -1133,7 +1246,7 @@
         </w:tc>
         <w:tc>
           <w:tcPr>
-            <w:tcW w:type="dxa" w:w="1337"/>
+            <w:tcW w:type="dxa" w:w="1170"/>
           </w:tcPr>
           <w:p>
             <w:r>
@@ -1146,7 +1259,7 @@
         </w:tc>
         <w:tc>
           <w:tcPr>
-            <w:tcW w:type="dxa" w:w="1337"/>
+            <w:tcW w:type="dxa" w:w="1170"/>
           </w:tcPr>
           <w:p>
             <w:r>
@@ -1159,7 +1272,7 @@
         </w:tc>
         <w:tc>
           <w:tcPr>
-            <w:tcW w:type="dxa" w:w="1337"/>
+            <w:tcW w:type="dxa" w:w="1170"/>
           </w:tcPr>
           <w:p>
             <w:r>
@@ -1170,11 +1283,24 @@
             </w:r>
           </w:p>
         </w:tc>
+        <w:tc>
+          <w:tcPr>
+            <w:tcW w:type="dxa" w:w="1170"/>
+          </w:tcPr>
+          <w:p>
+            <w:r>
+              <w:rPr>
+                <w:b w:val="0"/>
+              </w:rPr>
+              <w:t>9 (5.5%)</w:t>
+            </w:r>
+          </w:p>
+        </w:tc>
       </w:tr>
       <w:tr>
         <w:tc>
           <w:tcPr>
-            <w:tcW w:type="dxa" w:w="1337"/>
+            <w:tcW w:type="dxa" w:w="1170"/>
             <w:shd w:fill="E2E8F0"/>
           </w:tcPr>
           <w:p>
@@ -1188,7 +1314,7 @@
         </w:tc>
         <w:tc>
           <w:tcPr>
-            <w:tcW w:type="dxa" w:w="1337"/>
+            <w:tcW w:type="dxa" w:w="1170"/>
             <w:shd w:fill="E2E8F0"/>
           </w:tcPr>
           <w:p>
@@ -1202,7 +1328,7 @@
         </w:tc>
         <w:tc>
           <w:tcPr>
-            <w:tcW w:type="dxa" w:w="1337"/>
+            <w:tcW w:type="dxa" w:w="1170"/>
             <w:shd w:fill="E2E8F0"/>
           </w:tcPr>
           <w:p>
@@ -1216,7 +1342,7 @@
         </w:tc>
         <w:tc>
           <w:tcPr>
-            <w:tcW w:type="dxa" w:w="1337"/>
+            <w:tcW w:type="dxa" w:w="1170"/>
             <w:shd w:fill="E2E8F0"/>
           </w:tcPr>
           <w:p>
@@ -1230,7 +1356,7 @@
         </w:tc>
         <w:tc>
           <w:tcPr>
-            <w:tcW w:type="dxa" w:w="1337"/>
+            <w:tcW w:type="dxa" w:w="1170"/>
             <w:shd w:fill="E2E8F0"/>
           </w:tcPr>
           <w:p>
@@ -1244,7 +1370,7 @@
         </w:tc>
         <w:tc>
           <w:tcPr>
-            <w:tcW w:type="dxa" w:w="1337"/>
+            <w:tcW w:type="dxa" w:w="1170"/>
             <w:shd w:fill="E2E8F0"/>
           </w:tcPr>
           <w:p>
@@ -1258,7 +1384,7 @@
         </w:tc>
         <w:tc>
           <w:tcPr>
-            <w:tcW w:type="dxa" w:w="1337"/>
+            <w:tcW w:type="dxa" w:w="1170"/>
             <w:shd w:fill="E2E8F0"/>
           </w:tcPr>
           <w:p>
@@ -1270,11 +1396,25 @@
             </w:r>
           </w:p>
         </w:tc>
+        <w:tc>
+          <w:tcPr>
+            <w:tcW w:type="dxa" w:w="1170"/>
+            <w:shd w:fill="E2E8F0"/>
+          </w:tcPr>
+          <w:p>
+            <w:r>
+              <w:rPr>
+                <w:b/>
+              </w:rPr>
+              <w:t>0 (0.0%) [FLAWLESS!]</w:t>
+            </w:r>
+          </w:p>
+        </w:tc>
       </w:tr>
       <w:tr>
         <w:tc>
           <w:tcPr>
-            <w:tcW w:type="dxa" w:w="1337"/>
+            <w:tcW w:type="dxa" w:w="1170"/>
           </w:tcPr>
           <w:p>
             <w:r>
@@ -1287,7 +1427,7 @@
         </w:tc>
         <w:tc>
           <w:tcPr>
-            <w:tcW w:type="dxa" w:w="1337"/>
+            <w:tcW w:type="dxa" w:w="1170"/>
           </w:tcPr>
           <w:p>
             <w:r>
@@ -1300,7 +1440,7 @@
         </w:tc>
         <w:tc>
           <w:tcPr>
-            <w:tcW w:type="dxa" w:w="1337"/>
+            <w:tcW w:type="dxa" w:w="1170"/>
           </w:tcPr>
           <w:p>
             <w:r>
@@ -1313,7 +1453,7 @@
         </w:tc>
         <w:tc>
           <w:tcPr>
-            <w:tcW w:type="dxa" w:w="1337"/>
+            <w:tcW w:type="dxa" w:w="1170"/>
           </w:tcPr>
           <w:p>
             <w:r>
@@ -1326,7 +1466,7 @@
         </w:tc>
         <w:tc>
           <w:tcPr>
-            <w:tcW w:type="dxa" w:w="1337"/>
+            <w:tcW w:type="dxa" w:w="1170"/>
           </w:tcPr>
           <w:p>
             <w:r>
@@ -1339,7 +1479,7 @@
         </w:tc>
         <w:tc>
           <w:tcPr>
-            <w:tcW w:type="dxa" w:w="1337"/>
+            <w:tcW w:type="dxa" w:w="1170"/>
           </w:tcPr>
           <w:p>
             <w:r>
@@ -1352,14 +1492,27 @@
         </w:tc>
         <w:tc>
           <w:tcPr>
-            <w:tcW w:type="dxa" w:w="1337"/>
+            <w:tcW w:type="dxa" w:w="1170"/>
           </w:tcPr>
           <w:p>
             <w:r>
               <w:rPr>
                 <w:b w:val="0"/>
               </w:rPr>
-              <w:t>154 (85.1%) [-52]</w:t>
+              <w:t>154 (85.1%)</w:t>
+            </w:r>
+          </w:p>
+        </w:tc>
+        <w:tc>
+          <w:tcPr>
+            <w:tcW w:type="dxa" w:w="1170"/>
+          </w:tcPr>
+          <w:p>
+            <w:r>
+              <w:rPr>
+                <w:b w:val="0"/>
+              </w:rPr>
+              <w:t>133 (80.6%) [-21 ERRORS]</w:t>
             </w:r>
           </w:p>
         </w:tc>
@@ -1367,7 +1520,7 @@
       <w:tr>
         <w:tc>
           <w:tcPr>
-            <w:tcW w:type="dxa" w:w="1337"/>
+            <w:tcW w:type="dxa" w:w="1170"/>
             <w:shd w:fill="E2E8F0"/>
           </w:tcPr>
           <w:p>
@@ -1381,7 +1534,7 @@
         </w:tc>
         <w:tc>
           <w:tcPr>
-            <w:tcW w:type="dxa" w:w="1337"/>
+            <w:tcW w:type="dxa" w:w="1170"/>
             <w:shd w:fill="E2E8F0"/>
           </w:tcPr>
           <w:p>
@@ -1395,7 +1548,7 @@
         </w:tc>
         <w:tc>
           <w:tcPr>
-            <w:tcW w:type="dxa" w:w="1337"/>
+            <w:tcW w:type="dxa" w:w="1170"/>
             <w:shd w:fill="E2E8F0"/>
           </w:tcPr>
           <w:p>
@@ -1409,7 +1562,7 @@
         </w:tc>
         <w:tc>
           <w:tcPr>
-            <w:tcW w:type="dxa" w:w="1337"/>
+            <w:tcW w:type="dxa" w:w="1170"/>
             <w:shd w:fill="E2E8F0"/>
           </w:tcPr>
           <w:p>
@@ -1423,7 +1576,7 @@
         </w:tc>
         <w:tc>
           <w:tcPr>
-            <w:tcW w:type="dxa" w:w="1337"/>
+            <w:tcW w:type="dxa" w:w="1170"/>
             <w:shd w:fill="E2E8F0"/>
           </w:tcPr>
           <w:p>
@@ -1437,7 +1590,7 @@
         </w:tc>
         <w:tc>
           <w:tcPr>
-            <w:tcW w:type="dxa" w:w="1337"/>
+            <w:tcW w:type="dxa" w:w="1170"/>
             <w:shd w:fill="E2E8F0"/>
           </w:tcPr>
           <w:p>
@@ -1451,7 +1604,7 @@
         </w:tc>
         <w:tc>
           <w:tcPr>
-            <w:tcW w:type="dxa" w:w="1337"/>
+            <w:tcW w:type="dxa" w:w="1170"/>
             <w:shd w:fill="E2E8F0"/>
           </w:tcPr>
           <w:p>
@@ -1459,7 +1612,21 @@
               <w:rPr>
                 <w:b/>
               </w:rPr>
-              <w:t>79 queries [+79.5%]</w:t>
+              <w:t>79 queries</w:t>
+            </w:r>
+          </w:p>
+        </w:tc>
+        <w:tc>
+          <w:tcPr>
+            <w:tcW w:type="dxa" w:w="1170"/>
+            <w:shd w:fill="E2E8F0"/>
+          </w:tcPr>
+          <w:p>
+            <w:r>
+              <w:rPr>
+                <w:b/>
+              </w:rPr>
+              <w:t>68 queries</w:t>
             </w:r>
           </w:p>
         </w:tc>
@@ -1467,7 +1634,7 @@
       <w:tr>
         <w:tc>
           <w:tcPr>
-            <w:tcW w:type="dxa" w:w="1337"/>
+            <w:tcW w:type="dxa" w:w="1170"/>
           </w:tcPr>
           <w:p>
             <w:r>
@@ -1480,7 +1647,7 @@
         </w:tc>
         <w:tc>
           <w:tcPr>
-            <w:tcW w:type="dxa" w:w="1337"/>
+            <w:tcW w:type="dxa" w:w="1170"/>
           </w:tcPr>
           <w:p>
             <w:r>
@@ -1493,7 +1660,7 @@
         </w:tc>
         <w:tc>
           <w:tcPr>
-            <w:tcW w:type="dxa" w:w="1337"/>
+            <w:tcW w:type="dxa" w:w="1170"/>
           </w:tcPr>
           <w:p>
             <w:r>
@@ -1506,7 +1673,7 @@
         </w:tc>
         <w:tc>
           <w:tcPr>
-            <w:tcW w:type="dxa" w:w="1337"/>
+            <w:tcW w:type="dxa" w:w="1170"/>
           </w:tcPr>
           <w:p>
             <w:r>
@@ -1519,7 +1686,7 @@
         </w:tc>
         <w:tc>
           <w:tcPr>
-            <w:tcW w:type="dxa" w:w="1337"/>
+            <w:tcW w:type="dxa" w:w="1170"/>
           </w:tcPr>
           <w:p>
             <w:r>
@@ -1532,7 +1699,7 @@
         </w:tc>
         <w:tc>
           <w:tcPr>
-            <w:tcW w:type="dxa" w:w="1337"/>
+            <w:tcW w:type="dxa" w:w="1170"/>
           </w:tcPr>
           <w:p>
             <w:r>
@@ -1545,14 +1712,27 @@
         </w:tc>
         <w:tc>
           <w:tcPr>
-            <w:tcW w:type="dxa" w:w="1337"/>
+            <w:tcW w:type="dxa" w:w="1170"/>
           </w:tcPr>
           <w:p>
             <w:r>
               <w:rPr>
                 <w:b w:val="0"/>
               </w:rPr>
-              <w:t>588.6 tokens</w:t>
+              <w:t>588.6</w:t>
+            </w:r>
+          </w:p>
+        </w:tc>
+        <w:tc>
+          <w:tcPr>
+            <w:tcW w:type="dxa" w:w="1170"/>
+          </w:tcPr>
+          <w:p>
+            <w:r>
+              <w:rPr>
+                <w:b w:val="0"/>
+              </w:rPr>
+              <w:t>535.3 [-53.3 tokens]</w:t>
             </w:r>
           </w:p>
         </w:tc>
@@ -1560,7 +1740,7 @@
       <w:tr>
         <w:tc>
           <w:tcPr>
-            <w:tcW w:type="dxa" w:w="1337"/>
+            <w:tcW w:type="dxa" w:w="1170"/>
             <w:shd w:fill="F0F4F8"/>
           </w:tcPr>
           <w:p>
@@ -1574,7 +1754,7 @@
         </w:tc>
         <w:tc>
           <w:tcPr>
-            <w:tcW w:type="dxa" w:w="1337"/>
+            <w:tcW w:type="dxa" w:w="1170"/>
             <w:shd w:fill="F0F4F8"/>
           </w:tcPr>
           <w:p>
@@ -1588,7 +1768,7 @@
         </w:tc>
         <w:tc>
           <w:tcPr>
-            <w:tcW w:type="dxa" w:w="1337"/>
+            <w:tcW w:type="dxa" w:w="1170"/>
             <w:shd w:fill="F0F4F8"/>
           </w:tcPr>
           <w:p>
@@ -1602,7 +1782,7 @@
         </w:tc>
         <w:tc>
           <w:tcPr>
-            <w:tcW w:type="dxa" w:w="1337"/>
+            <w:tcW w:type="dxa" w:w="1170"/>
             <w:shd w:fill="F0F4F8"/>
           </w:tcPr>
           <w:p>
@@ -1616,7 +1796,7 @@
         </w:tc>
         <w:tc>
           <w:tcPr>
-            <w:tcW w:type="dxa" w:w="1337"/>
+            <w:tcW w:type="dxa" w:w="1170"/>
             <w:shd w:fill="F0F4F8"/>
           </w:tcPr>
           <w:p>
@@ -1630,7 +1810,7 @@
         </w:tc>
         <w:tc>
           <w:tcPr>
-            <w:tcW w:type="dxa" w:w="1337"/>
+            <w:tcW w:type="dxa" w:w="1170"/>
             <w:shd w:fill="F0F4F8"/>
           </w:tcPr>
           <w:p>
@@ -1644,7 +1824,7 @@
         </w:tc>
         <w:tc>
           <w:tcPr>
-            <w:tcW w:type="dxa" w:w="1337"/>
+            <w:tcW w:type="dxa" w:w="1170"/>
             <w:shd w:fill="F0F4F8"/>
           </w:tcPr>
           <w:p>
@@ -1652,7 +1832,21 @@
               <w:rPr>
                 <w:b w:val="0"/>
               </w:rPr>
-              <w:t>&lt; 28.0ms (SLA Compliant)</w:t>
+              <w:t>&lt; 28.0ms</w:t>
+            </w:r>
+          </w:p>
+        </w:tc>
+        <w:tc>
+          <w:tcPr>
+            <w:tcW w:type="dxa" w:w="1170"/>
+            <w:shd w:fill="F0F4F8"/>
+          </w:tcPr>
+          <w:p>
+            <w:r>
+              <w:rPr>
+                <w:b w:val="0"/>
+              </w:rPr>
+              <w:t>&lt; 25.0ms (SLA Compliant)</w:t>
             </w:r>
           </w:p>
         </w:tc>
@@ -1660,7 +1854,7 @@
       <w:tr>
         <w:tc>
           <w:tcPr>
-            <w:tcW w:type="dxa" w:w="1337"/>
+            <w:tcW w:type="dxa" w:w="1170"/>
           </w:tcPr>
           <w:p>
             <w:r>
@@ -1673,7 +1867,7 @@
         </w:tc>
         <w:tc>
           <w:tcPr>
-            <w:tcW w:type="dxa" w:w="1337"/>
+            <w:tcW w:type="dxa" w:w="1170"/>
           </w:tcPr>
           <w:p>
             <w:r>
@@ -1686,7 +1880,7 @@
         </w:tc>
         <w:tc>
           <w:tcPr>
-            <w:tcW w:type="dxa" w:w="1337"/>
+            <w:tcW w:type="dxa" w:w="1170"/>
           </w:tcPr>
           <w:p>
             <w:r>
@@ -1699,7 +1893,7 @@
         </w:tc>
         <w:tc>
           <w:tcPr>
-            <w:tcW w:type="dxa" w:w="1337"/>
+            <w:tcW w:type="dxa" w:w="1170"/>
           </w:tcPr>
           <w:p>
             <w:r>
@@ -1712,7 +1906,7 @@
         </w:tc>
         <w:tc>
           <w:tcPr>
-            <w:tcW w:type="dxa" w:w="1337"/>
+            <w:tcW w:type="dxa" w:w="1170"/>
           </w:tcPr>
           <w:p>
             <w:r>
@@ -1725,7 +1919,7 @@
         </w:tc>
         <w:tc>
           <w:tcPr>
-            <w:tcW w:type="dxa" w:w="1337"/>
+            <w:tcW w:type="dxa" w:w="1170"/>
           </w:tcPr>
           <w:p>
             <w:r>
@@ -1738,14 +1932,27 @@
         </w:tc>
         <w:tc>
           <w:tcPr>
-            <w:tcW w:type="dxa" w:w="1337"/>
+            <w:tcW w:type="dxa" w:w="1170"/>
           </w:tcPr>
           <w:p>
             <w:r>
               <w:rPr>
                 <w:b w:val="0"/>
               </w:rPr>
-              <w:t>1,884s (~31.4m) [FAST!]</w:t>
+              <w:t>1,884s (~31.4m)</w:t>
+            </w:r>
+          </w:p>
+        </w:tc>
+        <w:tc>
+          <w:tcPr>
+            <w:tcW w:type="dxa" w:w="1170"/>
+          </w:tcPr>
+          <w:p>
+            <w:r>
+              <w:rPr>
+                <w:b w:val="0"/>
+              </w:rPr>
+              <w:t>2,344s (~39.1m)</w:t>
             </w:r>
           </w:p>
         </w:tc>
@@ -1776,7 +1983,7 @@
         <w:spacing w:after="120"/>
       </w:pPr>
       <w:r>
-        <w:t>Tracking accuracy across standardized difficulty levels illustrates how in-context learning and exact Yale evaluation resolve hard relational challenges:</w:t>
+        <w:t>Tracking accuracy across standardized difficulty levels illustrates how active database probing and column disambiguation elevate reasoning across all tiers:</w:t>
       </w:r>
     </w:p>
     <w:tbl>
@@ -1897,7 +2104,7 @@
                 <w:b/>
                 <w:color w:val="FFFFFF"/>
               </w:rPr>
-              <w:t>Stage 5 (Strict)</w:t>
+              <w:t>Stage 5 (Yale)</w:t>
             </w:r>
           </w:p>
         </w:tc>
@@ -1912,7 +2119,7 @@
                 <w:b/>
                 <w:color w:val="FFFFFF"/>
               </w:rPr>
-              <w:t>Stage 5 (Yale)</w:t>
+              <w:t>Stage 7 (Yale)</w:t>
             </w:r>
           </w:p>
         </w:tc>
@@ -2012,7 +2219,7 @@
               <w:rPr>
                 <w:b w:val="0"/>
               </w:rPr>
-              <w:t>84.72% (388)</w:t>
+              <w:t>88.65% (406)</w:t>
             </w:r>
           </w:p>
         </w:tc>
@@ -2026,7 +2233,7 @@
               <w:rPr>
                 <w:b w:val="0"/>
               </w:rPr>
-              <w:t>88.65% (406)</w:t>
+              <w:t>89.74% (411) [+5]</w:t>
             </w:r>
           </w:p>
         </w:tc>
@@ -2119,7 +2326,7 @@
               <w:rPr>
                 <w:b w:val="0"/>
               </w:rPr>
-              <w:t>77.41% (257)</w:t>
+              <w:t>82.53% (274)</w:t>
             </w:r>
           </w:p>
         </w:tc>
@@ -2132,7 +2339,7 @@
               <w:rPr>
                 <w:b w:val="0"/>
               </w:rPr>
-              <w:t>82.53% (274)</w:t>
+              <w:t>82.83% (275) [+1]</w:t>
             </w:r>
           </w:p>
         </w:tc>
@@ -2232,7 +2439,7 @@
               <w:rPr>
                 <w:b w:val="0"/>
               </w:rPr>
-              <w:t>71.85% (171)</w:t>
+              <w:t>71.01% (169)</w:t>
             </w:r>
           </w:p>
         </w:tc>
@@ -2246,7 +2453,7 @@
               <w:rPr>
                 <w:b w:val="0"/>
               </w:rPr>
-              <w:t>71.01% (169)</w:t>
+              <w:t>73.53% (175) [+6]</w:t>
             </w:r>
           </w:p>
         </w:tc>
@@ -2352,7 +2559,7 @@
               <w:rPr>
                 <w:b w:val="0"/>
               </w:rPr>
-              <w:t>33.33% (2)</w:t>
+              <w:t>50.00% (3) [+1]</w:t>
             </w:r>
           </w:p>
         </w:tc>
@@ -2445,14 +2652,14 @@
         <w:tc>
           <w:tcPr>
             <w:tcW w:type="dxa" w:w="1170"/>
-            <w:shd w:fill="D4EDDA"/>
+            <w:shd w:fill="E2E8F0"/>
           </w:tcPr>
           <w:p>
             <w:r>
               <w:rPr>
                 <w:b/>
               </w:rPr>
-              <w:t>79.11% (818)</w:t>
+              <w:t>82.30% (851)</w:t>
             </w:r>
           </w:p>
         </w:tc>
@@ -2466,7 +2673,7 @@
               <w:rPr>
                 <w:b/>
               </w:rPr>
-              <w:t>82.30% (851)</w:t>
+              <w:t>83.56% (864) [+13]</w:t>
             </w:r>
           </w:p>
         </w:tc>
@@ -2497,13 +2704,13 @@
         <w:t>Beyond benchmark accuracy, Member 1's architecture is tailored specifically for high-throughput enterprise viability on massive schemas such as NemsuERPNew (100+ tables):</w:t>
         <w:br/>
         <w:br/>
-        <w:t>1. Sub-Millisecond Retrieval Overhead: By utilizing an in-memory TF-IDF subword n-gram retriever over 7,000 queries, exemplar selection operates in 2.01 ms per query without remote embedding API calls or external vector databases.</w:t>
+        <w:t>1. Active Probing with Sub-Millisecond Overhead: By performing targeted single-record lookups against text columns, active probing runs in &lt; 0.5ms locally without querying 100 tables naively over the network.</w:t>
         <w:br/>
-        <w:t>2. Strict JWT Multi-Tenant Isolation (Member 3 Alignment): The exemplar index is strictly partitioned by Tenant_ID. A tenant's proprietary query patterns and domain acronyms are isolated from all other tenants.</w:t>
+        <w:t>2. Strict JWT Multi-Tenant Isolation (Member 3 Alignment): In multi-tenant environments, active database probes are strictly parameterized with Tenant_ID isolation predicates, preventing cross-tenant data exposure.</w:t>
         <w:br/>
-        <w:t>3. AST Safety &amp; Controlled Write Protocol (Member 2 Alignment): All generated SQL passes through AST inspection to guarantee read-only guarantees or controlled write protocol enforcement before execution.</w:t>
+        <w:t>3. Non-Executing Compilation Safety: Member 1 strictly avoids executing candidate queries directly, preserving security middleware interception (Member 2) and row-level rewriting (Member 3).</w:t>
         <w:br/>
-        <w:t>4. Downstream Chart Visualization (Member 4 Alignment): Verified relational result sets feed directly into Member 4's automated Vega-Lite charting and predictive analytics pipeline.</w:t>
+        <w:t>4. Downstream Chart Visualization (Member 4 Alignment): Clean, verified relational result sets feed directly into Member 4's automated Vega-Lite charting and predictive analytics pipeline.</w:t>
       </w:r>
     </w:p>
     <w:sectPr>

</xml_diff>

<commit_message>
docs: synchronize Master Research Report and Member 1 Architecture with Stage 8B and 8C ablation results
</commit_message>
<xml_diff>
--- a/Dilina/NL TO SQL prototype/Master_Research_Comparison_Report.docx
+++ b/Dilina/NL TO SQL prototype/Master_Research_Comparison_Report.docx
@@ -2991,6 +2991,9 @@
       </w:r>
     </w:p>
     <w:p>
+      <w:pPr>
+        <w:spacing w:after="160"/>
+      </w:pPr>
       <w:r>
         <w:t>Beyond benchmark accuracy, Member 1's architecture is tailored specifically for high-throughput enterprise viability on massive schemas such as NemsuERPNew (100+ tables):</w:t>
         <w:br/>
@@ -3002,6 +3005,34 @@
         <w:t>3. Non-Executing Compilation Safety: Member 1 strictly avoids executing candidate queries directly, preserving security middleware interception (Member 2) and row-level rewriting (Member 3).</w:t>
         <w:br/>
         <w:t>4. Downstream Chart Visualization (Member 4 Alignment): Clean, verified relational result sets feed directly into Member 4's automated Vega-Lite charting and predictive analytics pipeline.</w:t>
+      </w:r>
+    </w:p>
+    <w:p>
+      <w:pPr>
+        <w:keepNext/>
+        <w:spacing w:before="320" w:after="120"/>
+      </w:pPr>
+      <w:r>
+        <w:rPr>
+          <w:rFonts w:ascii="Calibri" w:hAnsi="Calibri"/>
+          <w:b/>
+          <w:color w:val="1B365D"/>
+          <w:sz w:val="30"/>
+        </w:rPr>
+        <w:t>5. Empirical Ablations &amp; Negative Results (DISTINCT Reforms)</w:t>
+      </w:r>
+    </w:p>
+    <w:p>
+      <w:r>
+        <w:t>Rigorous scientific progress requires thoroughly isolating hypotheses that fail under empirical evaluation:</w:t>
+        <w:br/>
+        <w:br/>
+        <w:t>1. Stage 8B Ablation (Cardinality &amp; DISTINCT Reform): 82.98% Yale EX (858/1,034), net regression of -13 queries. Prompting the model that multi-table joins produce duplicate rows induced pervasive over-deduplication, stripping valid multiset rows and regressing 53 queries.</w:t>
+        <w:br/>
+        <w:t>2. Stage 8C Ablation (Bidirectional Lexical Contract): 81.82% Yale EX (846/1,034), net regression of -25 queries. Constraining DISTINCT strictly to lexical trigger words caused aggregate function stripping (COUNT(DISTINCT) -&gt; SELECT DISTINCT, causing a 140% spike in aggregation errors) and suppressed implicit deduplication for natural phrasing.</w:t>
+        <w:br/>
+        <w:br/>
+        <w:t>Conclusion: Natural language prompt-level micromanagement of DISTINCT is an empirical dead end. Stage 8A (Intent Join Routing, 84.24% Yale EX / 81.24% Strict EX) remains the reigning, uncontested State-of-the-Art baseline.</w:t>
       </w:r>
     </w:p>
     <w:sectPr>

</xml_diff>